<commit_message>
Reconcile MASTER content with integrated TFG
</commit_message>
<xml_diff>
--- a/outputs/documentos_tfg/TFG_ACV_Estiercol_INTEGRAL_PROVISIONAL_M1_M2.docx
+++ b/outputs/documentos_tfg/TFG_ACV_Estiercol_INTEGRAL_PROVISIONAL_M1_M2.docx
@@ -1284,6 +1284,88 @@
           <w:sz w:val="24"/>
         </w:rPr>
         <w:t>El flujo anual común fue 26 278,725181 kg de estiércol fresco/año. En el Escenario A, la fracción sólida ingresó a A1: Precomposteo y continuó hacia A2: Lombricompostaje; el remanente se incorporó a A3: Almacenamiento de aguas verdes y A4: Aplicación de aguas verdes en campos de pastoreo. En el Escenario B, el flujo completo ingresó a B1: Almacenamiento de purines y continuó hacia B2: Aplicación de purines en campo de pastoreo.</w:t>
+      </w:r>
+    </w:p>
+    <w:p>
+      <w:pPr>
+        <w:pStyle w:val="Rótuloacadémico"/>
+        <w:keepNext/>
+      </w:pPr>
+      <w:r>
+        <w:rPr>
+          <w:rFonts w:ascii="Times New Roman" w:hAnsi="Times New Roman"/>
+          <w:b/>
+          <w:color w:val="000000"/>
+        </w:rPr>
+        <w:t>Figura 1</w:t>
+      </w:r>
+    </w:p>
+    <w:p>
+      <w:pPr>
+        <w:pStyle w:val="Descripciónacadémica"/>
+        <w:keepNext/>
+      </w:pPr>
+      <w:r>
+        <w:rPr>
+          <w:rFonts w:ascii="Times New Roman" w:hAnsi="Times New Roman"/>
+          <w:i/>
+          <w:color w:val="000000"/>
+        </w:rPr>
+        <w:t>Fronteras y conexiones físicas de los escenarios evaluados.</w:t>
+      </w:r>
+    </w:p>
+    <w:p>
+      <w:pPr>
+        <w:ind w:left="0" w:firstLine="0"/>
+        <w:jc w:val="center"/>
+      </w:pPr>
+      <w:r>
+        <w:drawing>
+          <wp:inline xmlns:a="http://schemas.openxmlformats.org/drawingml/2006/main" xmlns:pic="http://schemas.openxmlformats.org/drawingml/2006/picture">
+            <wp:extent cx="5486400" cy="5109210"/>
+            <wp:docPr id="1" name="Picture 1"/>
+            <wp:cNvGraphicFramePr>
+              <a:graphicFrameLocks noChangeAspect="1"/>
+            </wp:cNvGraphicFramePr>
+            <a:graphic>
+              <a:graphicData uri="http://schemas.openxmlformats.org/drawingml/2006/picture">
+                <pic:pic>
+                  <pic:nvPicPr>
+                    <pic:cNvPr id="0" name="fronteras_sistema_integral.png"/>
+                    <pic:cNvPicPr/>
+                  </pic:nvPicPr>
+                  <pic:blipFill>
+                    <a:blip r:embed="rId10"/>
+                    <a:stretch>
+                      <a:fillRect/>
+                    </a:stretch>
+                  </pic:blipFill>
+                  <pic:spPr>
+                    <a:xfrm>
+                      <a:off x="0" y="0"/>
+                      <a:ext cx="5486400" cy="5109210"/>
+                    </a:xfrm>
+                    <a:prstGeom prst="rect"/>
+                  </pic:spPr>
+                </pic:pic>
+              </a:graphicData>
+            </a:graphic>
+          </wp:inline>
+        </w:drawing>
+      </w:r>
+    </w:p>
+    <w:p>
+      <w:pPr>
+        <w:spacing w:line="240" w:lineRule="auto" w:before="0" w:after="0"/>
+        <w:ind w:left="100" w:firstLine="719"/>
+        <w:jc w:val="both"/>
+      </w:pPr>
+      <w:r>
+        <w:rPr>
+          <w:rFonts w:ascii="Times New Roman" w:hAnsi="Times New Roman"/>
+          <w:sz w:val="24"/>
+        </w:rPr>
+        <w:t>La Figura 1 reconstruye los diagramas conceptuales de la propuesta con la nomenclatura y las conexiones vigentes. En el Escenario A, la fracción paleada y la fracción remanente siguen rutas físicamente separadas; en el Escenario B, el flujo común completo continúa por almacenamiento y aplicación. Los consumos de electricidad y diésel se asignan a las etapas operativas correspondientes.</w:t>
       </w:r>
     </w:p>
     <w:p>
@@ -3131,7 +3213,19 @@
           <w:rFonts w:ascii="Times New Roman" w:hAnsi="Times New Roman"/>
           <w:sz w:val="24"/>
         </w:rPr>
-        <w:t>A2: Lombricompostaje se representó mediante la categoría IPCC de compostaje en hileras pasivas como aproximación disponible. La fracción de pérdida de N por lixiviación se estableció en cero para las condiciones del sistema estudiado, sin cambiar el factor genérico de la categoría.</w:t>
+        <w:t>A2: Lombricompostaje se representó mediante la categoría IPCC de compostaje en hileras pasivas como aproximación disponible. La fracción de pérdida de N por lixiviación se estableció en cero para las condiciones del sistema estudiado, sin cambiar el factor genérico de la categoría. Las ecuaciones siguientes documentan el núcleo necesario para reproducir la lógica vigente; los factores específicos por etapa se presentan en la tabla metodológica correspondiente.</w:t>
+      </w:r>
+    </w:p>
+    <w:p>
+      <w:pPr>
+        <w:pStyle w:val="Heading3"/>
+      </w:pPr>
+      <w:r>
+        <w:rPr>
+          <w:rFonts w:ascii="Times New Roman" w:hAnsi="Times New Roman"/>
+          <w:color w:val="000000"/>
+        </w:rPr>
+        <w:t>4.4.1 Metano de las etapas de manejo</w:t>
       </w:r>
     </w:p>
     <w:p>
@@ -3143,7 +3237,45 @@
         <w:rPr>
           <w:rFonts w:ascii="Cambria Math" w:hAnsi="Cambria Math"/>
         </w:rPr>
-        <w:t>TAN_fresco = 0,60 × N_total,fresco    (1)</w:t>
+        <w:t>m_CH₄ = m_manejada × VS_húmeda × B₀ × 0,67 × (MCF/100) × AWMS    (1)</w:t>
+      </w:r>
+    </w:p>
+    <w:p>
+      <w:pPr>
+        <w:spacing w:line="240" w:lineRule="auto" w:before="0" w:after="0"/>
+        <w:ind w:left="100" w:firstLine="719"/>
+        <w:jc w:val="both"/>
+      </w:pPr>
+      <w:r>
+        <w:rPr>
+          <w:rFonts w:ascii="Times New Roman" w:hAnsi="Times New Roman"/>
+          <w:sz w:val="24"/>
+        </w:rPr>
+        <w:t>m_CH₄ es la emisión de metano de la etapa; m_manejada es la masa húmeda manejada; VS_húmeda es la fracción de sólidos volátiles en base húmeda; B₀ es la capacidad máxima de producción de metano; MCF es el factor de conversión de metano y AWMS es la fracción manejada por el sistema.</w:t>
+      </w:r>
+    </w:p>
+    <w:p>
+      <w:pPr>
+        <w:pStyle w:val="Heading3"/>
+      </w:pPr>
+      <w:r>
+        <w:rPr>
+          <w:rFonts w:ascii="Times New Roman" w:hAnsi="Times New Roman"/>
+          <w:color w:val="000000"/>
+        </w:rPr>
+        <w:t>4.4.2 Balance secuencial de N total y TAN</w:t>
+      </w:r>
+    </w:p>
+    <w:p>
+      <w:pPr>
+        <w:ind w:left="0" w:firstLine="0"/>
+        <w:jc w:val="center"/>
+      </w:pPr>
+      <w:r>
+        <w:rPr>
+          <w:rFonts w:ascii="Cambria Math" w:hAnsi="Cambria Math"/>
+        </w:rPr>
+        <w:t>TAN_fresco = 0,60 × N_total,fresco    (2)</w:t>
       </w:r>
     </w:p>
     <w:p>
@@ -3169,7 +3301,21 @@
         <w:rPr>
           <w:rFonts w:ascii="Cambria Math" w:hAnsi="Cambria Math"/>
         </w:rPr>
-        <w:t>N_precursor,vol = N_NH₃ + N_NOx    (2)</w:t>
+        <w:t>TAN_disponible = TAN_entrada + N_mineralizado    (3)</w:t>
+      </w:r>
+    </w:p>
+    <w:p>
+      <w:pPr>
+        <w:spacing w:line="240" w:lineRule="auto" w:before="0" w:after="0"/>
+        <w:ind w:left="100" w:firstLine="719"/>
+        <w:jc w:val="both"/>
+      </w:pPr>
+      <w:r>
+        <w:rPr>
+          <w:rFonts w:ascii="Times New Roman" w:hAnsi="Times New Roman"/>
+          <w:sz w:val="24"/>
+        </w:rPr>
+        <w:t>La mineralización se aplica donde corresponde antes de estimar las pérdidas EMEP/EEA sobre el TAN disponible.</w:t>
       </w:r>
     </w:p>
     <w:p>
@@ -3181,7 +3327,21 @@
         <w:rPr>
           <w:rFonts w:ascii="Cambria Math" w:hAnsi="Cambria Math"/>
         </w:rPr>
-        <w:t>N_N₂O,ind,vol = N_precursor,vol × EF₄    (3)</w:t>
+        <w:t>N_j = TAN_disponible × f_j,  j ∈ {NH₃-N, NO-N, N₂-N}    (4)</w:t>
+      </w:r>
+    </w:p>
+    <w:p>
+      <w:pPr>
+        <w:spacing w:line="240" w:lineRule="auto" w:before="0" w:after="0"/>
+        <w:ind w:left="100" w:firstLine="719"/>
+        <w:jc w:val="both"/>
+      </w:pPr>
+      <w:r>
+        <w:rPr>
+          <w:rFonts w:ascii="Times New Roman" w:hAnsi="Times New Roman"/>
+          <w:sz w:val="24"/>
+        </w:rPr>
+        <w:t>La expresión resume las rutas parametrizadas con factores EMEP/EEA. En A2, la masa de NH₃ se estima con el factor específico de Komakech et al. (2016), mientras NO-N y N₂-N conservan provisionalmente los factores sólidos EMEP/EEA.</w:t>
       </w:r>
     </w:p>
     <w:p>
@@ -3193,7 +3353,181 @@
         <w:rPr>
           <w:rFonts w:ascii="Cambria Math" w:hAnsi="Cambria Math"/>
         </w:rPr>
-        <w:t>m_NO₃⁻ = N_lix,esc × 62/14    (4)</w:t>
+        <w:t>N_N₂O–N,directo = N_total,entrada × EF₃    (5)</w:t>
+      </w:r>
+    </w:p>
+    <w:p>
+      <w:pPr>
+        <w:ind w:left="0" w:firstLine="0"/>
+        <w:jc w:val="center"/>
+      </w:pPr>
+      <w:r>
+        <w:rPr>
+          <w:rFonts w:ascii="Cambria Math" w:hAnsi="Cambria Math"/>
+        </w:rPr>
+        <w:t>m_N₂O,directo = N_N₂O–N,directo × 44/28    (6)</w:t>
+      </w:r>
+    </w:p>
+    <w:p>
+      <w:pPr>
+        <w:ind w:left="0" w:firstLine="0"/>
+        <w:jc w:val="center"/>
+      </w:pPr>
+      <w:r>
+        <w:rPr>
+          <w:rFonts w:ascii="Cambria Math" w:hAnsi="Cambria Math"/>
+        </w:rPr>
+        <w:t>N_total,salida = N_total,entrada − N_NH₃ − N_NOx − N_N₂ − N_N₂O–N,directo − N_pérdida,hídrica    (7)</w:t>
+      </w:r>
+    </w:p>
+    <w:p>
+      <w:pPr>
+        <w:spacing w:line="240" w:lineRule="auto" w:before="0" w:after="0"/>
+        <w:ind w:left="100" w:firstLine="719"/>
+        <w:jc w:val="both"/>
+      </w:pPr>
+      <w:r>
+        <w:rPr>
+          <w:rFonts w:ascii="Times New Roman" w:hAnsi="Times New Roman"/>
+          <w:sz w:val="24"/>
+        </w:rPr>
+        <w:t>Esta identidad expresa el cierre secuencial de N total en las etapas de manejo; cada pérdida física se descuenta una sola vez.</w:t>
+      </w:r>
+    </w:p>
+    <w:p>
+      <w:pPr>
+        <w:ind w:left="0" w:firstLine="0"/>
+        <w:jc w:val="center"/>
+      </w:pPr>
+      <w:r>
+        <w:rPr>
+          <w:rFonts w:ascii="Cambria Math" w:hAnsi="Cambria Math"/>
+        </w:rPr>
+        <w:t>N_precursor,vol = N_NH₃ + N_NOx    (8)</w:t>
+      </w:r>
+    </w:p>
+    <w:p>
+      <w:pPr>
+        <w:ind w:left="0" w:firstLine="0"/>
+        <w:jc w:val="center"/>
+      </w:pPr>
+      <w:r>
+        <w:rPr>
+          <w:rFonts w:ascii="Cambria Math" w:hAnsi="Cambria Math"/>
+        </w:rPr>
+        <w:t>m_N₂O,ind,vol = N_precursor,vol × EF₄ × 44/28    (9)</w:t>
+      </w:r>
+    </w:p>
+    <w:p>
+      <w:pPr>
+        <w:pStyle w:val="Heading3"/>
+      </w:pPr>
+      <w:r>
+        <w:rPr>
+          <w:rFonts w:ascii="Times New Roman" w:hAnsi="Times New Roman"/>
+          <w:color w:val="000000"/>
+        </w:rPr>
+        <w:t>4.4.3 Rutas de N hacia el suelo y aplicación</w:t>
+      </w:r>
+    </w:p>
+    <w:p>
+      <w:pPr>
+        <w:spacing w:line="240" w:lineRule="auto" w:before="0" w:after="0"/>
+        <w:ind w:left="100" w:firstLine="719"/>
+        <w:jc w:val="both"/>
+      </w:pPr>
+      <w:r>
+        <w:rPr>
+          <w:rFonts w:ascii="Times New Roman" w:hAnsi="Times New Roman"/>
+          <w:sz w:val="24"/>
+        </w:rPr>
+        <w:t>A4 y B2 recibieron el N total y el TAN propagados desde sus etapas de almacenamiento. La volatilización de NH₃ se estimó sobre el TAN aplicado; el NOx, expresado como NO₂, se estimó sobre el N aplicado y se convirtió a masa de N. El N₂O directo y la lixiviación o escorrentía conservaron como base el N de estiércol aplicado.</w:t>
+      </w:r>
+    </w:p>
+    <w:p>
+      <w:pPr>
+        <w:ind w:left="0" w:firstLine="0"/>
+        <w:jc w:val="center"/>
+      </w:pPr>
+      <w:r>
+        <w:rPr>
+          <w:rFonts w:ascii="Cambria Math" w:hAnsi="Cambria Math"/>
+        </w:rPr>
+        <w:t>N_drenaje,A1 = N_total,A1 × FracLeachMS_A1    (10)</w:t>
+      </w:r>
+    </w:p>
+    <w:p>
+      <w:pPr>
+        <w:spacing w:line="240" w:lineRule="auto" w:before="0" w:after="0"/>
+        <w:ind w:left="100" w:firstLine="719"/>
+        <w:jc w:val="both"/>
+      </w:pPr>
+      <w:r>
+        <w:rPr>
+          <w:rFonts w:ascii="Times New Roman" w:hAnsi="Times New Roman"/>
+          <w:sz w:val="24"/>
+        </w:rPr>
+        <w:t>El drenaje de A1 se trata como entrada de N al suelo y no como una masa de NO₃⁻ directa.</w:t>
+      </w:r>
+    </w:p>
+    <w:p>
+      <w:pPr>
+        <w:ind w:left="0" w:firstLine="0"/>
+        <w:jc w:val="center"/>
+      </w:pPr>
+      <w:r>
+        <w:rPr>
+          <w:rFonts w:ascii="Cambria Math" w:hAnsi="Cambria Math"/>
+        </w:rPr>
+        <w:t>N_NH₃,aplic = TAN_aplicado × f_NH₃;  N_NOx,aplic = (N_aplicado × f_NO₂) × 14/46    (11)</w:t>
+      </w:r>
+    </w:p>
+    <w:p>
+      <w:pPr>
+        <w:ind w:left="0" w:firstLine="0"/>
+        <w:jc w:val="center"/>
+      </w:pPr>
+      <w:r>
+        <w:rPr>
+          <w:rFonts w:ascii="Cambria Math" w:hAnsi="Cambria Math"/>
+        </w:rPr>
+        <w:t>m_N₂O,directo,suelo = N_aplicado × EF₁ × 44/28    (12)</w:t>
+      </w:r>
+    </w:p>
+    <w:p>
+      <w:pPr>
+        <w:ind w:left="0" w:firstLine="0"/>
+        <w:jc w:val="center"/>
+      </w:pPr>
+      <w:r>
+        <w:rPr>
+          <w:rFonts w:ascii="Cambria Math" w:hAnsi="Cambria Math"/>
+        </w:rPr>
+        <w:t>N_lix,esc = N_entrada,suelo × FracLEACH_suelo    (13)</w:t>
+      </w:r>
+    </w:p>
+    <w:p>
+      <w:pPr>
+        <w:ind w:left="0" w:firstLine="0"/>
+        <w:jc w:val="center"/>
+      </w:pPr>
+      <w:r>
+        <w:rPr>
+          <w:rFonts w:ascii="Cambria Math" w:hAnsi="Cambria Math"/>
+        </w:rPr>
+        <w:t>m_NO₃⁻ = N_lix,esc × 62/14    (14)</w:t>
+      </w:r>
+    </w:p>
+    <w:p>
+      <w:pPr>
+        <w:ind w:left="0" w:firstLine="0"/>
+        <w:jc w:val="center"/>
+      </w:pPr>
+      <w:r>
+        <w:rPr>
+          <w:rFonts w:ascii="Cambria Math" w:hAnsi="Cambria Math"/>
+        </w:rPr>
+        <w:t>m_N₂O,ind,lix = N_lix,esc × EF₅ × 44/28    (15)</w:t>
       </w:r>
     </w:p>
     <w:p>
@@ -3248,6 +3582,44 @@
           <w:sz w:val="24"/>
         </w:rPr>
         <w:t>Los factores, la asignación de sistemas y los consumos operativos corresponden a las decisiones metodológicas vigentes. Esta integración documental no recalculó ni modificó el ACV.</w:t>
+      </w:r>
+    </w:p>
+    <w:p>
+      <w:pPr>
+        <w:ind w:left="0" w:firstLine="0"/>
+        <w:jc w:val="center"/>
+      </w:pPr>
+      <w:r>
+        <w:rPr>
+          <w:rFonts w:ascii="Cambria Math" w:hAnsi="Cambria Math"/>
+        </w:rPr>
+        <w:t>I_c = Σᵢ (m_i × CF_i,c)    (16)</w:t>
+      </w:r>
+    </w:p>
+    <w:p>
+      <w:pPr>
+        <w:spacing w:line="240" w:lineRule="auto" w:before="0" w:after="0"/>
+        <w:ind w:left="100" w:firstLine="719"/>
+        <w:jc w:val="both"/>
+      </w:pPr>
+      <w:r>
+        <w:rPr>
+          <w:rFonts w:ascii="Times New Roman" w:hAnsi="Times New Roman"/>
+          <w:sz w:val="24"/>
+        </w:rPr>
+        <w:t>I_c es el indicador de la categoría c, m_i es la masa del flujo elemental i y CF_i,c es su factor de caracterización en esa categoría.</w:t>
+      </w:r>
+    </w:p>
+    <w:p>
+      <w:pPr>
+        <w:ind w:left="0" w:firstLine="0"/>
+        <w:jc w:val="center"/>
+      </w:pPr>
+      <w:r>
+        <w:rPr>
+          <w:rFonts w:ascii="Cambria Math" w:hAnsi="Cambria Math"/>
+        </w:rPr>
+        <w:t>CC_total = CC_manejo + CC_electricidad + CC_diésel    (17)</w:t>
       </w:r>
     </w:p>
     <w:p>
@@ -5264,7 +5636,7 @@
           <w:b/>
           <w:color w:val="000000"/>
         </w:rPr>
-        <w:t>Figura 1</w:t>
+        <w:t>Figura 2</w:t>
       </w:r>
     </w:p>
     <w:p>
@@ -5290,7 +5662,7 @@
         <w:drawing>
           <wp:inline xmlns:a="http://schemas.openxmlformats.org/drawingml/2006/main" xmlns:pic="http://schemas.openxmlformats.org/drawingml/2006/picture">
             <wp:extent cx="5486400" cy="2718151"/>
-            <wp:docPr id="1" name="Picture 1"/>
+            <wp:docPr id="2" name="Picture 2"/>
             <wp:cNvGraphicFramePr>
               <a:graphicFrameLocks noChangeAspect="1"/>
             </wp:cNvGraphicFramePr>
@@ -5302,7 +5674,7 @@
                     <pic:cNvPicPr/>
                   </pic:nvPicPr>
                   <pic:blipFill>
-                    <a:blip r:embed="rId10"/>
+                    <a:blip r:embed="rId11"/>
                     <a:stretch>
                       <a:fillRect/>
                     </a:stretch>
@@ -5332,7 +5704,7 @@
           <w:rFonts w:ascii="Times New Roman" w:hAnsi="Times New Roman"/>
           <w:sz w:val="24"/>
         </w:rPr>
-        <w:t>La Tabla 3 documenta los factores visibles principales y la Figura 1 muestra la escala operacional de los flujos.</w:t>
+        <w:t>La Tabla 3 documenta los factores visibles principales y la Figura 2 muestra la escala operacional de los flujos.</w:t>
       </w:r>
     </w:p>
     <w:p>
@@ -5480,7 +5852,7 @@
           <w:b/>
           <w:color w:val="000000"/>
         </w:rPr>
-        <w:t>Figura 2</w:t>
+        <w:t>Figura 3</w:t>
       </w:r>
     </w:p>
     <w:p>
@@ -5506,7 +5878,7 @@
         <w:drawing>
           <wp:inline xmlns:a="http://schemas.openxmlformats.org/drawingml/2006/main" xmlns:pic="http://schemas.openxmlformats.org/drawingml/2006/picture">
             <wp:extent cx="5486400" cy="3834381"/>
-            <wp:docPr id="2" name="Picture 2"/>
+            <wp:docPr id="3" name="Picture 3"/>
             <wp:cNvGraphicFramePr>
               <a:graphicFrameLocks noChangeAspect="1"/>
             </wp:cNvGraphicFramePr>
@@ -5518,7 +5890,7 @@
                     <pic:cNvPicPr/>
                   </pic:nvPicPr>
                   <pic:blipFill>
-                    <a:blip r:embed="rId11"/>
+                    <a:blip r:embed="rId12"/>
                     <a:stretch>
                       <a:fillRect/>
                     </a:stretch>
@@ -5548,7 +5920,7 @@
           <w:rFonts w:ascii="Times New Roman" w:hAnsi="Times New Roman"/>
           <w:sz w:val="24"/>
         </w:rPr>
-        <w:t>La Figura 2 presenta la caracterización gravimétrica provisional.</w:t>
+        <w:t>La Figura 3 presenta la caracterización gravimétrica provisional.</w:t>
       </w:r>
     </w:p>
     <w:p>
@@ -6119,7 +6491,7 @@
           <w:b/>
           <w:color w:val="000000"/>
         </w:rPr>
-        <w:t>Figura 3</w:t>
+        <w:t>Figura 4</w:t>
       </w:r>
     </w:p>
     <w:p>
@@ -6145,7 +6517,7 @@
         <w:drawing>
           <wp:inline xmlns:a="http://schemas.openxmlformats.org/drawingml/2006/main" xmlns:pic="http://schemas.openxmlformats.org/drawingml/2006/picture">
             <wp:extent cx="5486400" cy="3763926"/>
-            <wp:docPr id="3" name="Picture 3"/>
+            <wp:docPr id="4" name="Picture 4"/>
             <wp:cNvGraphicFramePr>
               <a:graphicFrameLocks noChangeAspect="1"/>
             </wp:cNvGraphicFramePr>
@@ -6157,7 +6529,7 @@
                     <pic:cNvPicPr/>
                   </pic:nvPicPr>
                   <pic:blipFill>
-                    <a:blip r:embed="rId12"/>
+                    <a:blip r:embed="rId13"/>
                     <a:stretch>
                       <a:fillRect/>
                     </a:stretch>
@@ -6187,7 +6559,7 @@
           <w:rFonts w:ascii="Times New Roman" w:hAnsi="Times New Roman"/>
           <w:sz w:val="24"/>
         </w:rPr>
-        <w:t>La Tabla 4 resume las emisiones del manejo y la Figura 3 muestra la distribución de CH₄. Las contribuciones operativas de electricidad y diésel se incorporaron en el indicador de cambio climático, manteniendo separada su trazabilidad.</w:t>
+        <w:t>La Tabla 4 resume las emisiones del manejo y la Figura 4 muestra la distribución de CH₄. Las contribuciones operativas de electricidad y diésel se incorporaron en el indicador de cambio climático, manteniendo separada su trazabilidad.</w:t>
       </w:r>
     </w:p>
     <w:p>
@@ -6237,12 +6609,11 @@
         <w:tblLook w:firstColumn="1" w:firstRow="1" w:lastColumn="0" w:lastRow="0" w:noHBand="0" w:noVBand="1" w:val="04A0"/>
       </w:tblPr>
       <w:tblGrid>
-        <w:gridCol w:w="1597"/>
-        <w:gridCol w:w="1597"/>
-        <w:gridCol w:w="1597"/>
-        <w:gridCol w:w="1597"/>
-        <w:gridCol w:w="1597"/>
-        <w:gridCol w:w="1597"/>
+        <w:gridCol w:w="1916"/>
+        <w:gridCol w:w="1916"/>
+        <w:gridCol w:w="1916"/>
+        <w:gridCol w:w="1916"/>
+        <w:gridCol w:w="1916"/>
       </w:tblGrid>
       <w:tr>
         <w:trPr>
@@ -6251,7 +6622,7 @@
         </w:trPr>
         <w:tc>
           <w:tcPr>
-            <w:tcW w:type="dxa" w:w="1597"/>
+            <w:tcW w:type="dxa" w:w="1916"/>
             <w:vAlign w:val="center"/>
             <w:tcMar>
               <w:top w:w="72" w:type="dxa"/>
@@ -6278,7 +6649,7 @@
         </w:tc>
         <w:tc>
           <w:tcPr>
-            <w:tcW w:type="dxa" w:w="1597"/>
+            <w:tcW w:type="dxa" w:w="1916"/>
             <w:vAlign w:val="center"/>
             <w:tcMar>
               <w:top w:w="72" w:type="dxa"/>
@@ -6299,40 +6670,13 @@
                 <w:b/>
                 <w:sz w:val="24"/>
               </w:rPr>
-              <w:t>Etapa</w:t>
+              <w:t>Etapa del sistema</w:t>
             </w:r>
           </w:p>
         </w:tc>
         <w:tc>
           <w:tcPr>
-            <w:tcW w:type="dxa" w:w="1597"/>
-            <w:vAlign w:val="center"/>
-            <w:tcMar>
-              <w:top w:w="72" w:type="dxa"/>
-              <w:left w:w="72" w:type="dxa"/>
-              <w:bottom w:w="72" w:type="dxa"/>
-              <w:right w:w="72" w:type="dxa"/>
-            </w:tcMar>
-          </w:tcPr>
-          <w:p>
-            <w:pPr>
-              <w:spacing w:line="240" w:lineRule="auto" w:before="0" w:after="0"/>
-              <w:ind w:left="0" w:firstLine="0"/>
-              <w:jc w:val="center"/>
-            </w:pPr>
-            <w:r>
-              <w:rPr>
-                <w:rFonts w:ascii="Times New Roman" w:hAnsi="Times New Roman"/>
-                <w:b/>
-                <w:sz w:val="24"/>
-              </w:rPr>
-              <w:t>Nombre de etapa</w:t>
-            </w:r>
-          </w:p>
-        </w:tc>
-        <w:tc>
-          <w:tcPr>
-            <w:tcW w:type="dxa" w:w="1597"/>
+            <w:tcW w:type="dxa" w:w="1916"/>
             <w:vAlign w:val="center"/>
             <w:tcMar>
               <w:top w:w="72" w:type="dxa"/>
@@ -6359,7 +6703,7 @@
         </w:tc>
         <w:tc>
           <w:tcPr>
-            <w:tcW w:type="dxa" w:w="1597"/>
+            <w:tcW w:type="dxa" w:w="1916"/>
             <w:vAlign w:val="center"/>
             <w:tcMar>
               <w:top w:w="72" w:type="dxa"/>
@@ -6386,7 +6730,7 @@
         </w:tc>
         <w:tc>
           <w:tcPr>
-            <w:tcW w:type="dxa" w:w="1597"/>
+            <w:tcW w:type="dxa" w:w="1916"/>
             <w:vAlign w:val="center"/>
             <w:tcMar>
               <w:top w:w="72" w:type="dxa"/>
@@ -6418,7 +6762,7 @@
         </w:trPr>
         <w:tc>
           <w:tcPr>
-            <w:tcW w:type="dxa" w:w="1597"/>
+            <w:tcW w:type="dxa" w:w="1916"/>
             <w:vAlign w:val="center"/>
             <w:tcMar>
               <w:top w:w="72" w:type="dxa"/>
@@ -6445,7 +6789,7 @@
         </w:tc>
         <w:tc>
           <w:tcPr>
-            <w:tcW w:type="dxa" w:w="1597"/>
+            <w:tcW w:type="dxa" w:w="1916"/>
             <w:vAlign w:val="center"/>
             <w:tcMar>
               <w:top w:w="72" w:type="dxa"/>
@@ -6466,40 +6810,13 @@
                 <w:b w:val="0"/>
                 <w:sz w:val="24"/>
               </w:rPr>
-              <w:t>1</w:t>
+              <w:t>A1: Precomposteo</w:t>
             </w:r>
           </w:p>
         </w:tc>
         <w:tc>
           <w:tcPr>
-            <w:tcW w:type="dxa" w:w="1597"/>
-            <w:vAlign w:val="center"/>
-            <w:tcMar>
-              <w:top w:w="72" w:type="dxa"/>
-              <w:left w:w="72" w:type="dxa"/>
-              <w:bottom w:w="72" w:type="dxa"/>
-              <w:right w:w="72" w:type="dxa"/>
-            </w:tcMar>
-          </w:tcPr>
-          <w:p>
-            <w:pPr>
-              <w:spacing w:line="240" w:lineRule="auto" w:before="0" w:after="0"/>
-              <w:ind w:left="0" w:firstLine="0"/>
-              <w:jc w:val="center"/>
-            </w:pPr>
-            <w:r>
-              <w:rPr>
-                <w:rFonts w:ascii="Times New Roman" w:hAnsi="Times New Roman"/>
-                <w:b w:val="0"/>
-                <w:sz w:val="24"/>
-              </w:rPr>
-              <w:t>Etapa 1: Precomposteo</w:t>
-            </w:r>
-          </w:p>
-        </w:tc>
-        <w:tc>
-          <w:tcPr>
-            <w:tcW w:type="dxa" w:w="1597"/>
+            <w:tcW w:type="dxa" w:w="1916"/>
             <w:vAlign w:val="center"/>
             <w:tcMar>
               <w:top w:w="72" w:type="dxa"/>
@@ -6526,7 +6843,7 @@
         </w:tc>
         <w:tc>
           <w:tcPr>
-            <w:tcW w:type="dxa" w:w="1597"/>
+            <w:tcW w:type="dxa" w:w="1916"/>
             <w:vAlign w:val="center"/>
             <w:tcMar>
               <w:top w:w="72" w:type="dxa"/>
@@ -6553,7 +6870,7 @@
         </w:tc>
         <w:tc>
           <w:tcPr>
-            <w:tcW w:type="dxa" w:w="1597"/>
+            <w:tcW w:type="dxa" w:w="1916"/>
             <w:vAlign w:val="center"/>
             <w:tcMar>
               <w:top w:w="72" w:type="dxa"/>
@@ -6585,7 +6902,7 @@
         </w:trPr>
         <w:tc>
           <w:tcPr>
-            <w:tcW w:type="dxa" w:w="1597"/>
+            <w:tcW w:type="dxa" w:w="1916"/>
             <w:vAlign w:val="center"/>
             <w:tcMar>
               <w:top w:w="72" w:type="dxa"/>
@@ -6612,7 +6929,7 @@
         </w:tc>
         <w:tc>
           <w:tcPr>
-            <w:tcW w:type="dxa" w:w="1597"/>
+            <w:tcW w:type="dxa" w:w="1916"/>
             <w:vAlign w:val="center"/>
             <w:tcMar>
               <w:top w:w="72" w:type="dxa"/>
@@ -6633,40 +6950,13 @@
                 <w:b w:val="0"/>
                 <w:sz w:val="24"/>
               </w:rPr>
-              <w:t>2</w:t>
+              <w:t>A2: Lombricompostaje</w:t>
             </w:r>
           </w:p>
         </w:tc>
         <w:tc>
           <w:tcPr>
-            <w:tcW w:type="dxa" w:w="1597"/>
-            <w:vAlign w:val="center"/>
-            <w:tcMar>
-              <w:top w:w="72" w:type="dxa"/>
-              <w:left w:w="72" w:type="dxa"/>
-              <w:bottom w:w="72" w:type="dxa"/>
-              <w:right w:w="72" w:type="dxa"/>
-            </w:tcMar>
-          </w:tcPr>
-          <w:p>
-            <w:pPr>
-              <w:spacing w:line="240" w:lineRule="auto" w:before="0" w:after="0"/>
-              <w:ind w:left="0" w:firstLine="0"/>
-              <w:jc w:val="center"/>
-            </w:pPr>
-            <w:r>
-              <w:rPr>
-                <w:rFonts w:ascii="Times New Roman" w:hAnsi="Times New Roman"/>
-                <w:b w:val="0"/>
-                <w:sz w:val="24"/>
-              </w:rPr>
-              <w:t>Etapa 2: Lombricompostaje</w:t>
-            </w:r>
-          </w:p>
-        </w:tc>
-        <w:tc>
-          <w:tcPr>
-            <w:tcW w:type="dxa" w:w="1597"/>
+            <w:tcW w:type="dxa" w:w="1916"/>
             <w:vAlign w:val="center"/>
             <w:tcMar>
               <w:top w:w="72" w:type="dxa"/>
@@ -6693,7 +6983,7 @@
         </w:tc>
         <w:tc>
           <w:tcPr>
-            <w:tcW w:type="dxa" w:w="1597"/>
+            <w:tcW w:type="dxa" w:w="1916"/>
             <w:vAlign w:val="center"/>
             <w:tcMar>
               <w:top w:w="72" w:type="dxa"/>
@@ -6720,7 +7010,7 @@
         </w:tc>
         <w:tc>
           <w:tcPr>
-            <w:tcW w:type="dxa" w:w="1597"/>
+            <w:tcW w:type="dxa" w:w="1916"/>
             <w:vAlign w:val="center"/>
             <w:tcMar>
               <w:top w:w="72" w:type="dxa"/>
@@ -6752,7 +7042,7 @@
         </w:trPr>
         <w:tc>
           <w:tcPr>
-            <w:tcW w:type="dxa" w:w="1597"/>
+            <w:tcW w:type="dxa" w:w="1916"/>
             <w:vAlign w:val="center"/>
             <w:tcMar>
               <w:top w:w="72" w:type="dxa"/>
@@ -6779,7 +7069,7 @@
         </w:tc>
         <w:tc>
           <w:tcPr>
-            <w:tcW w:type="dxa" w:w="1597"/>
+            <w:tcW w:type="dxa" w:w="1916"/>
             <w:vAlign w:val="center"/>
             <w:tcMar>
               <w:top w:w="72" w:type="dxa"/>
@@ -6800,40 +7090,13 @@
                 <w:b w:val="0"/>
                 <w:sz w:val="24"/>
               </w:rPr>
-              <w:t>3</w:t>
+              <w:t>A3: Almacenamiento de aguas verdes</w:t>
             </w:r>
           </w:p>
         </w:tc>
         <w:tc>
           <w:tcPr>
-            <w:tcW w:type="dxa" w:w="1597"/>
-            <w:vAlign w:val="center"/>
-            <w:tcMar>
-              <w:top w:w="72" w:type="dxa"/>
-              <w:left w:w="72" w:type="dxa"/>
-              <w:bottom w:w="72" w:type="dxa"/>
-              <w:right w:w="72" w:type="dxa"/>
-            </w:tcMar>
-          </w:tcPr>
-          <w:p>
-            <w:pPr>
-              <w:spacing w:line="240" w:lineRule="auto" w:before="0" w:after="0"/>
-              <w:ind w:left="0" w:firstLine="0"/>
-              <w:jc w:val="center"/>
-            </w:pPr>
-            <w:r>
-              <w:rPr>
-                <w:rFonts w:ascii="Times New Roman" w:hAnsi="Times New Roman"/>
-                <w:b w:val="0"/>
-                <w:sz w:val="24"/>
-              </w:rPr>
-              <w:t>Etapa 3: Almacenamiento de aguas verdes</w:t>
-            </w:r>
-          </w:p>
-        </w:tc>
-        <w:tc>
-          <w:tcPr>
-            <w:tcW w:type="dxa" w:w="1597"/>
+            <w:tcW w:type="dxa" w:w="1916"/>
             <w:vAlign w:val="center"/>
             <w:tcMar>
               <w:top w:w="72" w:type="dxa"/>
@@ -6860,7 +7123,7 @@
         </w:tc>
         <w:tc>
           <w:tcPr>
-            <w:tcW w:type="dxa" w:w="1597"/>
+            <w:tcW w:type="dxa" w:w="1916"/>
             <w:vAlign w:val="center"/>
             <w:tcMar>
               <w:top w:w="72" w:type="dxa"/>
@@ -6887,7 +7150,7 @@
         </w:tc>
         <w:tc>
           <w:tcPr>
-            <w:tcW w:type="dxa" w:w="1597"/>
+            <w:tcW w:type="dxa" w:w="1916"/>
             <w:vAlign w:val="center"/>
             <w:tcMar>
               <w:top w:w="72" w:type="dxa"/>
@@ -6919,7 +7182,7 @@
         </w:trPr>
         <w:tc>
           <w:tcPr>
-            <w:tcW w:type="dxa" w:w="1597"/>
+            <w:tcW w:type="dxa" w:w="1916"/>
             <w:vAlign w:val="center"/>
             <w:tcMar>
               <w:top w:w="72" w:type="dxa"/>
@@ -6946,7 +7209,7 @@
         </w:tc>
         <w:tc>
           <w:tcPr>
-            <w:tcW w:type="dxa" w:w="1597"/>
+            <w:tcW w:type="dxa" w:w="1916"/>
             <w:vAlign w:val="center"/>
             <w:tcMar>
               <w:top w:w="72" w:type="dxa"/>
@@ -6967,40 +7230,13 @@
                 <w:b w:val="0"/>
                 <w:sz w:val="24"/>
               </w:rPr>
-              <w:t>4</w:t>
+              <w:t>A4: Aplicación de aguas verdes en campos de pastoreo</w:t>
             </w:r>
           </w:p>
         </w:tc>
         <w:tc>
           <w:tcPr>
-            <w:tcW w:type="dxa" w:w="1597"/>
-            <w:vAlign w:val="center"/>
-            <w:tcMar>
-              <w:top w:w="72" w:type="dxa"/>
-              <w:left w:w="72" w:type="dxa"/>
-              <w:bottom w:w="72" w:type="dxa"/>
-              <w:right w:w="72" w:type="dxa"/>
-            </w:tcMar>
-          </w:tcPr>
-          <w:p>
-            <w:pPr>
-              <w:spacing w:line="240" w:lineRule="auto" w:before="0" w:after="0"/>
-              <w:ind w:left="0" w:firstLine="0"/>
-              <w:jc w:val="center"/>
-            </w:pPr>
-            <w:r>
-              <w:rPr>
-                <w:rFonts w:ascii="Times New Roman" w:hAnsi="Times New Roman"/>
-                <w:b w:val="0"/>
-                <w:sz w:val="24"/>
-              </w:rPr>
-              <w:t>Etapa 4: Aplicación de aguas verdes en campos de pastoreo</w:t>
-            </w:r>
-          </w:p>
-        </w:tc>
-        <w:tc>
-          <w:tcPr>
-            <w:tcW w:type="dxa" w:w="1597"/>
+            <w:tcW w:type="dxa" w:w="1916"/>
             <w:vAlign w:val="center"/>
             <w:tcMar>
               <w:top w:w="72" w:type="dxa"/>
@@ -7027,7 +7263,7 @@
         </w:tc>
         <w:tc>
           <w:tcPr>
-            <w:tcW w:type="dxa" w:w="1597"/>
+            <w:tcW w:type="dxa" w:w="1916"/>
             <w:vAlign w:val="center"/>
             <w:tcMar>
               <w:top w:w="72" w:type="dxa"/>
@@ -7054,7 +7290,7 @@
         </w:tc>
         <w:tc>
           <w:tcPr>
-            <w:tcW w:type="dxa" w:w="1597"/>
+            <w:tcW w:type="dxa" w:w="1916"/>
             <w:vAlign w:val="center"/>
             <w:tcMar>
               <w:top w:w="72" w:type="dxa"/>
@@ -7086,7 +7322,7 @@
         </w:trPr>
         <w:tc>
           <w:tcPr>
-            <w:tcW w:type="dxa" w:w="1597"/>
+            <w:tcW w:type="dxa" w:w="1916"/>
             <w:vAlign w:val="center"/>
             <w:tcMar>
               <w:top w:w="72" w:type="dxa"/>
@@ -7113,7 +7349,7 @@
         </w:tc>
         <w:tc>
           <w:tcPr>
-            <w:tcW w:type="dxa" w:w="1597"/>
+            <w:tcW w:type="dxa" w:w="1916"/>
             <w:vAlign w:val="center"/>
             <w:tcMar>
               <w:top w:w="72" w:type="dxa"/>
@@ -7134,40 +7370,13 @@
                 <w:b w:val="0"/>
                 <w:sz w:val="24"/>
               </w:rPr>
-              <w:t>1</w:t>
+              <w:t>B1: Almacenamiento de purines</w:t>
             </w:r>
           </w:p>
         </w:tc>
         <w:tc>
           <w:tcPr>
-            <w:tcW w:type="dxa" w:w="1597"/>
-            <w:vAlign w:val="center"/>
-            <w:tcMar>
-              <w:top w:w="72" w:type="dxa"/>
-              <w:left w:w="72" w:type="dxa"/>
-              <w:bottom w:w="72" w:type="dxa"/>
-              <w:right w:w="72" w:type="dxa"/>
-            </w:tcMar>
-          </w:tcPr>
-          <w:p>
-            <w:pPr>
-              <w:spacing w:line="240" w:lineRule="auto" w:before="0" w:after="0"/>
-              <w:ind w:left="0" w:firstLine="0"/>
-              <w:jc w:val="center"/>
-            </w:pPr>
-            <w:r>
-              <w:rPr>
-                <w:rFonts w:ascii="Times New Roman" w:hAnsi="Times New Roman"/>
-                <w:b w:val="0"/>
-                <w:sz w:val="24"/>
-              </w:rPr>
-              <w:t>Etapa 1: Almacenamiento de purines</w:t>
-            </w:r>
-          </w:p>
-        </w:tc>
-        <w:tc>
-          <w:tcPr>
-            <w:tcW w:type="dxa" w:w="1597"/>
+            <w:tcW w:type="dxa" w:w="1916"/>
             <w:vAlign w:val="center"/>
             <w:tcMar>
               <w:top w:w="72" w:type="dxa"/>
@@ -7194,7 +7403,7 @@
         </w:tc>
         <w:tc>
           <w:tcPr>
-            <w:tcW w:type="dxa" w:w="1597"/>
+            <w:tcW w:type="dxa" w:w="1916"/>
             <w:vAlign w:val="center"/>
             <w:tcMar>
               <w:top w:w="72" w:type="dxa"/>
@@ -7221,7 +7430,7 @@
         </w:tc>
         <w:tc>
           <w:tcPr>
-            <w:tcW w:type="dxa" w:w="1597"/>
+            <w:tcW w:type="dxa" w:w="1916"/>
             <w:vAlign w:val="center"/>
             <w:tcMar>
               <w:top w:w="72" w:type="dxa"/>
@@ -7253,7 +7462,7 @@
         </w:trPr>
         <w:tc>
           <w:tcPr>
-            <w:tcW w:type="dxa" w:w="1597"/>
+            <w:tcW w:type="dxa" w:w="1916"/>
             <w:vAlign w:val="center"/>
             <w:tcMar>
               <w:top w:w="72" w:type="dxa"/>
@@ -7280,7 +7489,7 @@
         </w:tc>
         <w:tc>
           <w:tcPr>
-            <w:tcW w:type="dxa" w:w="1597"/>
+            <w:tcW w:type="dxa" w:w="1916"/>
             <w:vAlign w:val="center"/>
             <w:tcMar>
               <w:top w:w="72" w:type="dxa"/>
@@ -7301,40 +7510,13 @@
                 <w:b w:val="0"/>
                 <w:sz w:val="24"/>
               </w:rPr>
-              <w:t>2</w:t>
+              <w:t>B2: Aplicación de purines en campo de pastoreo</w:t>
             </w:r>
           </w:p>
         </w:tc>
         <w:tc>
           <w:tcPr>
-            <w:tcW w:type="dxa" w:w="1597"/>
-            <w:vAlign w:val="center"/>
-            <w:tcMar>
-              <w:top w:w="72" w:type="dxa"/>
-              <w:left w:w="72" w:type="dxa"/>
-              <w:bottom w:w="72" w:type="dxa"/>
-              <w:right w:w="72" w:type="dxa"/>
-            </w:tcMar>
-          </w:tcPr>
-          <w:p>
-            <w:pPr>
-              <w:spacing w:line="240" w:lineRule="auto" w:before="0" w:after="0"/>
-              <w:ind w:left="0" w:firstLine="0"/>
-              <w:jc w:val="center"/>
-            </w:pPr>
-            <w:r>
-              <w:rPr>
-                <w:rFonts w:ascii="Times New Roman" w:hAnsi="Times New Roman"/>
-                <w:b w:val="0"/>
-                <w:sz w:val="24"/>
-              </w:rPr>
-              <w:t>Etapa 2: Aplicación de purines en campo de pastoreo</w:t>
-            </w:r>
-          </w:p>
-        </w:tc>
-        <w:tc>
-          <w:tcPr>
-            <w:tcW w:type="dxa" w:w="1597"/>
+            <w:tcW w:type="dxa" w:w="1916"/>
             <w:vAlign w:val="center"/>
             <w:tcMar>
               <w:top w:w="72" w:type="dxa"/>
@@ -7361,7 +7543,7 @@
         </w:tc>
         <w:tc>
           <w:tcPr>
-            <w:tcW w:type="dxa" w:w="1597"/>
+            <w:tcW w:type="dxa" w:w="1916"/>
             <w:vAlign w:val="center"/>
             <w:tcMar>
               <w:top w:w="72" w:type="dxa"/>
@@ -7388,7 +7570,7 @@
         </w:tc>
         <w:tc>
           <w:tcPr>
-            <w:tcW w:type="dxa" w:w="1597"/>
+            <w:tcW w:type="dxa" w:w="1916"/>
             <w:vAlign w:val="center"/>
             <w:tcMar>
               <w:top w:w="72" w:type="dxa"/>
@@ -7426,7 +7608,7 @@
           <w:b/>
           <w:color w:val="000000"/>
         </w:rPr>
-        <w:t>Figura 4</w:t>
+        <w:t>Figura 5</w:t>
       </w:r>
     </w:p>
     <w:p>
@@ -7441,74 +7623,6 @@
           <w:color w:val="000000"/>
         </w:rPr>
         <w:t>Cambio climático total por etapa y escenario.</w:t>
-      </w:r>
-    </w:p>
-    <w:p>
-      <w:pPr>
-        <w:ind w:left="0" w:firstLine="0"/>
-        <w:jc w:val="center"/>
-      </w:pPr>
-      <w:r>
-        <w:drawing>
-          <wp:inline xmlns:a="http://schemas.openxmlformats.org/drawingml/2006/main" xmlns:pic="http://schemas.openxmlformats.org/drawingml/2006/picture">
-            <wp:extent cx="5486400" cy="2630032"/>
-            <wp:docPr id="4" name="Picture 4"/>
-            <wp:cNvGraphicFramePr>
-              <a:graphicFrameLocks noChangeAspect="1"/>
-            </wp:cNvGraphicFramePr>
-            <a:graphic>
-              <a:graphicData uri="http://schemas.openxmlformats.org/drawingml/2006/picture">
-                <pic:pic>
-                  <pic:nvPicPr>
-                    <pic:cNvPr id="0" name="fig_11_impactos_cambio_climatico_etapa.png"/>
-                    <pic:cNvPicPr/>
-                  </pic:nvPicPr>
-                  <pic:blipFill>
-                    <a:blip r:embed="rId13"/>
-                    <a:stretch>
-                      <a:fillRect/>
-                    </a:stretch>
-                  </pic:blipFill>
-                  <pic:spPr>
-                    <a:xfrm>
-                      <a:off x="0" y="0"/>
-                      <a:ext cx="5486400" cy="2630032"/>
-                    </a:xfrm>
-                    <a:prstGeom prst="rect"/>
-                  </pic:spPr>
-                </pic:pic>
-              </a:graphicData>
-            </a:graphic>
-          </wp:inline>
-        </w:drawing>
-      </w:r>
-    </w:p>
-    <w:p>
-      <w:pPr>
-        <w:pStyle w:val="Rótuloacadémico"/>
-        <w:keepNext/>
-      </w:pPr>
-      <w:r>
-        <w:rPr>
-          <w:rFonts w:ascii="Times New Roman" w:hAnsi="Times New Roman"/>
-          <w:b/>
-          <w:color w:val="000000"/>
-        </w:rPr>
-        <w:t>Figura 5</w:t>
-      </w:r>
-    </w:p>
-    <w:p>
-      <w:pPr>
-        <w:pStyle w:val="Descripciónacadémica"/>
-        <w:keepNext/>
-      </w:pPr>
-      <w:r>
-        <w:rPr>
-          <w:rFonts w:ascii="Times New Roman" w:hAnsi="Times New Roman"/>
-          <w:i/>
-          <w:color w:val="000000"/>
-        </w:rPr>
-        <w:t>Eutrofización terrestre EF 3.1 por etapa y escenario.</w:t>
       </w:r>
     </w:p>
     <w:p>
@@ -7528,7 +7642,7 @@
               <a:graphicData uri="http://schemas.openxmlformats.org/drawingml/2006/picture">
                 <pic:pic>
                   <pic:nvPicPr>
-                    <pic:cNvPr id="0" name="fig_12_impactos_eutrofizacion_terrestre_etapa.png"/>
+                    <pic:cNvPr id="0" name="fig_11_impactos_cambio_climatico_etapa.png"/>
                     <pic:cNvPicPr/>
                   </pic:nvPicPr>
                   <pic:blipFill>
@@ -7553,6 +7667,74 @@
     </w:p>
     <w:p>
       <w:pPr>
+        <w:pStyle w:val="Rótuloacadémico"/>
+        <w:keepNext/>
+      </w:pPr>
+      <w:r>
+        <w:rPr>
+          <w:rFonts w:ascii="Times New Roman" w:hAnsi="Times New Roman"/>
+          <w:b/>
+          <w:color w:val="000000"/>
+        </w:rPr>
+        <w:t>Figura 6</w:t>
+      </w:r>
+    </w:p>
+    <w:p>
+      <w:pPr>
+        <w:pStyle w:val="Descripciónacadémica"/>
+        <w:keepNext/>
+      </w:pPr>
+      <w:r>
+        <w:rPr>
+          <w:rFonts w:ascii="Times New Roman" w:hAnsi="Times New Roman"/>
+          <w:i/>
+          <w:color w:val="000000"/>
+        </w:rPr>
+        <w:t>Eutrofización terrestre EF 3.1 por etapa y escenario.</w:t>
+      </w:r>
+    </w:p>
+    <w:p>
+      <w:pPr>
+        <w:ind w:left="0" w:firstLine="0"/>
+        <w:jc w:val="center"/>
+      </w:pPr>
+      <w:r>
+        <w:drawing>
+          <wp:inline xmlns:a="http://schemas.openxmlformats.org/drawingml/2006/main" xmlns:pic="http://schemas.openxmlformats.org/drawingml/2006/picture">
+            <wp:extent cx="5486400" cy="2630032"/>
+            <wp:docPr id="6" name="Picture 6"/>
+            <wp:cNvGraphicFramePr>
+              <a:graphicFrameLocks noChangeAspect="1"/>
+            </wp:cNvGraphicFramePr>
+            <a:graphic>
+              <a:graphicData uri="http://schemas.openxmlformats.org/drawingml/2006/picture">
+                <pic:pic>
+                  <pic:nvPicPr>
+                    <pic:cNvPr id="0" name="fig_12_impactos_eutrofizacion_terrestre_etapa.png"/>
+                    <pic:cNvPicPr/>
+                  </pic:nvPicPr>
+                  <pic:blipFill>
+                    <a:blip r:embed="rId15"/>
+                    <a:stretch>
+                      <a:fillRect/>
+                    </a:stretch>
+                  </pic:blipFill>
+                  <pic:spPr>
+                    <a:xfrm>
+                      <a:off x="0" y="0"/>
+                      <a:ext cx="5486400" cy="2630032"/>
+                    </a:xfrm>
+                    <a:prstGeom prst="rect"/>
+                  </pic:spPr>
+                </pic:pic>
+              </a:graphicData>
+            </a:graphic>
+          </wp:inline>
+        </w:drawing>
+      </w:r>
+    </w:p>
+    <w:p>
+      <w:pPr>
         <w:spacing w:line="240" w:lineRule="auto" w:before="0" w:after="0"/>
         <w:ind w:left="100" w:firstLine="719"/>
         <w:jc w:val="both"/>
@@ -7562,7 +7744,7 @@
           <w:rFonts w:ascii="Times New Roman" w:hAnsi="Times New Roman"/>
           <w:sz w:val="24"/>
         </w:rPr>
-        <w:t>La Tabla 5 presenta los impactos por etapa. En el Escenario A, A3: Almacenamiento de aguas verdes aportó 53,93 % del cambio climático; en el Escenario B, B1: Almacenamiento de purines aportó 81,99 %. Las Figuras 4 y 5 muestran la distribución por etapa de cambio climático y eutrofización terrestre.</w:t>
+        <w:t>La Tabla 5 presenta los impactos por etapa. En el Escenario A, A3: Almacenamiento de aguas verdes aportó 53,93 % del cambio climático; en el Escenario B, B1: Almacenamiento de purines aportó 81,99 %. Las Figuras 5 y 6 muestran la distribución por etapa de cambio climático y eutrofización terrestre.</w:t>
       </w:r>
     </w:p>
     <w:p>
@@ -9076,7 +9258,7 @@
           <w:b/>
           <w:color w:val="000000"/>
         </w:rPr>
-        <w:t>Figura 6</w:t>
+        <w:t>Figura 7</w:t>
       </w:r>
     </w:p>
     <w:p>
@@ -9102,7 +9284,7 @@
         <w:drawing>
           <wp:inline xmlns:a="http://schemas.openxmlformats.org/drawingml/2006/main" xmlns:pic="http://schemas.openxmlformats.org/drawingml/2006/picture">
             <wp:extent cx="5486400" cy="3960495"/>
-            <wp:docPr id="6" name="Picture 6"/>
+            <wp:docPr id="7" name="Picture 7"/>
             <wp:cNvGraphicFramePr>
               <a:graphicFrameLocks noChangeAspect="1"/>
             </wp:cNvGraphicFramePr>
@@ -9114,7 +9296,7 @@
                     <pic:cNvPicPr/>
                   </pic:nvPicPr>
                   <pic:blipFill>
-                    <a:blip r:embed="rId15"/>
+                    <a:blip r:embed="rId16"/>
                     <a:stretch>
                       <a:fillRect/>
                     </a:stretch>
@@ -9144,7 +9326,7 @@
           <w:rFonts w:ascii="Times New Roman" w:hAnsi="Times New Roman"/>
           <w:sz w:val="24"/>
         </w:rPr>
-        <w:t>La Tabla 6 presenta la magnitud anual y la Tabla 7 muestra los indicadores por unidad funcional. La Tabla 8 y la Figura 6 presentan la comparación entre escenarios bajo la misma base funcional.</w:t>
+        <w:t>La Tabla 6 presenta la magnitud anual y la Tabla 7 muestra los indicadores por unidad funcional. La Tabla 8 y la Figura 7 presentan la comparación entre escenarios bajo la misma base funcional.</w:t>
       </w:r>
     </w:p>
     <w:p>

</xml_diff>

<commit_message>
Reconcile sampling metadata and N basis
</commit_message>
<xml_diff>
--- a/outputs/documentos_tfg/TFG_ACV_Estiercol_INTEGRAL_PROVISIONAL_M1_M2.docx
+++ b/outputs/documentos_tfg/TFG_ACV_Estiercol_INTEGRAL_PROVISIONAL_M1_M2.docx
@@ -2239,6 +2239,34 @@
           <w:sz w:val="24"/>
         </w:rPr>
         <w:t>La jerarquía estadística fue réplica analítica, muestra compuesta, promedio de jornada e integración entre jornadas. Las réplicas analíticas no se trataron como observaciones temporales independientes y las jornadas recibieron igual peso temporal.</w:t>
+      </w:r>
+    </w:p>
+    <w:p>
+      <w:pPr>
+        <w:spacing w:line="240" w:lineRule="auto" w:before="0" w:after="0"/>
+        <w:ind w:left="100" w:firstLine="719"/>
+        <w:jc w:val="both"/>
+      </w:pPr>
+      <w:r>
+        <w:rPr>
+          <w:rFonts w:ascii="Times New Roman" w:hAnsi="Times New Roman"/>
+          <w:sz w:val="24"/>
+        </w:rPr>
+        <w:t>En M1 se analizaron, por cada sólido, dos muestras compuestas en Bioenergía y otras dos muestras compuestas físicamente independientes en el laboratorio externo: LASA para estiércol fresco y CIA para precompostado. En M2 se conservaron tres muestras compuestas por sólido; Bioenergía realizó tres réplicas gravimétricas por muestra y el remanente de esas mismas muestras fue analizado por LASA o CIA.</w:t>
+      </w:r>
+    </w:p>
+    <w:p>
+      <w:pPr>
+        <w:spacing w:line="240" w:lineRule="auto" w:before="0" w:after="0"/>
+        <w:ind w:left="100" w:firstLine="719"/>
+        <w:jc w:val="both"/>
+      </w:pPr>
+      <w:r>
+        <w:rPr>
+          <w:rFonts w:ascii="Times New Roman" w:hAnsi="Times New Roman"/>
+          <w:sz w:val="24"/>
+        </w:rPr>
+        <w:t>Bioenergía determinó húmedad y materia seca por gravimetría a 105 °C durante 16 h. El CIA determinó N y C del precompostado por Dumas sobre muestra seca o acondicionada a 80 °C durante 48 h. El porcentaje de N se combinó con la materia seca independiente de Bioenergía para construir el benchmark húmedo de A2; C y C/N permanecieron como caracterización descriptiva, sin conversión húmeda ni uso productivo.</w:t>
       </w:r>
     </w:p>
     <w:p>
@@ -3186,6 +3214,20 @@
           <w:sz w:val="24"/>
         </w:rPr>
         <w:t>El N total constituyó el balance físico principal y el nitrógeno amoniacal total un subbalance sujeto a 0 ≤ TAN ≤ N total. TAN se inicializó como 0,60 del N total únicamente en las fronteras de estiércol fresco y ambos componentes se propagaron entre etapas físicamente conectadas.</w:t>
+      </w:r>
+    </w:p>
+    <w:p>
+      <w:pPr>
+        <w:spacing w:line="240" w:lineRule="auto" w:before="0" w:after="0"/>
+        <w:ind w:left="100" w:firstLine="719"/>
+        <w:jc w:val="both"/>
+      </w:pPr>
+      <w:r>
+        <w:rPr>
+          <w:rFonts w:ascii="Times New Roman" w:hAnsi="Times New Roman"/>
+          <w:sz w:val="24"/>
+        </w:rPr>
+        <w:t>En particular, A2 recibió el N total y el TAN remanentes de A1. La medición de N del precompostado se mantuvo como benchmark experimental y no reinicializó estos flujos productivos.</w:t>
       </w:r>
     </w:p>
     <w:p>

</xml_diff>

<commit_message>
Reconcile scenario operations and stage durations
</commit_message>
<xml_diff>
--- a/outputs/documentos_tfg/TFG_ACV_Estiercol_INTEGRAL_PROVISIONAL_M1_M2.docx
+++ b/outputs/documentos_tfg/TFG_ACV_Estiercol_INTEGRAL_PROVISIONAL_M1_M2.docx
@@ -1248,6 +1248,20 @@
     </w:p>
     <w:p>
       <w:pPr>
+        <w:spacing w:line="240" w:lineRule="auto" w:before="0" w:after="0"/>
+        <w:ind w:left="100" w:firstLine="719"/>
+        <w:jc w:val="both"/>
+      </w:pPr>
+      <w:r>
+        <w:rPr>
+          <w:rFonts w:ascii="Times New Roman" w:hAnsi="Times New Roman"/>
+          <w:sz w:val="24"/>
+        </w:rPr>
+        <w:t>En la operación habitual del Escenario A, el estiércol recogido con pala se conduce a A1: Precomposteo y después a A2: Lombricompostaje. El remanente del piso se incorpora al agua de lavado y las aguas verdes llegan mediante el drenaje o canal a la tanqueta para su almacenamiento en A3. La tanqueta se vacía aproximadamente cada tres días y el tractor acciona el cañón VAIA para la aplicación en A4. La tanqueta almacena; el cañón aplica.</w:t>
+      </w:r>
+    </w:p>
+    <w:p>
+      <w:pPr>
         <w:pStyle w:val="Heading2"/>
       </w:pPr>
       <w:r>
@@ -1284,6 +1298,34 @@
           <w:sz w:val="24"/>
         </w:rPr>
         <w:t>El flujo anual común fue 26 278,725181 kg de estiércol fresco/año. En el Escenario A, la fracción sólida ingresó a A1: Precomposteo y continuó hacia A2: Lombricompostaje; el remanente se incorporó a A3: Almacenamiento de aguas verdes y A4: Aplicación de aguas verdes en campos de pastoreo. En el Escenario B, el flujo completo ingresó a B1: Almacenamiento de purines y continuó hacia B2: Aplicación de purines en campo de pastoreo.</w:t>
+      </w:r>
+    </w:p>
+    <w:p>
+      <w:pPr>
+        <w:spacing w:line="240" w:lineRule="auto" w:before="0" w:after="0"/>
+        <w:ind w:left="100" w:firstLine="719"/>
+        <w:jc w:val="both"/>
+      </w:pPr>
+      <w:r>
+        <w:rPr>
+          <w:rFonts w:ascii="Times New Roman" w:hAnsi="Times New Roman"/>
+          <w:sz w:val="24"/>
+        </w:rPr>
+        <w:t>El Escenario B no fue la operación habitual permanente ni una alternativa puramente hipotética. Para materializarlo temporalmente se suspendió la desviación normal del sólido hacia precomposteo y lombricompostaje, el estiércol paleado se dirigió a la tanqueta y el remanente del piso se incorporó mediante lavado. Los purines resultantes fueron acumulados, observados y muestreados físicamente. Las campañas A y B se realizaron en momentos distintos con la misma tanqueta y no implicaron la coexistencia de ambos contenidos. B1 representa el almacenamiento y B2 la aplicación con el mismo conjunto tractor–cañón utilizado para A4.</w:t>
+      </w:r>
+    </w:p>
+    <w:p>
+      <w:pPr>
+        <w:spacing w:line="240" w:lineRule="auto" w:before="0" w:after="0"/>
+        <w:ind w:left="100" w:firstLine="719"/>
+        <w:jc w:val="both"/>
+      </w:pPr>
+      <w:r>
+        <w:rPr>
+          <w:rFonts w:ascii="Times New Roman" w:hAnsi="Times New Roman"/>
+          <w:sz w:val="24"/>
+        </w:rPr>
+        <w:t>A1 duró aproximadamente entre 21 días y cerca de un mes, por lo que se representa como tres a cuatro semanas sin tratar 28 días como una medición exacta. A2 comenzó después de A1, cuando el material precompostado ingresó a las camas, y su operación regular duró aproximadamente 13 semanas. Vargas Sarmiento (2023, sección 5.2.2.1, p. 14; sección 6.1.3, p. 25) documentó en el mismo lombricario 13 semanas desde la siembra de las lombrices y para procesar toda la boñiga. Estas duraciones son contextuales y no escalan factores. El presente TFG no muestreó lombricompost terminado; las muestras correspondieron a material precompostado previo a A2.</w:t>
       </w:r>
     </w:p>
     <w:p>
@@ -2295,6 +2337,20 @@
           <w:sz w:val="24"/>
         </w:rPr>
         <w:t>La transformación de estiércol fresco a precompostado se calculó primero por jornada mediante materia seca y cenizas de ambos materiales; posteriormente se integraron los factores de jornada con igual peso temporal. La pérdida integrada se derivó del factor integrado.</w:t>
+      </w:r>
+    </w:p>
+    <w:p>
+      <w:pPr>
+        <w:spacing w:line="240" w:lineRule="auto" w:before="0" w:after="0"/>
+        <w:ind w:left="100" w:firstLine="719"/>
+        <w:jc w:val="both"/>
+      </w:pPr>
+      <w:r>
+        <w:rPr>
+          <w:rFonts w:ascii="Times New Roman" w:hAnsi="Times New Roman"/>
+          <w:sz w:val="24"/>
+        </w:rPr>
+        <w:t>Antes de cada campaña líquida, la tanqueta se vació el jueves por la tarde y acumuló material hasta el lunes por la mañana. Durante ese intervalo de acumulación previo al muestreo continuaron las entradas y ocurrieron dos lavados; no fue una carga cerrada ni un ensayo de almacenamiento estático. Esta preparación de muestra no sustituyó la frecuencia operativa representativa de aproximadamente tres días.</w:t>
       </w:r>
     </w:p>
     <w:p>
@@ -3624,6 +3680,20 @@
           <w:sz w:val="24"/>
         </w:rPr>
         <w:t>Los factores, la asignación de sistemas y los consumos operativos corresponden a las decisiones metodológicas vigentes. Esta integración documental no recalculó ni modificó el ACV.</w:t>
+      </w:r>
+    </w:p>
+    <w:p>
+      <w:pPr>
+        <w:spacing w:line="240" w:lineRule="auto" w:before="0" w:after="0"/>
+        <w:ind w:left="100" w:firstLine="719"/>
+        <w:jc w:val="both"/>
+      </w:pPr>
+      <w:r>
+        <w:rPr>
+          <w:rFonts w:ascii="Times New Roman" w:hAnsi="Times New Roman"/>
+          <w:sz w:val="24"/>
+        </w:rPr>
+        <w:t>En A3/B1, el MCF de 38 % se mantuvo como proxy IPCC conservador de la categoría tabulada de un mes para clima tropical húmedo. No corresponde a una medición específica del MCF para la residencia operativa de tres días y no se escaló como 38 % × 3/30. La mineralización EMEP del 10 % tampoco se escaló por tres días. El tiempo físico de operación, el intervalo específico de preparación de las muestras y la duración tabulada del proxy metodológico se trataron como conceptos distintos.</w:t>
       </w:r>
     </w:p>
     <w:p>
@@ -11881,7 +11951,7 @@
           <w:rFonts w:ascii="Times New Roman" w:hAnsi="Times New Roman"/>
           <w:sz w:val="24"/>
         </w:rPr>
-        <w:t>Vargas Sarmiento, F. (2023). Caracterización del abono orgánico resultante de dos metodologías de vermicompostaje a partir de excretas de ganado vacuno mediante el uso de la lombriz roja californiana (Eisenia foetida) y su efecto sobre plantas de banano cv. Gros Michel (Musa AAA) en invernadero [Tesis, Universidad de Costa Rica]. https://repositorio.sibdi.ucr.ac.cr/handle/123456789/22129</w:t>
+        <w:t>Vargas Sarmiento, F. (2023). Caracterización del abono orgánico resultante de dos metodologías de vermicompostaje a partir de excretas de ganado vacuno mediante el uso de la lombriz roja californiana (Eisenia foetida) y su efecto sobre plantas de banano cv. Gros Michel (Musa AAA) en invernadero [Tesis de Licenciatura en Agronomía, Universidad de Costa Rica]. https://repositorio.sibdi.ucr.ac.cr/handle/123456789/22129</w:t>
       </w:r>
     </w:p>
     <w:p>

</xml_diff>

<commit_message>
Reconcile A1-A2 emissions methodology
</commit_message>
<xml_diff>
--- a/outputs/documentos_tfg/TFG_ACV_Estiercol_INTEGRAL_PROVISIONAL_M1_M2.docx
+++ b/outputs/documentos_tfg/TFG_ACV_Estiercol_INTEGRAL_PROVISIONAL_M1_M2.docx
@@ -3311,7 +3311,21 @@
           <w:rFonts w:ascii="Times New Roman" w:hAnsi="Times New Roman"/>
           <w:sz w:val="24"/>
         </w:rPr>
-        <w:t>A2: Lombricompostaje se representó mediante la categoría IPCC de compostaje en hileras pasivas como aproximación disponible. La fracción de pérdida de N por lixiviación se estableció en cero para las condiciones del sistema estudiado, sin cambiar el factor genérico de la categoría. Las ecuaciones siguientes documentan el núcleo necesario para reproducir la lógica vigente; los factores específicos por etapa se presentan en la tabla metodológica correspondiente.</w:t>
+        <w:t>El ledger fue secuencial: A2 recibió el N total y el pool residual de TAN a la salida de A1. Por ello, aplicar factores en ambas etapas no duplicó matemáticamente los pools originales. FracGasMS permaneció exclusivamente como benchmark y no generó otra volatilización ni alimentó EF4. Las duraciones específicas introducen incertidumbre de representatividad temporal y de transferencia de los proxies, pero no justifican escalado lineal de los factores.</w:t>
+      </w:r>
+    </w:p>
+    <w:p>
+      <w:pPr>
+        <w:spacing w:line="240" w:lineRule="auto" w:before="0" w:after="0"/>
+        <w:ind w:left="100" w:firstLine="719"/>
+        <w:jc w:val="both"/>
+      </w:pPr>
+      <w:r>
+        <w:rPr>
+          <w:rFonts w:ascii="Times New Roman" w:hAnsi="Times New Roman"/>
+          <w:sz w:val="24"/>
+        </w:rPr>
+        <w:t>A2: Lombricompostaje se representó mediante una arquitectura híbrida explícita y trazable: la categoría IPCC de compostaje en hileras pasivas se utilizó como proxy para CH₄ y N₂O directo; Komakech et al. (2016), como proxy experimental aprobado para NH₃; y EMEP/EEA de almacenamiento sólido, como proxy metodológico aprobado provisionalmente para NO y N₂. La fracción de pérdida de N por lixiviación se estableció en cero para las condiciones operativas modeladas, sin cambiar el factor genérico de la categoría ni afirmar imposibilidad física universal. Las ecuaciones siguientes documentan el núcleo necesario para reproducir la lógica vigente.</w:t>
       </w:r>
     </w:p>
     <w:p>
@@ -3439,7 +3453,7 @@
           <w:rFonts w:ascii="Times New Roman" w:hAnsi="Times New Roman"/>
           <w:sz w:val="24"/>
         </w:rPr>
-        <w:t>La expresión resume las rutas parametrizadas con factores EMEP/EEA. En A2, la masa de NH₃ se estima con el factor específico de Komakech et al. (2016), mientras NO-N y N₂-N conservan provisionalmente los factores sólidos EMEP/EEA.</w:t>
+        <w:t>La expresión resume las rutas parametrizadas con factores EMEP/EEA. En A2, la masa de NH₃ se estima una sola vez con el proxy experimental aprobado de Komakech et al. (2016), aplicado a la masa húmeda inferida de residuo orgánico que ingresa a la etapa, mientras NO-N y N₂-N conservan los proxies sólidos EMEP/EEA aprobados provisionalmente.</w:t>
       </w:r>
     </w:p>
     <w:p>
@@ -5870,7 +5884,7 @@
           <w:rFonts w:ascii="Times New Roman" w:hAnsi="Times New Roman"/>
           <w:sz w:val="24"/>
         </w:rPr>
-        <w:t>Las limitaciones principales son la representatividad temporal de M1–M2, la ausencia de una medición directa del MCF para aproximadamente tres días de residencia, el uso de categorías metodológicas aproximadas para A2 y la extrapolación de observaciones operativas puntuales. Estas limitaciones se mantienen explícitas y se revisarán después de M3.</w:t>
+        <w:t>Las limitaciones principales son la representatividad temporal de M1–M2, la ausencia de una medición directa del MCF para aproximadamente tres días de residencia, la transferibilidad de Komakech, la representatividad de las categorías IPCC y del factor EMEP de N₂ en A2, la masa húmeda inferida de A2 y la ausencia de un balance cerrado de agua y sólidos. Son incertidumbres científicas de la arquitectura aprobada, no decisiones metodológicas abiertas ni impedimentos para el modelo pre-M3.</w:t>
       </w:r>
     </w:p>
     <w:p>
@@ -10599,7 +10613,7 @@
           <w:rFonts w:ascii="Times New Roman" w:hAnsi="Times New Roman"/>
           <w:sz w:val="24"/>
         </w:rPr>
-        <w:t>Las referencias de Komakech et al. (2016), Møller et al. (2004) y VanderZaag et al. (2013), junto con las directrices IPCC y EMEP/EEA, respaldan la selección y la interpretación de los factores empleados. La revisión bibliográfica final deberá cotejar los datos editoriales pendientes del registro integral.</w:t>
+        <w:t>Las referencias de Komakech et al. (2016), Møller et al. (2004) y VanderZaag et al. (2013), junto con las directrices IPCC y EMEP/EEA, permiten trazar la selección y la interpretación de los factores empleados, pero no demuestran equivalencia física entre sus sistemas de origen y el sistema estudiado. En particular, el factor de NH₃ de Komakech procede de reactores pequeños en Kampala, con residuo predominantemente ganadero, concentraciones gaseosas medidas y un flujo de aire estimado mediante el índice respirométrico dinámico; su aplicación a la masa húmeda inferida de entrada a A2 es un proxy experimental aprobado y una extrapolación con diferencias de escala, alimentación, clima, duración y operación. Estas limitaciones no convierten su selección en una decisión abierta para la fase pre-M3.</w:t>
       </w:r>
     </w:p>
     <w:p>
@@ -11147,7 +11161,7 @@
           <w:rFonts w:ascii="Times New Roman" w:hAnsi="Times New Roman"/>
           <w:sz w:val="24"/>
         </w:rPr>
-        <w:t>Antes de la versión final se requiere una evaluación acotada, de una variable por vez, sobre los supuestos que controlan las etapas dominantes y con intervalos respaldados por las fuentes vigentes. La consistencia debe verificarse además mediante cierre de balances, igualdad del flujo funcional, integridad temporal de la corrida y estabilidad de la dirección comparativa. La selección de intervalos se definirá después de M3 para evitar evaluar una caracterización experimental todavía provisional.</w:t>
+        <w:t>Después de M3 y antes de la interpretación final podrá evaluarse si una sensibilidad acotada de los proxies de alta influencia, en particular N₂ de A2 y NH₃ de Komakech, aporta valor suficiente. Su ausencia no impide validar el modelo pre-M3. La consistencia continuará verificándose mediante cierre de balances, igualdad del flujo funcional e integridad temporal de la corrida.</w:t>
       </w:r>
     </w:p>
     <w:p>

</xml_diff>

<commit_message>
Reconcile A3-B1 storage methodology
</commit_message>
<xml_diff>
--- a/outputs/documentos_tfg/TFG_ACV_Estiercol_INTEGRAL_PROVISIONAL_M1_M2.docx
+++ b/outputs/documentos_tfg/TFG_ACV_Estiercol_INTEGRAL_PROVISIONAL_M1_M2.docx
@@ -3349,7 +3349,7 @@
         <w:rPr>
           <w:rFonts w:ascii="Cambria Math" w:hAnsi="Cambria Math"/>
         </w:rPr>
-        <w:t>m_CH₄ = m_manejada × VS_húmeda × B₀ × 0,67 × (MCF/100) × AWMS    (1)</w:t>
+        <w:t>m_CH₄ = m_manejada × VS_húmeda × B₀ × ρ_CH₄ × (MCF/100) × AWMS    (1)</w:t>
       </w:r>
     </w:p>
     <w:p>
@@ -3363,7 +3363,7 @@
           <w:rFonts w:ascii="Times New Roman" w:hAnsi="Times New Roman"/>
           <w:sz w:val="24"/>
         </w:rPr>
-        <w:t>m_CH₄ es la emisión de metano de la etapa; m_manejada es la masa húmeda manejada; VS_húmeda es la fracción de sólidos volátiles en base húmeda; B₀ es la capacidad máxima de producción de metano; MCF es el factor de conversión de metano y AWMS es la fracción manejada por el sistema.</w:t>
+        <w:t>m_CH₄ es la emisión de metano de la etapa; m_manejada es la masa húmeda manejada; VS_húmeda es la fracción de sólidos volátiles en base húmeda; B₀ es la capacidad máxima de producción de metano; ρ_CH₄ es el factor IPCC de conversión de volumen a masa, 0,67 kg CH₄/m³; MCF es el factor de conversión de metano y AWMS es la fracción de la corriente ya asignada que se maneja mediante el sistema seleccionado.</w:t>
       </w:r>
     </w:p>
     <w:p>
@@ -3708,6 +3708,20 @@
           <w:sz w:val="24"/>
         </w:rPr>
         <w:t>En A3/B1, el MCF de 38 % se mantuvo como proxy IPCC conservador de la categoría tabulada de un mes para clima tropical húmedo. No corresponde a una medición específica del MCF para la residencia operativa de tres días y no se escaló como 38 % × 3/30. La mineralización EMEP del 10 % tampoco se escaló por tres días. El tiempo físico de operación, el intervalo específico de preparación de las muestras y la duración tabulada del proxy metodológico se trataron como conceptos distintos.</w:t>
+      </w:r>
+    </w:p>
+    <w:p>
+      <w:pPr>
+        <w:spacing w:line="240" w:lineRule="auto" w:before="0" w:after="0"/>
+        <w:ind w:left="100" w:firstLine="719"/>
+        <w:jc w:val="both"/>
+      </w:pPr>
+      <w:r>
+        <w:rPr>
+          <w:rFonts w:ascii="Times New Roman" w:hAnsi="Times New Roman"/>
+          <w:sz w:val="24"/>
+        </w:rPr>
+        <w:t>El B₀ de 0,24 m³ CH₄/kg SV se mantuvo como default IPCC para ganado lechero de alta productividad en otras regiones. La evidencia histórica del mismo Módulo Lechero publicada por Conejo-Morales y WingChing-Jones (2020) respalda esa clasificación, pero no constituye una medición local de B₀ ni demuestra la productividad actual de 2026. El default de baja productividad no sustituyó el valor central aprobado; la dependencia de B₀ respecto de la especie y la dieta permanece como incertidumbre paramétrica.</w:t>
       </w:r>
     </w:p>
     <w:p>
@@ -11531,6 +11545,20 @@
           <w:rFonts w:ascii="Times New Roman" w:hAnsi="Times New Roman"/>
           <w:sz w:val="24"/>
         </w:rPr>
+        <w:t>Conejo-Morales, J. F., &amp; WingChing-Jones, R. (2020). Condiciones climáticas y la producción láctea del ganado Jersey en dos pisos altitudinales. Agronomía Mesoamericana, 31(1), 157–175. https://doi.org/10.15517/am.v31i1.34739</w:t>
+      </w:r>
+    </w:p>
+    <w:p>
+      <w:pPr>
+        <w:spacing w:line="240" w:lineRule="auto" w:before="0" w:after="0"/>
+        <w:ind w:left="100" w:firstLine="719"/>
+        <w:jc w:val="both"/>
+      </w:pPr>
+      <w:r>
+        <w:rPr>
+          <w:rFonts w:ascii="Times New Roman" w:hAnsi="Times New Roman"/>
+          <w:sz w:val="24"/>
+        </w:rPr>
         <w:t>Cordero Jáuregui, R. (2013). Caracterización química del estiércol y su manejo en explotaciones de lechería familiar de los Altos de Jalisco [Tesis doctoral, Universidad de Guadalajara]. http://repositorio.cualtos.udg.mx:8080/jspui/handle/123456789/535</w:t>
       </w:r>
     </w:p>
@@ -11587,7 +11615,7 @@
           <w:rFonts w:ascii="Times New Roman" w:hAnsi="Times New Roman"/>
           <w:sz w:val="24"/>
         </w:rPr>
-        <w:t>European Environment Agency. (2023). EMEP/EEA air pollutant emission inventory guidebook 2023: Chapters 3.B Manure management and 3.D Crop production and agricultural soils. Publications Office of the European Union.</w:t>
+        <w:t>European Environment Agency. (2023). EMEP/EEA air pollutant emission inventory guidebook 2023: Chapters 3.B Manure management and 3.D Crop production and agricultural soils. Publications Office of the European Union. https://www.eea.europa.eu/en/analysis/publications/emep-eea-guidebook-2023</w:t>
       </w:r>
     </w:p>
     <w:p>
@@ -11713,7 +11741,7 @@
           <w:rFonts w:ascii="Times New Roman" w:hAnsi="Times New Roman"/>
           <w:sz w:val="24"/>
         </w:rPr>
-        <w:t>Intergovernmental Panel on Climate Change. (2019). 2019 Refinement to the 2006 IPCC Guidelines for National Greenhouse Gas Inventories. Volume 4: Agriculture, Forestry and Other Land Use, Chapters 10–11. IPCC.</w:t>
+        <w:t>Intergovernmental Panel on Climate Change. (2019). 2019 Refinement to the 2006 IPCC Guidelines for National Greenhouse Gas Inventories. Volume 4: Agriculture, Forestry and Other Land Use, Chapters 10–11. IPCC. https://www.ipcc-nggip.iges.or.jp/public/2019rf/vol4.html</w:t>
       </w:r>
     </w:p>
     <w:p>

</xml_diff>

<commit_message>
Correct acronym governance and institutional names
</commit_message>
<xml_diff>
--- a/outputs/documentos_tfg/TFG_ACV_Estiercol_INTEGRAL_PROVISIONAL_M1_M2.docx
+++ b/outputs/documentos_tfg/TFG_ACV_Estiercol_INTEGRAL_PROVISIONAL_M1_M2.docx
@@ -444,7 +444,29 @@
           <w:rFonts w:ascii="Times New Roman" w:hAnsi="Times New Roman"/>
           <w:sz w:val="24"/>
         </w:rPr>
-        <w:t xml:space="preserve"> — Laboratorio de Suelos y Foliares de la Ciudad de la Investigación</w:t>
+        <w:t xml:space="preserve"> — Centro de Investigaciones Agronómicas</w:t>
+      </w:r>
+    </w:p>
+    <w:p>
+      <w:pPr>
+        <w:spacing w:line="240" w:lineRule="auto" w:before="0" w:after="0"/>
+        <w:ind w:left="100" w:firstLine="719"/>
+        <w:jc w:val="both"/>
+      </w:pPr>
+      <w:r>
+        <w:rPr>
+          <w:rFonts w:ascii="Times New Roman" w:hAnsi="Times New Roman"/>
+          <w:b/>
+          <w:sz w:val="24"/>
+        </w:rPr>
+        <w:t>DA</w:t>
+      </w:r>
+      <w:r>
+        <w:rPr>
+          <w:rFonts w:ascii="Times New Roman" w:hAnsi="Times New Roman"/>
+          <w:sz w:val="24"/>
+        </w:rPr>
+        <w:t xml:space="preserve"> — digestión anaeróbica</w:t>
       </w:r>
     </w:p>
     <w:p>
@@ -532,7 +554,7 @@
           <w:rFonts w:ascii="Times New Roman" w:hAnsi="Times New Roman"/>
           <w:sz w:val="24"/>
         </w:rPr>
-        <w:t xml:space="preserve"> — Programa cooperativo de seguimiento y evaluación del transporte a larga distancia de contaminantes atmosféricos en Europa; Co-operative programme for monitoring and evaluation of the long-range transmission of air pollutants in Europe (denominación original en inglés)</w:t>
+        <w:t xml:space="preserve"> — Programa cooperativo de seguimiento y evaluación del transporte a larga distancia de contaminantes atmosféricos en Europa; Co-operative Programme for Monitoring and Evaluation of the Long-range Transmission of Air Pollutants in Europe (denominación oficial en inglés; EMEP es la denominación abreviada establecida)</w:t>
       </w:r>
     </w:p>
     <w:p>
@@ -664,7 +686,7 @@
           <w:rFonts w:ascii="Times New Roman" w:hAnsi="Times New Roman"/>
           <w:sz w:val="24"/>
         </w:rPr>
-        <w:t xml:space="preserve"> — Organización Internacional de Normalización; International Organization for Standardization (denominación original en inglés)</w:t>
+        <w:t xml:space="preserve"> — Organización Internacional de Normalización; International Organization for Standardization (denominación oficial en inglés; ISO es la forma abreviada universal)</w:t>
       </w:r>
     </w:p>
     <w:p>
@@ -1024,7 +1046,7 @@
           <w:rFonts w:ascii="Times New Roman" w:hAnsi="Times New Roman"/>
           <w:sz w:val="24"/>
         </w:rPr>
-        <w:t>En Costa Rica, hay aproximadamente 1,510,563 cabezas de ganado bovino, con alrededor del 40% destinado a la producción de leche y doble propósito (Instituto Nacional de Estadística y Censo [INEC], 2023). El sector lácteo de Costa Rica, compuesto por alrededor de 26 mil fincas y 2.500 empresas formales, beneficia directamente a unas 200 mil familias en el país. Se calcula que esta industria contribuye aproximadamente con el 1% del Producto Interno Bruto (PIB), produciendo anualmente 1.148 millones de litros de leche y generando exportaciones por un valor de $153 millones (Garza, 2021).</w:t>
+        <w:t>En Costa Rica, hay aproximadamente 1,510,563 cabezas de ganado bovino, con alrededor del 40% destinado a la producción de leche y doble propósito (Instituto Nacional de Estadística y Censos (INEC), 2023). El sector lácteo de Costa Rica, compuesto por alrededor de 26 mil fincas y 2.500 empresas formales, beneficia directamente a unas 200 mil familias en el país. Se calcula que esta industria contribuye aproximadamente con el 1% del Producto Interno Bruto (PIB), produciendo anualmente 1.148 millones de litros de leche y generando exportaciones por un valor de $153 millones (Garza, 2021).</w:t>
       </w:r>
     </w:p>
     <w:p>
@@ -1038,7 +1060,7 @@
           <w:rFonts w:ascii="Times New Roman" w:hAnsi="Times New Roman"/>
           <w:sz w:val="24"/>
         </w:rPr>
-        <w:t>La situación actual y futura de la ganadería depende de la presión ejercida por las fuerzas del mercado. Influenciadas por factores como el cambio climático y el incremento en la demanda de alimentos. Estos factores están promoviendo el uso de tecnologías limpias, que incluyen la implementación de nuevos recursos forrajeros, la reducción de gases de efecto invernadero y el manejo de residuos (Ministerio de Agricultura y Ganadería [MAG], 2018). Uno de los principales inconvenientes de esta actividad son los residuos generados. Ya que se calcula que un rebaño de 20 vacas puede producir más de 500 kg de estiércol al día (Salazar, 2012).</w:t>
+        <w:t>La situación actual y futura de la ganadería depende de la presión ejercida por las fuerzas del mercado. Influenciadas por factores como el cambio climático y el incremento en la demanda de alimentos. Estos factores están promoviendo el uso de tecnologías limpias, que incluyen la implementación de nuevos recursos forrajeros, la reducción de gases de efecto invernadero y el manejo de residuos (Ministerio de Agricultura y Ganadería (MAG), 2018). Uno de los principales inconvenientes de esta actividad son los residuos generados. Ya que se calcula que un rebaño de 20 vacas puede producir más de 500 kg de estiércol al día (Salazar, 2012).</w:t>
       </w:r>
     </w:p>
     <w:p>
@@ -1402,7 +1424,7 @@
           <w:rFonts w:ascii="Times New Roman" w:hAnsi="Times New Roman"/>
           <w:sz w:val="24"/>
         </w:rPr>
-        <w:t>El ACV es una herramienta que evalúa de forma integral los impactos ambientales asociados con un producto, proceso o actividad humana, abarcando desde la obtención de materias primas, su producción y uso, hasta el manejo de los residuos. Aunque el ACV enfrenta algunas limitaciones, como dificultades en la interpretación pese al marco general establecido por la Organización Internacional de Normalización (ISO, por sus siglas en inglés). Su capacidad para ofrecer una visión global lo hace útil en la gestión ambiental (Curran, 2013).</w:t>
+        <w:t>El ACV es una herramienta que evalúa de forma integral los impactos ambientales asociados con un producto, proceso o actividad humana, abarcando desde la obtención de materias primas, su producción y uso, hasta el manejo de los residuos. Aunque el ACV enfrenta algunas limitaciones, como dificultades en la interpretación pese al marco general establecido por la Organización Internacional de Normalización (ISO). Su capacidad para ofrecer una visión global lo hace útil en la gestión ambiental (Curran, 2013).</w:t>
       </w:r>
     </w:p>
     <w:p>
@@ -2943,7 +2965,7 @@
           <w:rFonts w:ascii="Times New Roman" w:hAnsi="Times New Roman"/>
           <w:sz w:val="24"/>
         </w:rPr>
-        <w:t>En M1 se analizaron, por cada sólido, dos muestras compuestas en Bioenergía y otras dos muestras compuestas físicamente independientes en el laboratorio externo: los Laboratorios de Servicios Analíticos de la Escuela de Química (LASA), UCR, para estiércol fresco y el Laboratorio de Suelos y Foliares de la Ciudad de la Investigación (CIA) para precompostado. En M2 se conservaron tres muestras compuestas por sólido; Bioenergía realizó tres réplicas gravimétricas por muestra y el remanente de esas mismas muestras fue analizado por LASA o CIA.</w:t>
+        <w:t>En M1 se analizaron, por cada sólido, dos muestras compuestas en Bioenergía y otras dos muestras compuestas físicamente independientes en el laboratorio externo: los Laboratorios de Servicios Analíticos de la Escuela de Química (LASA) de la Universidad de Costa Rica (UCR), para estiércol fresco, y el Laboratorio de Suelos y Foliares del Centro de Investigaciones Agronómicas (CIA), para precompostado. En M2 se conservaron tres muestras compuestas por sólido; Bioenergía realizó tres réplicas gravimétricas por muestra y el remanente de esas mismas muestras fue analizado por LASA o CIA.</w:t>
       </w:r>
     </w:p>
     <w:p>
@@ -3946,7 +3968,7 @@
           <w:rFonts w:ascii="Times New Roman" w:hAnsi="Times New Roman"/>
           <w:sz w:val="24"/>
         </w:rPr>
-        <w:t>Las pérdidas explícitas de NH₃-N, NOx-N y N₂-N definidas por la guía conjunta del Programa cooperativo de seguimiento y evaluación del transporte a larga distancia de contaminantes atmosféricos en Europa (EMEP, por sus siglas en inglés) y la Agencia Europea de Medio Ambiente (EEA, por sus siglas en inglés) redujeron el TAN y el N total. El N₂O-N directo y las pérdidas hídricas definidas por IPCC redujeron el N total una sola vez. El N₂O indirecto por volatilización se calculó con las especies explícitas NH₃-N y NOx-N; el NO₃⁻ se originó únicamente en rutas hídricas justificadas.</w:t>
+        <w:t>Las pérdidas explícitas de NH₃-N, NOx-N y N₂-N definidas por la guía conjunta del Programa cooperativo de seguimiento y evaluación del transporte a larga distancia de contaminantes atmosféricos en Europa (EMEP) y la Agencia Europea de Medio Ambiente (EEA, por sus siglas en inglés) redujeron el TAN y el N total. El N₂O-N directo y las pérdidas hídricas definidas por IPCC redujeron el N total una sola vez. El N₂O indirecto por volatilización se calculó con las especies explícitas NH₃-N y NOx-N; el NO₃⁻ se originó únicamente en rutas hídricas justificadas.</w:t>
       </w:r>
     </w:p>
     <w:p>

</xml_diff>

<commit_message>
Polish residual academic formatting
</commit_message>
<xml_diff>
--- a/outputs/documentos_tfg/TFG_ACV_Estiercol_INTEGRAL_PROVISIONAL_M1_M2.docx
+++ b/outputs/documentos_tfg/TFG_ACV_Estiercol_INTEGRAL_PROVISIONAL_M1_M2.docx
@@ -5,6 +5,8 @@
     <w:p>
       <w:pPr>
         <w:pStyle w:val="Portadacentrada"/>
+        <w:keepNext/>
+        <w:spacing w:after="80"/>
       </w:pPr>
       <w:r>
         <w:rPr>
@@ -17,6 +19,8 @@
     <w:p>
       <w:pPr>
         <w:pStyle w:val="Portadacentrada"/>
+        <w:keepNext/>
+        <w:spacing w:after="80"/>
       </w:pPr>
       <w:r>
         <w:rPr>
@@ -29,6 +33,8 @@
     <w:p>
       <w:pPr>
         <w:pStyle w:val="Portadacentrada"/>
+        <w:keepNext/>
+        <w:spacing w:after="480"/>
       </w:pPr>
       <w:r>
         <w:rPr>
@@ -41,6 +47,8 @@
     <w:p>
       <w:pPr>
         <w:pStyle w:val="Títulointegral"/>
+        <w:keepNext/>
+        <w:spacing w:before="400" w:after="600"/>
       </w:pPr>
       <w:r>
         <w:rPr>
@@ -52,7 +60,8 @@
     <w:p>
       <w:pPr>
         <w:pStyle w:val="Portadacentrada"/>
-        <w:spacing w:after="360"/>
+        <w:keepNext/>
+        <w:spacing w:after="480" w:before="160"/>
       </w:pPr>
       <w:r>
         <w:rPr>
@@ -66,7 +75,8 @@
     <w:p>
       <w:pPr>
         <w:pStyle w:val="Portadacentrada"/>
-        <w:spacing w:after="160"/>
+        <w:keepNext/>
+        <w:spacing w:after="240"/>
       </w:pPr>
       <w:r>
         <w:rPr>
@@ -86,7 +96,8 @@
     <w:p>
       <w:pPr>
         <w:pStyle w:val="Portadacentrada"/>
-        <w:spacing w:after="160"/>
+        <w:keepNext/>
+        <w:spacing w:after="240"/>
       </w:pPr>
       <w:r>
         <w:rPr>
@@ -106,7 +117,8 @@
     <w:p>
       <w:pPr>
         <w:pStyle w:val="Portadacentrada"/>
-        <w:spacing w:after="160"/>
+        <w:keepNext/>
+        <w:spacing w:after="240"/>
       </w:pPr>
       <w:r>
         <w:rPr>
@@ -126,7 +138,8 @@
     <w:p>
       <w:pPr>
         <w:pStyle w:val="Portadacentrada"/>
-        <w:spacing w:before="360"/>
+        <w:keepNext/>
+        <w:spacing w:before="880" w:after="160"/>
       </w:pPr>
       <w:r>
         <w:rPr>
@@ -139,6 +152,8 @@
     <w:p>
       <w:pPr>
         <w:pStyle w:val="Portadacentrada"/>
+        <w:keepNext/>
+        <w:spacing w:before="160" w:after="880"/>
       </w:pPr>
       <w:r>
         <w:rPr>
@@ -151,7 +166,8 @@
     <w:p>
       <w:pPr>
         <w:pStyle w:val="Portadacentrada"/>
-        <w:spacing w:before="360"/>
+        <w:keepNext/>
+        <w:spacing w:before="400"/>
       </w:pPr>
       <w:r>
         <w:rPr>
@@ -199,7 +215,7 @@
           <w:rFonts w:ascii="Times New Roman" w:hAnsi="Times New Roman"/>
           <w:sz w:val="24"/>
         </w:rPr>
-        <w:t>Este trabajo final de graduación (TFG) integra la propuesta académica original con la metodología ejecutada y los productos regenerables de la corrida vigente. Los resultados, la discusión y las conclusiones corresponden a la integración PROVISIONAL M1–M2. La incorporación de M3 actualizará la caracterización y puede modificar las magnitudes, comparaciones e interpretaciones presentadas.</w:t>
+        <w:t>Este trabajo final de graduación (TFG) integra la propuesta académica original con la metodología ejecutada y los productos regenerables de la corrida vigente. Los resultados, la discusión y las conclusiones corresponden a la integración PROVISIONAL M1–m². La incorporación de m³ actualizará la caracterización y puede modificar las magnitudes, comparaciones e interpretaciones presentadas.</w:t>
       </w:r>
     </w:p>
     <w:p>
@@ -1226,7 +1242,7 @@
           <w:rFonts w:ascii="Times New Roman" w:hAnsi="Times New Roman"/>
           <w:sz w:val="24"/>
         </w:rPr>
-        <w:t>El estudio aplicó el análisis de ciclo de vida (ACV) a dos alternativas del manejo de estiércol en la lechería: el Escenario A, que integra la ruta sólida de precomposteo y lombricompostaje con la ruta de aguas verdes, y el Escenario B, que representa el almacenamiento y la aplicación directa de purines. La evaluación abarcó cambio climático, eutrofización terrestre y eutrofización marina. En esta etapa documental, la evidencia disponible integra M1 y M2 y mantiene pendiente M3.</w:t>
+        <w:t>El estudio aplicó el análisis de ciclo de vida (ACV) a dos alternativas del manejo de estiércol en la lechería: el Escenario A, que integra la ruta sólida de precomposteo y lombricompostaje con la ruta de aguas verdes, y el Escenario B, que representa el almacenamiento y la aplicación directa de purines. La evaluación abarcó cambio climático, eutrofización terrestre y eutrofización marina. En esta etapa documental, la evidencia disponible integra M1 y m² y mantiene pendiente m³.</w:t>
       </w:r>
     </w:p>
     <w:p>
@@ -1616,7 +1632,7 @@
           <w:rFonts w:ascii="Times New Roman" w:hAnsi="Times New Roman"/>
           <w:sz w:val="24"/>
         </w:rPr>
-        <w:t>Macktoobian (2024) realiza un ACV detallado del proceso de lombricompostaje en residuos orgánicos municipales. Usando como unidad funcional 1 kg de lombricompost y tomando datos de la base EcoInvent y evaluaciones de impacto de ReCiPe. Se cuantificaron las contribuciones del proceso al calentamiento global, la eutrofización de cuerpos de agua dulce y la eutrofización marina. Se determinó que el proceso produce 0,10999 kg de CO₂ eq para el calentamiento global, 1,18 × 10-8 kg de P eq para la eutrofización del agua dulce y 2,17 × 10-9 kg de N eq para la eutrofización marina. Los resultados del estudio resaltan el potencial del lombricompost como una opción sostenible frente a los fertilizantes convencionales en la producción de cultivos.</w:t>
+        <w:t>Macktoobian (2024) realiza un ACV detallado del proceso de lombricompostaje en residuos orgánicos municipales. Usando como unidad funcional 1 kg de lombricompost y tomando datos de la base EcoInvent y evaluaciones de impacto de ReCiPe. Se cuantificaron las contribuciones del proceso al calentamiento global, la eutrofización de cuerpos de agua dulce y la eutrofización marina. Se determinó que el proceso produce 0,10999 kg de CO₂ eq para el calentamiento global, 1,18 × 10⁻⁸ kg de P eq para la eutrofización del agua dulce y 2,17 × 10⁻⁹ kg de N eq para la eutrofización marina. Los resultados del estudio resaltan el potencial del lombricompost como una opción sostenible frente a los fertilizantes convencionales en la producción de cultivos.</w:t>
       </w:r>
     </w:p>
     <w:p>
@@ -1886,7 +1902,7 @@
           <w:rFonts w:ascii="Times New Roman" w:hAnsi="Times New Roman"/>
           <w:sz w:val="24"/>
         </w:rPr>
-        <w:t>El procesamiento del estiércol estudiado provino del ganado bovino, el cual se manejó mediante lombricompostaje y la producción de aguas verdes para su aplicación a los campos de pastoreo. La operación y otros detalles del lombricario realizado en pilas fue descrito anteriormente por Sarmiento (2023). Este lombricario ocupó un área total de 156 m² de espacio funcional, distribuidos en tres secciones: precomposteo, camas y secado, con superficies de 15m2, 60m2 y 81m2, respectivamente. El suelo y las camas estuvieron hechos de cemento y mampostería (con bloques de 12x20x40 cm), respectivamente. La sección de precomposteo tuvo en total 10,3 m de largo, 0,64 m de ancho y una profundidad de 1,7 m, su volumen fue de 11,25 m³. Las camas tuvieron un largo total de 21,5 m y un ancho y profundidad de 1,62 m de 0,425 m, y estuvo dividida en 5 unidades. Siendo una de ellas de la mitad del ancho antes mencionado, el volumen total fue de 13,3 m³.</w:t>
+        <w:t>El procesamiento del estiércol estudiado provino del ganado bovino, el cual se manejó mediante lombricompostaje y la producción de aguas verdes para su aplicación a los campos de pastoreo. La operación y otros detalles del lombricario realizado en pilas fue descrito anteriormente por Sarmiento (2023). Este lombricario ocupó un área total de 156 m² de espacio funcional, distribuidos en tres secciones: precomposteo, camas y secado, con superficies de 15 m², 60 m² y 81 m², respectivamente. El suelo y las camas estuvieron hechos de cemento y mampostería (con bloques de 12x20x40 cm), respectivamente. La sección de precomposteo tuvo en total 10,3 m de largo, 0,64 m de ancho y una profundidad de 1,7 m, su volumen fue de 11,25 m³. Las camas tuvieron un largo total de 21,5 m y un ancho y profundidad de 1,62 m de 0,425 m, y estuvo dividida en 5 unidades. Siendo una de ellas de la mitad del ancho antes mencionado, el volumen total fue de 13,3 m³.</w:t>
       </w:r>
     </w:p>
     <w:p>
@@ -2965,7 +2981,7 @@
           <w:rFonts w:ascii="Times New Roman" w:hAnsi="Times New Roman"/>
           <w:sz w:val="24"/>
         </w:rPr>
-        <w:t>En M1 se analizaron, por cada sólido, dos muestras compuestas en Bioenergía y otras dos muestras compuestas físicamente independientes en el laboratorio externo: los Laboratorios de Servicios Analíticos de la Escuela de Química (LASA) de la Universidad de Costa Rica (UCR), para estiércol fresco, y el Laboratorio de Suelos y Foliares del Centro de Investigaciones Agronómicas (CIA), para precompostado. En M2 se conservaron tres muestras compuestas por sólido; Bioenergía realizó tres réplicas gravimétricas por muestra y el remanente de esas mismas muestras fue analizado por LASA o CIA.</w:t>
+        <w:t>En M1 se analizaron, por cada sólido, dos muestras compuestas en Bioenergía y otras dos muestras compuestas físicamente independientes en el laboratorio externo: los Laboratorios de Servicios Analíticos de la Escuela de Química (LASA) de la Universidad de Costa Rica (UCR), para estiércol fresco, y el Laboratorio de Suelos y Foliares del Centro de Investigaciones Agronómicas (CIA), para precompostado. En m² se conservaron tres muestras compuestas por sólido; Bioenergía realizó tres réplicas gravimétricas por muestra y el remanente de esas mismas muestras fue analizado por LASA o CIA.</w:t>
       </w:r>
     </w:p>
     <w:p>
@@ -2979,7 +2995,7 @@
           <w:rFonts w:ascii="Times New Roman" w:hAnsi="Times New Roman"/>
           <w:sz w:val="24"/>
         </w:rPr>
-        <w:t>Bioenergía determinó húmedad y materia seca por gravimetría a 105 °C durante 16 h. El CIA determinó N y C del precompostado por Dumas sobre muestra seca o acondicionada a 80 °C durante 48 h. El porcentaje de N se combinó con la materia seca independiente de Bioenergía para construir el referencia de contraste húmedo de A2; C y C/N permanecieron como caracterización descriptiva, sin conversión húmeda ni uso productivo.</w:t>
+        <w:t>Bioenergía determinó humedad y materia seca por gravimetría a 105 °C durante 16 h. El CIA determinó N y C del precompostado por Dumas sobre muestra seca o acondicionada a 80 °C durante 48 h. El porcentaje de N se combinó con la materia seca independiente de Bioenergía para construir la referencia de contraste en base húmeda de A2; C y C/N permanecieron como caracterización descriptiva, sin conversión húmeda ni uso productivo.</w:t>
       </w:r>
     </w:p>
     <w:p>
@@ -2993,7 +3009,7 @@
           <w:rFonts w:ascii="Times New Roman" w:hAnsi="Times New Roman"/>
           <w:sz w:val="24"/>
         </w:rPr>
-        <w:t>Para los sólidos metodológicamente comparables, la integración provisional combinó M1 y M2. En aguas verdes y purines, M1 correspondió a especiación y se conservó para trazabilidad; el N total líquido activo procedió de M2 mediante Kjeldahl. M3 permanece pendiente y se incorporará mediante el mismo secuencia de procesamiento para producir la caracterización final.</w:t>
+        <w:t>Para los sólidos metodológicamente comparables, la integración provisional combinó M1 y m². En aguas verdes y purines, M1 correspondió a especiación y se conservó para trazabilidad; el N total líquido activo procedió de m² mediante Kjeldahl. m³ permanece pendiente y se incorporará mediante la misma secuencia de procesamiento para producir la caracterización final.</w:t>
       </w:r>
     </w:p>
     <w:p>
@@ -3982,7 +3998,7 @@
           <w:rFonts w:ascii="Times New Roman" w:hAnsi="Times New Roman"/>
           <w:sz w:val="24"/>
         </w:rPr>
-        <w:t>El balance secuencial fue secuencial: A2 recibió el N total y el reserva residual de TAN a la salida de A1. Por ello, aplicar factores en ambas etapas no duplicó matemáticamente los reservas originales. FracGasMS permaneció exclusivamente como referencia de contraste y no generó otra volatilización ni alimentó EF4. Las duraciones específicas introducen incertidumbre de representatividad temporal y de transferencia de las aproximaciones, pero no justifican escalado lineal de los factores.</w:t>
+        <w:t>El balance se aplicó de forma secuencial: A2 recibió el N total y la reserva residual de TAN a la salida de A1. Por ello, aplicar factores en ambas etapas no duplicó matemáticamente las reservas originales. FracGasMS permaneció exclusivamente como referencia de contraste y no generó otra volatilización ni alimentó EF4. Las duraciones específicas introducen incertidumbre de representatividad temporal y de transferencia de las aproximaciones, pero no justifican escalado lineal de los factores.</w:t>
       </w:r>
     </w:p>
     <w:p>
@@ -4989,7 +5005,7 @@
           <w:rFonts w:ascii="Times New Roman" w:hAnsi="Times New Roman"/>
           <w:sz w:val="24"/>
         </w:rPr>
-        <w:t>La expresión resume las rutas parametrizadas con factores EMEP/EEA. En A2, la masa de NH₃ se estima una sola vez con el aproximación experimental aprobada de Komakech et al. (2016), aplicado a la masa húmeda inferida de residuo orgánico que ingresa a la etapa, mientras NO-N y N₂-N conservan las aproximaciones para sólidos de EMEP/EEA aprobadas provisionalmente.</w:t>
+        <w:t>La expresión resume las rutas parametrizadas con factores EMEP/EEA. En A2, la masa de NH₃ se estima una sola vez con la aproximación experimental aprobada de Komakech et al. (2016), aplicada a la masa húmeda inferida de residuo orgánico que ingresa a la etapa, mientras NO-N y N₂-N conservan las aproximaciones para sólidos de EMEP/EEA aprobadas provisionalmente.</w:t>
       </w:r>
     </w:p>
     <w:p>
@@ -8931,7 +8947,7 @@
           <w:rFonts w:ascii="Times New Roman" w:hAnsi="Times New Roman"/>
           <w:sz w:val="24"/>
         </w:rPr>
-        <w:t>En A3/B1, el MCF de 38 % se mantuvo como aproximación conservadora del IPCC de la categoría tabulada de un mes para clima tropical húmedo. No corresponde a una medición específica del MCF para la residencia operativa de tres días y no se escaló como 38 % × 3/30. La mineralización EMEP del 10 % tampoco se escaló por tres días. El tiempo físico de operación, el intervalo específico de preparación de las muestras y la duración tabulada del aproximación metodológica se trataron como conceptos distintos.</w:t>
+        <w:t>En A3/B1, el MCF de 38 % se mantuvo como aproximación conservadora del IPCC de la categoría tabulada de un mes para clima tropical húmedo. No corresponde a una medición específica del MCF para la residencia operativa de tres días y no se escaló como 38 % × 3/30. La mineralización EMEP del 10 % tampoco se escaló por tres días. El tiempo físico de operación, el intervalo específico de preparación de las muestras y la duración tabulada de la aproximación metodológica se trataron como conceptos distintos.</w:t>
       </w:r>
     </w:p>
     <w:p>
@@ -8945,7 +8961,7 @@
           <w:rFonts w:ascii="Times New Roman" w:hAnsi="Times New Roman"/>
           <w:sz w:val="24"/>
         </w:rPr>
-        <w:t>El B₀ de 0,24 m³ CH₄/kg SV se mantuvo como valor por defecto IPCC para ganado lechero de alta productividad en otras regiones. La evidencia histórica del mismo Módulo Lechero publicada por Conejo-Morales y WingChing-Jones (2020) respalda esa clasificación, pero no constituye una medición local de B₀ ni demuestra la productividad actual de 2026. El valor por defecto de baja productividad no sustituyó el valor central aprobado; la dependencia de B₀ respecto de la especie y la dieta permanece como incertidumbre paramétrica.</w:t>
+        <w:t>El B₀ de 0,24 m³ CH₄/kg SV se mantuvo como valor por defecto del IPCC para ganado lechero de alta productividad en otras regiones. La evidencia histórica del mismo Módulo Lechero publicada por Conejo-Morales y WingChing-Jones (2020) respalda esa clasificación, pero no constituye una medición local de B₀ ni demuestra la productividad actual de 2026. El valor por defecto de baja productividad no sustituyó el valor central aprobado; la dependencia de B₀ respecto de la especie y la dieta permanece como incertidumbre paramétrica.</w:t>
       </w:r>
     </w:p>
     <w:p>
@@ -10309,7 +10325,7 @@
                 <w:b w:val="0"/>
                 <w:sz w:val="24"/>
               </w:rPr>
-              <w:t>mol N-eq/kg NOx as NO2</w:t>
+              <w:t>mol N-eq/kg NOx como NO₂</w:t>
             </w:r>
           </w:p>
         </w:tc>
@@ -10449,7 +10465,7 @@
                 <w:b w:val="0"/>
                 <w:sz w:val="24"/>
               </w:rPr>
-              <w:t>kg N-eq/kg NOx as NO2</w:t>
+              <w:t>kg N-eq/kg NOx como NO₂</w:t>
             </w:r>
           </w:p>
         </w:tc>
@@ -11581,7 +11597,7 @@
           <w:rFonts w:ascii="Times New Roman" w:hAnsi="Times New Roman"/>
           <w:sz w:val="24"/>
         </w:rPr>
-        <w:t>Las limitaciones principales son la representatividad temporal de M1–M2, la ausencia de una medición directa del MCF para aproximadamente tres días de residencia, la transferibilidad de Komakech, la representatividad de las categorías IPCC y del factor EMEP de N₂ en A2, la masa húmeda inferida de A2 y la ausencia de un balance cerrado de agua y sólidos. Son incertidumbres científicas de la arquitectura aprobada, no decisiones metodológicas abiertas ni impedimentos para el modelo pre-M3.</w:t>
+        <w:t>Las limitaciones principales son la representatividad temporal de M1–m², la ausencia de una medición directa del MCF para aproximadamente tres días de residencia, la transferibilidad de Komakech, la representatividad de las categorías IPCC y del factor EMEP de N₂ en A2, la masa húmeda inferida de A2 y la ausencia de un balance cerrado de agua y sólidos. Son incertidumbres científicas de la arquitectura aprobada, no decisiones metodológicas abiertas ni impedimentos para el modelo pre-m³.</w:t>
       </w:r>
     </w:p>
     <w:p>
@@ -11621,7 +11637,7 @@
           <w:rFonts w:ascii="Times New Roman" w:hAnsi="Times New Roman"/>
           <w:sz w:val="24"/>
         </w:rPr>
-        <w:t>Todos los resultados de este capítulo corresponden a la corrida PROVISIONAL M1–M2. No constituyen una caracterización definitiva ni anticipan los resultados de M3.</w:t>
+        <w:t>Todos los resultados de este capítulo corresponden a la corrida PROVISIONAL M1–m². No constituyen una caracterización definitiva ni anticipan los resultados de m³.</w:t>
       </w:r>
     </w:p>
     <w:p>
@@ -11647,7 +11663,7 @@
           <w:rFonts w:ascii="Times New Roman" w:hAnsi="Times New Roman"/>
           <w:sz w:val="24"/>
         </w:rPr>
-        <w:t>El estiércol fresco presentó 86,4 % de húmedad y 13,6 % de materia seca. El material precompostado presentó 79,33 % de húmedad y 20,67 % de materia seca.</w:t>
+        <w:t>El estiércol fresco presentó 86,4 % de humedad y 13,6 % de materia seca. El material precompostado presentó 79,33 % de humedad y 20,67 % de materia seca.</w:t>
       </w:r>
     </w:p>
     <w:p>
@@ -16296,7 +16312,7 @@
           <w:rFonts w:ascii="Times New Roman" w:hAnsi="Times New Roman"/>
           <w:sz w:val="24"/>
         </w:rPr>
-        <w:t>El contraste con Jjagwe et al. (2019) mostró que las diferencias entre la estimación IPCC y la referencia experimental no siguieron una dirección uniforme para CH₄ y N₂O directo. Las diferencias de especie de lombriz, acondicionamiento, alimentación, húmedad, duración, clima, escala y frecuencia de medición impiden interpretar esa comparación como equivalencia física entre sistemas.</w:t>
+        <w:t>El contraste con Jjagwe et al. (2019) mostró que las diferencias entre la estimación IPCC y la referencia experimental no siguieron una dirección uniforme para CH₄ y N₂O directo. Las diferencias de especie de lombriz, acondicionamiento, alimentación, humedad, duración, clima, escala y frecuencia de medición impiden interpretar esa comparación como equivalencia física entre sistemas.</w:t>
       </w:r>
     </w:p>
     <w:p>
@@ -16310,7 +16326,7 @@
           <w:rFonts w:ascii="Times New Roman" w:hAnsi="Times New Roman"/>
           <w:sz w:val="24"/>
         </w:rPr>
-        <w:t>Las referencias de Komakech et al. (2016), Møller et al. (2004) y VanderZaag et al. (2013), junto con las directrices IPCC y EMEP/EEA, permiten trazar la selección y la interpretación de los factores empleados, pero no demuestran equivalencia física entre sus sistemas de origen y el sistema estudiado. En particular, el factor de NH₃ de Komakech procede de reactores pequeños en Kampala, con residuo predominantemente ganadero, concentraciones gaseosas medidas y un flujo de aire estimado mediante el índice respirométrico dinámico; su aplicación a la masa húmeda inferida de entrada a A2 es un aproximación experimental aprobada y una extrapolación con diferencias de escala, alimentación, clima, duración y operación. Estas limitaciones no convierten su selección en una decisión abierta para la fase pre-M3.</w:t>
+        <w:t>Las referencias de Komakech et al. (2016), Møller et al. (2004) y VanderZaag et al. (2013), junto con las directrices IPCC y EMEP/EEA, permiten trazar la selección y la interpretación de los factores empleados, pero no demuestran equivalencia física entre sus sistemas de origen y el sistema estudiado. En particular, el factor de NH₃ de Komakech procede de reactores pequeños en Kampala, con residuo predominantemente ganadero, concentraciones gaseosas medidas y un flujo de aire estimado mediante el índice respirométrico dinámico; su aplicación a la masa húmeda inferida de entrada a A2 es una aproximación experimental aprobada y una extrapolación con diferencias de escala, alimentación, clima, duración y operación. Estas limitaciones no convierten su selección en una decisión abierta para la fase pre-m³.</w:t>
       </w:r>
     </w:p>
     <w:p>
@@ -16350,7 +16366,7 @@
           <w:rFonts w:ascii="Times New Roman" w:hAnsi="Times New Roman"/>
           <w:sz w:val="24"/>
         </w:rPr>
-        <w:t>Los supuestos con mayor capacidad material de afectar la comparación son el MCF del almacenamiento líquido, la caracterización de materia seca, sólidos volátiles y N después de M3, la relación TAN/N inicial, los factores de A2, la duración y frecuencia de los consumos operativos y los factores asociados a la aplicación al suelo.</w:t>
+        <w:t>Los supuestos con mayor capacidad material de afectar la comparación son el MCF del almacenamiento líquido, la caracterización de materia seca, sólidos volátiles y N después de m³, la relación TAN/N inicial, los factores de A2, la duración y frecuencia de los consumos operativos y los factores asociados a la aplicación al suelo.</w:t>
       </w:r>
     </w:p>
     <w:p>
@@ -16364,7 +16380,7 @@
           <w:rFonts w:ascii="Times New Roman" w:hAnsi="Times New Roman"/>
           <w:sz w:val="24"/>
         </w:rPr>
-        <w:t>Después de M3 y antes de la interpretación final podrá evaluarse si una sensibilidad acotada de las aproximaciones de alta influencia, en particular N₂ de A2 y NH₃ de Komakech, aporta valor suficiente. Su ausencia no impide validar el modelo pre-M3. La consistencia continuará verificándose mediante cierre de balances, igualdad del flujo funcional e integridad temporal de la corrida.</w:t>
+        <w:t>Después de m³ y antes de la interpretación final podrá evaluarse si una sensibilidad acotada de las aproximaciones de alta influencia, en particular N₂ de A2 y NH₃ de Komakech, aporta valor suficiente. Su ausencia no impide validar el modelo pre-m³. La consistencia continuará verificándose mediante cierre de balances, igualdad del flujo funcional e integridad temporal de la corrida.</w:t>
       </w:r>
     </w:p>
     <w:p>
@@ -16898,7 +16914,7 @@
           <w:rFonts w:ascii="Times New Roman" w:hAnsi="Times New Roman"/>
           <w:sz w:val="24"/>
         </w:rPr>
-        <w:t>Las siguientes conclusiones corresponden exclusivamente a la corrida PROVISIONAL M1–M2. M3 puede modificar las magnitudes, las etapas dominantes y la comparación; por tanto, estas conclusiones no representan el cierre experimental del TFG.</w:t>
+        <w:t>Las siguientes conclusiones corresponden exclusivamente a la corrida PROVISIONAL M1–m². m³ puede modificar las magnitudes, las etapas dominantes y la comparación; por tanto, estas conclusiones no representan el cierre experimental del TFG.</w:t>
       </w:r>
     </w:p>
     <w:p>
@@ -17048,7 +17064,7 @@
           <w:rFonts w:ascii="Times New Roman" w:hAnsi="Times New Roman"/>
           <w:sz w:val="24"/>
         </w:rPr>
-        <w:t>Incorporar M3 mediante la misma secuencia de ingestión, integración, ACV, tablas, figuras y documentos, y mantener la etiqueta provisional hasta completar las validaciones cruzadas.</w:t>
+        <w:t>Incorporar m³ mediante la misma secuencia de ingestión, integración, ACV, tablas, figuras y documentos, y mantener la etiqueta provisional hasta completar las validaciones cruzadas.</w:t>
       </w:r>
     </w:p>
     <w:p>
@@ -17062,7 +17078,7 @@
           <w:rFonts w:ascii="Times New Roman" w:hAnsi="Times New Roman"/>
           <w:sz w:val="24"/>
         </w:rPr>
-        <w:t>Priorizar, después de M3, una evaluación cuantitativa acotada del MCF del almacenamiento líquido y de los supuestos que controlan las etapas dominantes. Documentar como limitaciones los supuestos que no puedan resolverse con evidencia suficiente.</w:t>
+        <w:t>Priorizar, después de m³, una evaluación cuantitativa acotada del MCF del almacenamiento líquido y de los supuestos que controlan las etapas dominantes. Documentar como limitaciones los supuestos que no puedan resolverse con evidencia suficiente.</w:t>
       </w:r>
     </w:p>
     <w:p>
@@ -17996,7 +18012,7 @@
                 <w:b w:val="0"/>
                 <w:sz w:val="24"/>
               </w:rPr>
-              <w:t>Impactos por etapa, totales y comparación provisional M1–M2</w:t>
+              <w:t>Impactos por etapa, totales y comparación provisional M1–m²</w:t>
             </w:r>
           </w:p>
         </w:tc>

</xml_diff>

<commit_message>
Fix M2 M3 campaign notation normalization
</commit_message>
<xml_diff>
--- a/outputs/documentos_tfg/TFG_ACV_Estiercol_INTEGRAL_PROVISIONAL_M1_M2.docx
+++ b/outputs/documentos_tfg/TFG_ACV_Estiercol_INTEGRAL_PROVISIONAL_M1_M2.docx
@@ -215,7 +215,7 @@
           <w:rFonts w:ascii="Times New Roman" w:hAnsi="Times New Roman"/>
           <w:sz w:val="24"/>
         </w:rPr>
-        <w:t>Este trabajo final de graduación (TFG) integra la propuesta académica original con la metodología ejecutada y los productos regenerables de la corrida vigente. Los resultados, la discusión y las conclusiones corresponden a la integración PROVISIONAL M1–m². La incorporación de m³ actualizará la caracterización y puede modificar las magnitudes, comparaciones e interpretaciones presentadas.</w:t>
+        <w:t>Este trabajo final de graduación (TFG) integra la propuesta académica original con la metodología ejecutada y los productos regenerables de la corrida vigente. Los resultados, la discusión y las conclusiones corresponden a la integración PROVISIONAL M1–M2. La incorporación de M3 actualizará la caracterización y puede modificar las magnitudes, comparaciones e interpretaciones presentadas.</w:t>
       </w:r>
     </w:p>
     <w:p>
@@ -1242,7 +1242,7 @@
           <w:rFonts w:ascii="Times New Roman" w:hAnsi="Times New Roman"/>
           <w:sz w:val="24"/>
         </w:rPr>
-        <w:t>El estudio aplicó el análisis de ciclo de vida (ACV) a dos alternativas del manejo de estiércol en la lechería: el Escenario A, que integra la ruta sólida de precomposteo y lombricompostaje con la ruta de aguas verdes, y el Escenario B, que representa el almacenamiento y la aplicación directa de purines. La evaluación abarcó cambio climático, eutrofización terrestre y eutrofización marina. En esta etapa documental, la evidencia disponible integra M1 y m² y mantiene pendiente m³.</w:t>
+        <w:t>El estudio aplicó el análisis de ciclo de vida (ACV) a dos alternativas del manejo de estiércol en la lechería: el Escenario A, que integra la ruta sólida de precomposteo y lombricompostaje con la ruta de aguas verdes, y el Escenario B, que representa el almacenamiento y la aplicación directa de purines. La evaluación abarcó cambio climático, eutrofización terrestre y eutrofización marina. En esta etapa documental, la evidencia disponible integra M1 y M2 y mantiene pendiente M3.</w:t>
       </w:r>
     </w:p>
     <w:p>
@@ -2981,7 +2981,7 @@
           <w:rFonts w:ascii="Times New Roman" w:hAnsi="Times New Roman"/>
           <w:sz w:val="24"/>
         </w:rPr>
-        <w:t>En M1 se analizaron, por cada sólido, dos muestras compuestas en Bioenergía y otras dos muestras compuestas físicamente independientes en el laboratorio externo: los Laboratorios de Servicios Analíticos de la Escuela de Química (LASA) de la Universidad de Costa Rica (UCR), para estiércol fresco, y el Laboratorio de Suelos y Foliares del Centro de Investigaciones Agronómicas (CIA), para precompostado. En m² se conservaron tres muestras compuestas por sólido; Bioenergía realizó tres réplicas gravimétricas por muestra y el remanente de esas mismas muestras fue analizado por LASA o CIA.</w:t>
+        <w:t>En M1 se analizaron, por cada sólido, dos muestras compuestas en Bioenergía y otras dos muestras compuestas físicamente independientes en el laboratorio externo: los Laboratorios de Servicios Analíticos de la Escuela de Química (LASA) de la Universidad de Costa Rica (UCR), para estiércol fresco, y el Laboratorio de Suelos y Foliares del Centro de Investigaciones Agronómicas (CIA), para precompostado. En M2 se conservaron tres muestras compuestas por sólido; Bioenergía realizó tres réplicas gravimétricas por muestra y el remanente de esas mismas muestras fue analizado por LASA o CIA.</w:t>
       </w:r>
     </w:p>
     <w:p>
@@ -3009,7 +3009,7 @@
           <w:rFonts w:ascii="Times New Roman" w:hAnsi="Times New Roman"/>
           <w:sz w:val="24"/>
         </w:rPr>
-        <w:t>Para los sólidos metodológicamente comparables, la integración provisional combinó M1 y m². En aguas verdes y purines, M1 correspondió a especiación y se conservó para trazabilidad; el N total líquido activo procedió de m² mediante Kjeldahl. m³ permanece pendiente y se incorporará mediante la misma secuencia de procesamiento para producir la caracterización final.</w:t>
+        <w:t>Para los sólidos metodológicamente comparables, la integración provisional combinó M1 y M2. En aguas verdes y purines, M1 correspondió a especiación y se conservó para trazabilidad; el N total líquido activo procedió de M2 mediante Kjeldahl. M3 permanece pendiente y se incorporará mediante la misma secuencia de procesamiento para producir la caracterización final.</w:t>
       </w:r>
     </w:p>
     <w:p>
@@ -11597,7 +11597,7 @@
           <w:rFonts w:ascii="Times New Roman" w:hAnsi="Times New Roman"/>
           <w:sz w:val="24"/>
         </w:rPr>
-        <w:t>Las limitaciones principales son la representatividad temporal de M1–m², la ausencia de una medición directa del MCF para aproximadamente tres días de residencia, la transferibilidad de Komakech, la representatividad de las categorías IPCC y del factor EMEP de N₂ en A2, la masa húmeda inferida de A2 y la ausencia de un balance cerrado de agua y sólidos. Son incertidumbres científicas de la arquitectura aprobada, no decisiones metodológicas abiertas ni impedimentos para el modelo pre-m³.</w:t>
+        <w:t>Las limitaciones principales son la representatividad temporal de M1–M2, la ausencia de una medición directa del MCF para aproximadamente tres días de residencia, la transferibilidad de Komakech, la representatividad de las categorías IPCC y del factor EMEP de N₂ en A2, la masa húmeda inferida de A2 y la ausencia de un balance cerrado de agua y sólidos. Son incertidumbres científicas de la arquitectura aprobada, no decisiones metodológicas abiertas ni impedimentos para el modelo pre-M3.</w:t>
       </w:r>
     </w:p>
     <w:p>
@@ -11637,7 +11637,7 @@
           <w:rFonts w:ascii="Times New Roman" w:hAnsi="Times New Roman"/>
           <w:sz w:val="24"/>
         </w:rPr>
-        <w:t>Todos los resultados de este capítulo corresponden a la corrida PROVISIONAL M1–m². No constituyen una caracterización definitiva ni anticipan los resultados de m³.</w:t>
+        <w:t>Todos los resultados de este capítulo corresponden a la corrida PROVISIONAL M1–M2. No constituyen una caracterización definitiva ni anticipan los resultados de M3.</w:t>
       </w:r>
     </w:p>
     <w:p>
@@ -16326,7 +16326,7 @@
           <w:rFonts w:ascii="Times New Roman" w:hAnsi="Times New Roman"/>
           <w:sz w:val="24"/>
         </w:rPr>
-        <w:t>Las referencias de Komakech et al. (2016), Møller et al. (2004) y VanderZaag et al. (2013), junto con las directrices IPCC y EMEP/EEA, permiten trazar la selección y la interpretación de los factores empleados, pero no demuestran equivalencia física entre sus sistemas de origen y el sistema estudiado. En particular, el factor de NH₃ de Komakech procede de reactores pequeños en Kampala, con residuo predominantemente ganadero, concentraciones gaseosas medidas y un flujo de aire estimado mediante el índice respirométrico dinámico; su aplicación a la masa húmeda inferida de entrada a A2 es una aproximación experimental aprobada y una extrapolación con diferencias de escala, alimentación, clima, duración y operación. Estas limitaciones no convierten su selección en una decisión abierta para la fase pre-m³.</w:t>
+        <w:t>Las referencias de Komakech et al. (2016), Møller et al. (2004) y VanderZaag et al. (2013), junto con las directrices IPCC y EMEP/EEA, permiten trazar la selección y la interpretación de los factores empleados, pero no demuestran equivalencia física entre sus sistemas de origen y el sistema estudiado. En particular, el factor de NH₃ de Komakech procede de reactores pequeños en Kampala, con residuo predominantemente ganadero, concentraciones gaseosas medidas y un flujo de aire estimado mediante el índice respirométrico dinámico; su aplicación a la masa húmeda inferida de entrada a A2 es una aproximación experimental aprobada y una extrapolación con diferencias de escala, alimentación, clima, duración y operación. Estas limitaciones no convierten su selección en una decisión abierta para la fase pre-M3.</w:t>
       </w:r>
     </w:p>
     <w:p>
@@ -16366,7 +16366,7 @@
           <w:rFonts w:ascii="Times New Roman" w:hAnsi="Times New Roman"/>
           <w:sz w:val="24"/>
         </w:rPr>
-        <w:t>Los supuestos con mayor capacidad material de afectar la comparación son el MCF del almacenamiento líquido, la caracterización de materia seca, sólidos volátiles y N después de m³, la relación TAN/N inicial, los factores de A2, la duración y frecuencia de los consumos operativos y los factores asociados a la aplicación al suelo.</w:t>
+        <w:t>Los supuestos con mayor capacidad material de afectar la comparación son el MCF del almacenamiento líquido, la caracterización de materia seca, sólidos volátiles y N después de M3, la relación TAN/N inicial, los factores de A2, la duración y frecuencia de los consumos operativos y los factores asociados a la aplicación al suelo.</w:t>
       </w:r>
     </w:p>
     <w:p>
@@ -16380,7 +16380,7 @@
           <w:rFonts w:ascii="Times New Roman" w:hAnsi="Times New Roman"/>
           <w:sz w:val="24"/>
         </w:rPr>
-        <w:t>Después de m³ y antes de la interpretación final podrá evaluarse si una sensibilidad acotada de las aproximaciones de alta influencia, en particular N₂ de A2 y NH₃ de Komakech, aporta valor suficiente. Su ausencia no impide validar el modelo pre-m³. La consistencia continuará verificándose mediante cierre de balances, igualdad del flujo funcional e integridad temporal de la corrida.</w:t>
+        <w:t>Después de M3 y antes de la interpretación final podrá evaluarse si una sensibilidad acotada de las aproximaciones de alta influencia, en particular N₂ de A2 y NH₃ de Komakech, aporta valor suficiente. Su ausencia no impide validar el modelo pre-M3. La consistencia continuará verificándose mediante cierre de balances, igualdad del flujo funcional e integridad temporal de la corrida.</w:t>
       </w:r>
     </w:p>
     <w:p>
@@ -16914,7 +16914,7 @@
           <w:rFonts w:ascii="Times New Roman" w:hAnsi="Times New Roman"/>
           <w:sz w:val="24"/>
         </w:rPr>
-        <w:t>Las siguientes conclusiones corresponden exclusivamente a la corrida PROVISIONAL M1–m². m³ puede modificar las magnitudes, las etapas dominantes y la comparación; por tanto, estas conclusiones no representan el cierre experimental del TFG.</w:t>
+        <w:t>Las siguientes conclusiones corresponden exclusivamente a la corrida PROVISIONAL M1–M2. M3 puede modificar las magnitudes, las etapas dominantes y la comparación; por tanto, estas conclusiones no representan el cierre experimental del TFG.</w:t>
       </w:r>
     </w:p>
     <w:p>
@@ -17064,7 +17064,7 @@
           <w:rFonts w:ascii="Times New Roman" w:hAnsi="Times New Roman"/>
           <w:sz w:val="24"/>
         </w:rPr>
-        <w:t>Incorporar m³ mediante la misma secuencia de ingestión, integración, ACV, tablas, figuras y documentos, y mantener la etiqueta provisional hasta completar las validaciones cruzadas.</w:t>
+        <w:t>Incorporar M3 mediante la misma secuencia de ingestión, integración, ACV, tablas, figuras y documentos, y mantener la etiqueta provisional hasta completar las validaciones cruzadas.</w:t>
       </w:r>
     </w:p>
     <w:p>
@@ -17078,7 +17078,7 @@
           <w:rFonts w:ascii="Times New Roman" w:hAnsi="Times New Roman"/>
           <w:sz w:val="24"/>
         </w:rPr>
-        <w:t>Priorizar, después de m³, una evaluación cuantitativa acotada del MCF del almacenamiento líquido y de los supuestos que controlan las etapas dominantes. Documentar como limitaciones los supuestos que no puedan resolverse con evidencia suficiente.</w:t>
+        <w:t>Priorizar, después de M3, una evaluación cuantitativa acotada del MCF del almacenamiento líquido y de los supuestos que controlan las etapas dominantes. Documentar como limitaciones los supuestos que no puedan resolverse con evidencia suficiente.</w:t>
       </w:r>
     </w:p>
     <w:p>
@@ -18012,7 +18012,7 @@
                 <w:b w:val="0"/>
                 <w:sz w:val="24"/>
               </w:rPr>
-              <w:t>Impactos por etapa, totales y comparación provisional M1–m²</w:t>
+              <w:t>Impactos por etapa, totales y comparación provisional M1–M2</w:t>
             </w:r>
           </w:p>
         </w:tc>

</xml_diff>

<commit_message>
Document inventory data provenance
</commit_message>
<xml_diff>
--- a/outputs/documentos_tfg/TFG_ACV_Estiercol_INTEGRAL_PROVISIONAL_M1_M2.docx
+++ b/outputs/documentos_tfg/TFG_ACV_Estiercol_INTEGRAL_PROVISIONAL_M1_M2.docx
@@ -382,6 +382,20 @@
           <w:sz w:val="24"/>
         </w:rPr>
         <w:t>Apéndice A. Trazabilidad entre objetivos y evidencia provisional</w:t>
+      </w:r>
+    </w:p>
+    <w:p>
+      <w:pPr>
+        <w:spacing w:line="240" w:lineRule="auto" w:before="0" w:after="0"/>
+        <w:ind w:left="100" w:firstLine="719"/>
+        <w:jc w:val="both"/>
+      </w:pPr>
+      <w:r>
+        <w:rPr>
+          <w:rFonts w:ascii="Times New Roman" w:hAnsi="Times New Roman"/>
+          <w:sz w:val="24"/>
+        </w:rPr>
+        <w:t>Apéndice B. Matriz detallada de procedencia de los datos del inventario</w:t>
       </w:r>
     </w:p>
     <w:p>
@@ -3942,7 +3956,908 @@
           <w:rFonts w:ascii="Times New Roman" w:hAnsi="Times New Roman"/>
           <w:color w:val="000000"/>
         </w:rPr>
-        <w:t>4.4 Balance secuencial de nitrógeno y estimación de emisiones</w:t>
+        <w:t>4.4 Fuentes y levantamiento del inventario</w:t>
+      </w:r>
+    </w:p>
+    <w:p>
+      <w:pPr>
+        <w:spacing w:line="240" w:lineRule="auto" w:before="0" w:after="0"/>
+        <w:ind w:left="100" w:firstLine="719"/>
+        <w:jc w:val="both"/>
+      </w:pPr>
+      <w:r>
+        <w:rPr>
+          <w:rFonts w:ascii="Times New Roman" w:hAnsi="Times New Roman"/>
+          <w:sz w:val="24"/>
+        </w:rPr>
+        <w:t>El Inventario de Ciclo de Vida se levantó mediante seis componentes complementarios: caracterización experimental; observaciones y registros operativos de la finca; datos previamente publicados cuando fueron necesarios; factores metodológicos oficiales o de literatura; supuestos explícitos; y cálculos, integraciones y transformaciones reproducibles dentro del flujo de trabajo.</w:t>
+      </w:r>
+    </w:p>
+    <w:p>
+      <w:pPr>
+        <w:spacing w:line="240" w:lineRule="auto" w:before="0" w:after="0"/>
+        <w:ind w:left="100" w:firstLine="719"/>
+        <w:jc w:val="both"/>
+      </w:pPr>
+      <w:r>
+        <w:rPr>
+          <w:rFonts w:ascii="Times New Roman" w:hAnsi="Times New Roman"/>
+          <w:sz w:val="24"/>
+        </w:rPr>
+        <w:t>La procedencia y el tratamiento se registraron por separado. Según la taxonomía adoptada para este TFG, se clasificó como primaria la información obtenida específicamente mediante muestreo, medición, observación o registro directo. Los análisis de CIA y LASA conservaron esta condición cuando correspondieron a muestras del estudio, aunque se ejecutaran como servicio analítico externo. Los datos preexistentes, la literatura y los factores del IPCC, del Programa cooperativo de seguimiento y evaluación del transporte a larga distancia de contaminantes atmosféricos en Europa (EMEP) y la Agencia Europea de Medio Ambiente (EEA, por sus siglas en inglés), del IMN y de Environmental Footprint 3.1 se clasificaron como secundarios con subtipos que identifican su función.</w:t>
+      </w:r>
+    </w:p>
+    <w:p>
+      <w:pPr>
+        <w:spacing w:line="240" w:lineRule="auto" w:before="0" w:after="0"/>
+        <w:ind w:left="100" w:firstLine="719"/>
+        <w:jc w:val="both"/>
+      </w:pPr>
+      <w:r>
+        <w:rPr>
+          <w:rFonts w:ascii="Times New Roman" w:hAnsi="Times New Roman"/>
+          <w:sz w:val="24"/>
+        </w:rPr>
+        <w:t>La categoría terciaria se reservó para materiales de compilación o localización y no se asignó a ninguna entrada cuantitativa activa. Medido, observado, publicado, supuesto, calculado, integrado, propagado, factor metodológico y factor de caracterización describen el tratamiento del dato; no alteran por sí mismos su procedencia.</w:t>
+      </w:r>
+    </w:p>
+    <w:p>
+      <w:pPr>
+        <w:spacing w:line="240" w:lineRule="auto" w:before="0" w:after="0"/>
+        <w:ind w:left="100" w:firstLine="719"/>
+        <w:jc w:val="both"/>
+      </w:pPr>
+      <w:r>
+        <w:rPr>
+          <w:rFonts w:ascii="Times New Roman" w:hAnsi="Times New Roman"/>
+          <w:sz w:val="24"/>
+        </w:rPr>
+        <w:t>La Tabla 3 resume seis macrofamilias de datos y su uso. El Apéndice B, Matriz detallada de procedencia de los datos del inventario, conserva las 15 familias, etapas, subtipos, fuentes concretas y tratamientos necesarios para la trazabilidad fina.</w:t>
+      </w:r>
+    </w:p>
+    <w:p>
+      <w:pPr>
+        <w:pStyle w:val="Rótuloacadémico"/>
+        <w:keepNext/>
+      </w:pPr>
+      <w:r>
+        <w:rPr>
+          <w:rFonts w:ascii="Times New Roman" w:hAnsi="Times New Roman"/>
+          <w:b/>
+          <w:color w:val="000000"/>
+        </w:rPr>
+        <w:t>Tabla 3</w:t>
+      </w:r>
+    </w:p>
+    <w:p>
+      <w:pPr>
+        <w:pStyle w:val="Descripciónacadémica"/>
+        <w:keepNext/>
+      </w:pPr>
+      <w:r>
+        <w:rPr>
+          <w:rFonts w:ascii="Times New Roman" w:hAnsi="Times New Roman"/>
+          <w:i/>
+          <w:color w:val="000000"/>
+        </w:rPr>
+        <w:t>Procedencia y tratamiento de las familias de datos del inventario.</w:t>
+      </w:r>
+    </w:p>
+    <w:tbl>
+      <w:tblPr>
+        <w:tblW w:type="auto" w:w="0"/>
+        <w:jc w:val="center"/>
+        <w:tblLook w:firstColumn="1" w:firstRow="1" w:lastColumn="0" w:lastRow="0" w:noHBand="0" w:noVBand="1" w:val="04A0"/>
+      </w:tblPr>
+      <w:tblGrid>
+        <w:gridCol w:w="2395"/>
+        <w:gridCol w:w="2395"/>
+        <w:gridCol w:w="2395"/>
+        <w:gridCol w:w="2395"/>
+      </w:tblGrid>
+      <w:tr>
+        <w:trPr>
+          <w:cantSplit/>
+          <w:tblHeader w:val="true"/>
+        </w:trPr>
+        <w:tc>
+          <w:tcPr>
+            <w:tcW w:type="dxa" w:w="2395"/>
+            <w:vAlign w:val="center"/>
+            <w:tcMar>
+              <w:top w:w="72" w:type="dxa"/>
+              <w:left w:w="72" w:type="dxa"/>
+              <w:bottom w:w="72" w:type="dxa"/>
+              <w:right w:w="72" w:type="dxa"/>
+            </w:tcMar>
+          </w:tcPr>
+          <w:p>
+            <w:pPr>
+              <w:spacing w:line="240" w:lineRule="auto" w:before="0" w:after="0"/>
+              <w:ind w:left="0" w:firstLine="0"/>
+              <w:jc w:val="center"/>
+            </w:pPr>
+            <w:r>
+              <w:rPr>
+                <w:rFonts w:ascii="Times New Roman" w:hAnsi="Times New Roman"/>
+                <w:b/>
+                <w:sz w:val="24"/>
+              </w:rPr>
+              <w:t>Macrofamilia</w:t>
+            </w:r>
+          </w:p>
+        </w:tc>
+        <w:tc>
+          <w:tcPr>
+            <w:tcW w:type="dxa" w:w="2395"/>
+            <w:vAlign w:val="center"/>
+            <w:tcMar>
+              <w:top w:w="72" w:type="dxa"/>
+              <w:left w:w="72" w:type="dxa"/>
+              <w:bottom w:w="72" w:type="dxa"/>
+              <w:right w:w="72" w:type="dxa"/>
+            </w:tcMar>
+          </w:tcPr>
+          <w:p>
+            <w:pPr>
+              <w:spacing w:line="240" w:lineRule="auto" w:before="0" w:after="0"/>
+              <w:ind w:left="0" w:firstLine="0"/>
+              <w:jc w:val="center"/>
+            </w:pPr>
+            <w:r>
+              <w:rPr>
+                <w:rFonts w:ascii="Times New Roman" w:hAnsi="Times New Roman"/>
+                <w:b/>
+                <w:sz w:val="24"/>
+              </w:rPr>
+              <w:t>Procedencia general</w:t>
+            </w:r>
+          </w:p>
+        </w:tc>
+        <w:tc>
+          <w:tcPr>
+            <w:tcW w:type="dxa" w:w="2395"/>
+            <w:vAlign w:val="center"/>
+            <w:tcMar>
+              <w:top w:w="72" w:type="dxa"/>
+              <w:left w:w="72" w:type="dxa"/>
+              <w:bottom w:w="72" w:type="dxa"/>
+              <w:right w:w="72" w:type="dxa"/>
+            </w:tcMar>
+          </w:tcPr>
+          <w:p>
+            <w:pPr>
+              <w:spacing w:line="240" w:lineRule="auto" w:before="0" w:after="0"/>
+              <w:ind w:left="0" w:firstLine="0"/>
+              <w:jc w:val="center"/>
+            </w:pPr>
+            <w:r>
+              <w:rPr>
+                <w:rFonts w:ascii="Times New Roman" w:hAnsi="Times New Roman"/>
+                <w:b/>
+                <w:sz w:val="24"/>
+              </w:rPr>
+              <w:t>Tratamiento general</w:t>
+            </w:r>
+          </w:p>
+        </w:tc>
+        <w:tc>
+          <w:tcPr>
+            <w:tcW w:type="dxa" w:w="2395"/>
+            <w:vAlign w:val="center"/>
+            <w:tcMar>
+              <w:top w:w="72" w:type="dxa"/>
+              <w:left w:w="72" w:type="dxa"/>
+              <w:bottom w:w="72" w:type="dxa"/>
+              <w:right w:w="72" w:type="dxa"/>
+            </w:tcMar>
+          </w:tcPr>
+          <w:p>
+            <w:pPr>
+              <w:spacing w:line="240" w:lineRule="auto" w:before="0" w:after="0"/>
+              <w:ind w:left="0" w:firstLine="0"/>
+              <w:jc w:val="center"/>
+            </w:pPr>
+            <w:r>
+              <w:rPr>
+                <w:rFonts w:ascii="Times New Roman" w:hAnsi="Times New Roman"/>
+                <w:b/>
+                <w:sz w:val="24"/>
+              </w:rPr>
+              <w:t>Función dentro del ICV</w:t>
+            </w:r>
+          </w:p>
+        </w:tc>
+      </w:tr>
+      <w:tr>
+        <w:trPr>
+          <w:cantSplit/>
+        </w:trPr>
+        <w:tc>
+          <w:tcPr>
+            <w:tcW w:type="dxa" w:w="2395"/>
+            <w:vAlign w:val="center"/>
+            <w:tcMar>
+              <w:top w:w="72" w:type="dxa"/>
+              <w:left w:w="72" w:type="dxa"/>
+              <w:bottom w:w="72" w:type="dxa"/>
+              <w:right w:w="72" w:type="dxa"/>
+            </w:tcMar>
+          </w:tcPr>
+          <w:p>
+            <w:pPr>
+              <w:spacing w:line="240" w:lineRule="auto" w:before="0" w:after="0"/>
+              <w:ind w:left="0" w:firstLine="0"/>
+              <w:jc w:val="center"/>
+            </w:pPr>
+            <w:r>
+              <w:rPr>
+                <w:rFonts w:ascii="Times New Roman" w:hAnsi="Times New Roman"/>
+                <w:b w:val="0"/>
+                <w:sz w:val="24"/>
+              </w:rPr>
+              <w:t>Caracterización experimental</w:t>
+            </w:r>
+          </w:p>
+        </w:tc>
+        <w:tc>
+          <w:tcPr>
+            <w:tcW w:type="dxa" w:w="2395"/>
+            <w:vAlign w:val="center"/>
+            <w:tcMar>
+              <w:top w:w="72" w:type="dxa"/>
+              <w:left w:w="72" w:type="dxa"/>
+              <w:bottom w:w="72" w:type="dxa"/>
+              <w:right w:w="72" w:type="dxa"/>
+            </w:tcMar>
+          </w:tcPr>
+          <w:p>
+            <w:pPr>
+              <w:spacing w:line="240" w:lineRule="auto" w:before="0" w:after="0"/>
+              <w:ind w:left="0" w:firstLine="0"/>
+              <w:jc w:val="center"/>
+            </w:pPr>
+            <w:r>
+              <w:rPr>
+                <w:rFonts w:ascii="Times New Roman" w:hAnsi="Times New Roman"/>
+                <w:b w:val="0"/>
+                <w:sz w:val="24"/>
+              </w:rPr>
+              <w:t>Primaria: mediciones de muestras del TFG</w:t>
+            </w:r>
+          </w:p>
+        </w:tc>
+        <w:tc>
+          <w:tcPr>
+            <w:tcW w:type="dxa" w:w="2395"/>
+            <w:vAlign w:val="center"/>
+            <w:tcMar>
+              <w:top w:w="72" w:type="dxa"/>
+              <w:left w:w="72" w:type="dxa"/>
+              <w:bottom w:w="72" w:type="dxa"/>
+              <w:right w:w="72" w:type="dxa"/>
+            </w:tcMar>
+          </w:tcPr>
+          <w:p>
+            <w:pPr>
+              <w:spacing w:line="240" w:lineRule="auto" w:before="0" w:after="0"/>
+              <w:ind w:left="0" w:firstLine="0"/>
+              <w:jc w:val="center"/>
+            </w:pPr>
+            <w:r>
+              <w:rPr>
+                <w:rFonts w:ascii="Times New Roman" w:hAnsi="Times New Roman"/>
+                <w:b w:val="0"/>
+                <w:sz w:val="24"/>
+              </w:rPr>
+              <w:t>Medido e integrado estadísticamente</w:t>
+            </w:r>
+          </w:p>
+        </w:tc>
+        <w:tc>
+          <w:tcPr>
+            <w:tcW w:type="dxa" w:w="2395"/>
+            <w:vAlign w:val="center"/>
+            <w:tcMar>
+              <w:top w:w="72" w:type="dxa"/>
+              <w:left w:w="72" w:type="dxa"/>
+              <w:bottom w:w="72" w:type="dxa"/>
+              <w:right w:w="72" w:type="dxa"/>
+            </w:tcMar>
+          </w:tcPr>
+          <w:p>
+            <w:pPr>
+              <w:spacing w:line="240" w:lineRule="auto" w:before="0" w:after="0"/>
+              <w:ind w:left="0" w:firstLine="0"/>
+              <w:jc w:val="center"/>
+            </w:pPr>
+            <w:r>
+              <w:rPr>
+                <w:rFonts w:ascii="Times New Roman" w:hAnsi="Times New Roman"/>
+                <w:b w:val="0"/>
+                <w:sz w:val="24"/>
+              </w:rPr>
+              <w:t>Caracterizar los materiales y promover parámetros experimentales</w:t>
+            </w:r>
+          </w:p>
+        </w:tc>
+      </w:tr>
+      <w:tr>
+        <w:trPr>
+          <w:cantSplit/>
+        </w:trPr>
+        <w:tc>
+          <w:tcPr>
+            <w:tcW w:type="dxa" w:w="2395"/>
+            <w:vAlign w:val="center"/>
+            <w:tcMar>
+              <w:top w:w="72" w:type="dxa"/>
+              <w:left w:w="72" w:type="dxa"/>
+              <w:bottom w:w="72" w:type="dxa"/>
+              <w:right w:w="72" w:type="dxa"/>
+            </w:tcMar>
+          </w:tcPr>
+          <w:p>
+            <w:pPr>
+              <w:spacing w:line="240" w:lineRule="auto" w:before="0" w:after="0"/>
+              <w:ind w:left="0" w:firstLine="0"/>
+              <w:jc w:val="center"/>
+            </w:pPr>
+            <w:r>
+              <w:rPr>
+                <w:rFonts w:ascii="Times New Roman" w:hAnsi="Times New Roman"/>
+                <w:b w:val="0"/>
+                <w:sz w:val="24"/>
+              </w:rPr>
+              <w:t>Observaciones y registros operativos de la finca</w:t>
+            </w:r>
+          </w:p>
+        </w:tc>
+        <w:tc>
+          <w:tcPr>
+            <w:tcW w:type="dxa" w:w="2395"/>
+            <w:vAlign w:val="center"/>
+            <w:tcMar>
+              <w:top w:w="72" w:type="dxa"/>
+              <w:left w:w="72" w:type="dxa"/>
+              <w:bottom w:w="72" w:type="dxa"/>
+              <w:right w:w="72" w:type="dxa"/>
+            </w:tcMar>
+          </w:tcPr>
+          <w:p>
+            <w:pPr>
+              <w:spacing w:line="240" w:lineRule="auto" w:before="0" w:after="0"/>
+              <w:ind w:left="0" w:firstLine="0"/>
+              <w:jc w:val="center"/>
+            </w:pPr>
+            <w:r>
+              <w:rPr>
+                <w:rFonts w:ascii="Times New Roman" w:hAnsi="Times New Roman"/>
+                <w:b w:val="0"/>
+                <w:sz w:val="24"/>
+              </w:rPr>
+              <w:t>Primaria: observación, comunicación y registro de campo</w:t>
+            </w:r>
+          </w:p>
+        </w:tc>
+        <w:tc>
+          <w:tcPr>
+            <w:tcW w:type="dxa" w:w="2395"/>
+            <w:vAlign w:val="center"/>
+            <w:tcMar>
+              <w:top w:w="72" w:type="dxa"/>
+              <w:left w:w="72" w:type="dxa"/>
+              <w:bottom w:w="72" w:type="dxa"/>
+              <w:right w:w="72" w:type="dxa"/>
+            </w:tcMar>
+          </w:tcPr>
+          <w:p>
+            <w:pPr>
+              <w:spacing w:line="240" w:lineRule="auto" w:before="0" w:after="0"/>
+              <w:ind w:left="0" w:firstLine="0"/>
+              <w:jc w:val="center"/>
+            </w:pPr>
+            <w:r>
+              <w:rPr>
+                <w:rFonts w:ascii="Times New Roman" w:hAnsi="Times New Roman"/>
+                <w:b w:val="0"/>
+                <w:sz w:val="24"/>
+              </w:rPr>
+              <w:t>Observado, comunicado o anualizado</w:t>
+            </w:r>
+          </w:p>
+        </w:tc>
+        <w:tc>
+          <w:tcPr>
+            <w:tcW w:type="dxa" w:w="2395"/>
+            <w:vAlign w:val="center"/>
+            <w:tcMar>
+              <w:top w:w="72" w:type="dxa"/>
+              <w:left w:w="72" w:type="dxa"/>
+              <w:bottom w:w="72" w:type="dxa"/>
+              <w:right w:w="72" w:type="dxa"/>
+            </w:tcMar>
+          </w:tcPr>
+          <w:p>
+            <w:pPr>
+              <w:spacing w:line="240" w:lineRule="auto" w:before="0" w:after="0"/>
+              <w:ind w:left="0" w:firstLine="0"/>
+              <w:jc w:val="center"/>
+            </w:pPr>
+            <w:r>
+              <w:rPr>
+                <w:rFonts w:ascii="Times New Roman" w:hAnsi="Times New Roman"/>
+                <w:b w:val="0"/>
+                <w:sz w:val="24"/>
+              </w:rPr>
+              <w:t>Representar tiempos, frecuencias y características nominales de equipos</w:t>
+            </w:r>
+          </w:p>
+        </w:tc>
+      </w:tr>
+      <w:tr>
+        <w:trPr>
+          <w:cantSplit/>
+        </w:trPr>
+        <w:tc>
+          <w:tcPr>
+            <w:tcW w:type="dxa" w:w="2395"/>
+            <w:vAlign w:val="center"/>
+            <w:tcMar>
+              <w:top w:w="72" w:type="dxa"/>
+              <w:left w:w="72" w:type="dxa"/>
+              <w:bottom w:w="72" w:type="dxa"/>
+              <w:right w:w="72" w:type="dxa"/>
+            </w:tcMar>
+          </w:tcPr>
+          <w:p>
+            <w:pPr>
+              <w:spacing w:line="240" w:lineRule="auto" w:before="0" w:after="0"/>
+              <w:ind w:left="0" w:firstLine="0"/>
+              <w:jc w:val="center"/>
+            </w:pPr>
+            <w:r>
+              <w:rPr>
+                <w:rFonts w:ascii="Times New Roman" w:hAnsi="Times New Roman"/>
+                <w:b w:val="0"/>
+                <w:sz w:val="24"/>
+              </w:rPr>
+              <w:t>Datos previamente publicados</w:t>
+            </w:r>
+          </w:p>
+        </w:tc>
+        <w:tc>
+          <w:tcPr>
+            <w:tcW w:type="dxa" w:w="2395"/>
+            <w:vAlign w:val="center"/>
+            <w:tcMar>
+              <w:top w:w="72" w:type="dxa"/>
+              <w:left w:w="72" w:type="dxa"/>
+              <w:bottom w:w="72" w:type="dxa"/>
+              <w:right w:w="72" w:type="dxa"/>
+            </w:tcMar>
+          </w:tcPr>
+          <w:p>
+            <w:pPr>
+              <w:spacing w:line="240" w:lineRule="auto" w:before="0" w:after="0"/>
+              <w:ind w:left="0" w:firstLine="0"/>
+              <w:jc w:val="center"/>
+            </w:pPr>
+            <w:r>
+              <w:rPr>
+                <w:rFonts w:ascii="Times New Roman" w:hAnsi="Times New Roman"/>
+                <w:b w:val="0"/>
+                <w:sz w:val="24"/>
+              </w:rPr>
+              <w:t>Secundaria: datos publicados del sitio</w:t>
+            </w:r>
+          </w:p>
+        </w:tc>
+        <w:tc>
+          <w:tcPr>
+            <w:tcW w:type="dxa" w:w="2395"/>
+            <w:vAlign w:val="center"/>
+            <w:tcMar>
+              <w:top w:w="72" w:type="dxa"/>
+              <w:left w:w="72" w:type="dxa"/>
+              <w:bottom w:w="72" w:type="dxa"/>
+              <w:right w:w="72" w:type="dxa"/>
+            </w:tcMar>
+          </w:tcPr>
+          <w:p>
+            <w:pPr>
+              <w:spacing w:line="240" w:lineRule="auto" w:before="0" w:after="0"/>
+              <w:ind w:left="0" w:firstLine="0"/>
+              <w:jc w:val="center"/>
+            </w:pPr>
+            <w:r>
+              <w:rPr>
+                <w:rFonts w:ascii="Times New Roman" w:hAnsi="Times New Roman"/>
+                <w:b w:val="0"/>
+                <w:sz w:val="24"/>
+              </w:rPr>
+              <w:t>Publicado, usado directamente o anualizado</w:t>
+            </w:r>
+          </w:p>
+        </w:tc>
+        <w:tc>
+          <w:tcPr>
+            <w:tcW w:type="dxa" w:w="2395"/>
+            <w:vAlign w:val="center"/>
+            <w:tcMar>
+              <w:top w:w="72" w:type="dxa"/>
+              <w:left w:w="72" w:type="dxa"/>
+              <w:bottom w:w="72" w:type="dxa"/>
+              <w:right w:w="72" w:type="dxa"/>
+            </w:tcMar>
+          </w:tcPr>
+          <w:p>
+            <w:pPr>
+              <w:spacing w:line="240" w:lineRule="auto" w:before="0" w:after="0"/>
+              <w:ind w:left="0" w:firstLine="0"/>
+              <w:jc w:val="center"/>
+            </w:pPr>
+            <w:r>
+              <w:rPr>
+                <w:rFonts w:ascii="Times New Roman" w:hAnsi="Times New Roman"/>
+                <w:b w:val="0"/>
+                <w:sz w:val="24"/>
+              </w:rPr>
+              <w:t>Completar los parámetros operativos preexistentes de la lechería</w:t>
+            </w:r>
+          </w:p>
+        </w:tc>
+      </w:tr>
+      <w:tr>
+        <w:trPr>
+          <w:cantSplit/>
+        </w:trPr>
+        <w:tc>
+          <w:tcPr>
+            <w:tcW w:type="dxa" w:w="2395"/>
+            <w:vAlign w:val="center"/>
+            <w:tcMar>
+              <w:top w:w="72" w:type="dxa"/>
+              <w:left w:w="72" w:type="dxa"/>
+              <w:bottom w:w="72" w:type="dxa"/>
+              <w:right w:w="72" w:type="dxa"/>
+            </w:tcMar>
+          </w:tcPr>
+          <w:p>
+            <w:pPr>
+              <w:spacing w:line="240" w:lineRule="auto" w:before="0" w:after="0"/>
+              <w:ind w:left="0" w:firstLine="0"/>
+              <w:jc w:val="center"/>
+            </w:pPr>
+            <w:r>
+              <w:rPr>
+                <w:rFonts w:ascii="Times New Roman" w:hAnsi="Times New Roman"/>
+                <w:b w:val="0"/>
+                <w:sz w:val="24"/>
+              </w:rPr>
+              <w:t>Factores metodológicos oficiales y literatura científica</w:t>
+            </w:r>
+          </w:p>
+        </w:tc>
+        <w:tc>
+          <w:tcPr>
+            <w:tcW w:type="dxa" w:w="2395"/>
+            <w:vAlign w:val="center"/>
+            <w:tcMar>
+              <w:top w:w="72" w:type="dxa"/>
+              <w:left w:w="72" w:type="dxa"/>
+              <w:bottom w:w="72" w:type="dxa"/>
+              <w:right w:w="72" w:type="dxa"/>
+            </w:tcMar>
+          </w:tcPr>
+          <w:p>
+            <w:pPr>
+              <w:spacing w:line="240" w:lineRule="auto" w:before="0" w:after="0"/>
+              <w:ind w:left="0" w:firstLine="0"/>
+              <w:jc w:val="center"/>
+            </w:pPr>
+            <w:r>
+              <w:rPr>
+                <w:rFonts w:ascii="Times New Roman" w:hAnsi="Times New Roman"/>
+                <w:b w:val="0"/>
+                <w:sz w:val="24"/>
+              </w:rPr>
+              <w:t>Secundaria: guías oficiales y literatura científica</w:t>
+            </w:r>
+          </w:p>
+        </w:tc>
+        <w:tc>
+          <w:tcPr>
+            <w:tcW w:type="dxa" w:w="2395"/>
+            <w:vAlign w:val="center"/>
+            <w:tcMar>
+              <w:top w:w="72" w:type="dxa"/>
+              <w:left w:w="72" w:type="dxa"/>
+              <w:bottom w:w="72" w:type="dxa"/>
+              <w:right w:w="72" w:type="dxa"/>
+            </w:tcMar>
+          </w:tcPr>
+          <w:p>
+            <w:pPr>
+              <w:spacing w:line="240" w:lineRule="auto" w:before="0" w:after="0"/>
+              <w:ind w:left="0" w:firstLine="0"/>
+              <w:jc w:val="center"/>
+            </w:pPr>
+            <w:r>
+              <w:rPr>
+                <w:rFonts w:ascii="Times New Roman" w:hAnsi="Times New Roman"/>
+                <w:b w:val="0"/>
+                <w:sz w:val="24"/>
+              </w:rPr>
+              <w:t>Factor metodológico, de emisión o de caracterización</w:t>
+            </w:r>
+          </w:p>
+        </w:tc>
+        <w:tc>
+          <w:tcPr>
+            <w:tcW w:type="dxa" w:w="2395"/>
+            <w:vAlign w:val="center"/>
+            <w:tcMar>
+              <w:top w:w="72" w:type="dxa"/>
+              <w:left w:w="72" w:type="dxa"/>
+              <w:bottom w:w="72" w:type="dxa"/>
+              <w:right w:w="72" w:type="dxa"/>
+            </w:tcMar>
+          </w:tcPr>
+          <w:p>
+            <w:pPr>
+              <w:spacing w:line="240" w:lineRule="auto" w:before="0" w:after="0"/>
+              <w:ind w:left="0" w:firstLine="0"/>
+              <w:jc w:val="center"/>
+            </w:pPr>
+            <w:r>
+              <w:rPr>
+                <w:rFonts w:ascii="Times New Roman" w:hAnsi="Times New Roman"/>
+                <w:b w:val="0"/>
+                <w:sz w:val="24"/>
+              </w:rPr>
+              <w:t>Estimar emisiones, consumos agregados y categorías de impacto</w:t>
+            </w:r>
+          </w:p>
+        </w:tc>
+      </w:tr>
+      <w:tr>
+        <w:trPr>
+          <w:cantSplit/>
+        </w:trPr>
+        <w:tc>
+          <w:tcPr>
+            <w:tcW w:type="dxa" w:w="2395"/>
+            <w:vAlign w:val="center"/>
+            <w:tcMar>
+              <w:top w:w="72" w:type="dxa"/>
+              <w:left w:w="72" w:type="dxa"/>
+              <w:bottom w:w="72" w:type="dxa"/>
+              <w:right w:w="72" w:type="dxa"/>
+            </w:tcMar>
+          </w:tcPr>
+          <w:p>
+            <w:pPr>
+              <w:spacing w:line="240" w:lineRule="auto" w:before="0" w:after="0"/>
+              <w:ind w:left="0" w:firstLine="0"/>
+              <w:jc w:val="center"/>
+            </w:pPr>
+            <w:r>
+              <w:rPr>
+                <w:rFonts w:ascii="Times New Roman" w:hAnsi="Times New Roman"/>
+                <w:b w:val="0"/>
+                <w:sz w:val="24"/>
+              </w:rPr>
+              <w:t>Supuestos y convenciones del estudio</w:t>
+            </w:r>
+          </w:p>
+        </w:tc>
+        <w:tc>
+          <w:tcPr>
+            <w:tcW w:type="dxa" w:w="2395"/>
+            <w:vAlign w:val="center"/>
+            <w:tcMar>
+              <w:top w:w="72" w:type="dxa"/>
+              <w:left w:w="72" w:type="dxa"/>
+              <w:bottom w:w="72" w:type="dxa"/>
+              <w:right w:w="72" w:type="dxa"/>
+            </w:tcMar>
+          </w:tcPr>
+          <w:p>
+            <w:pPr>
+              <w:spacing w:line="240" w:lineRule="auto" w:before="0" w:after="0"/>
+              <w:ind w:left="0" w:firstLine="0"/>
+              <w:jc w:val="center"/>
+            </w:pPr>
+            <w:r>
+              <w:rPr>
+                <w:rFonts w:ascii="Times New Roman" w:hAnsi="Times New Roman"/>
+                <w:b w:val="0"/>
+                <w:sz w:val="24"/>
+              </w:rPr>
+              <w:t>Secundaria cuando existe base bibliográfica; no aplica para supuestos propios y convenciones</w:t>
+            </w:r>
+          </w:p>
+        </w:tc>
+        <w:tc>
+          <w:tcPr>
+            <w:tcW w:type="dxa" w:w="2395"/>
+            <w:vAlign w:val="center"/>
+            <w:tcMar>
+              <w:top w:w="72" w:type="dxa"/>
+              <w:left w:w="72" w:type="dxa"/>
+              <w:bottom w:w="72" w:type="dxa"/>
+              <w:right w:w="72" w:type="dxa"/>
+            </w:tcMar>
+          </w:tcPr>
+          <w:p>
+            <w:pPr>
+              <w:spacing w:line="240" w:lineRule="auto" w:before="0" w:after="0"/>
+              <w:ind w:left="0" w:firstLine="0"/>
+              <w:jc w:val="center"/>
+            </w:pPr>
+            <w:r>
+              <w:rPr>
+                <w:rFonts w:ascii="Times New Roman" w:hAnsi="Times New Roman"/>
+                <w:b w:val="0"/>
+                <w:sz w:val="24"/>
+              </w:rPr>
+              <w:t>Supuesto del estudio o convención de cálculo</w:t>
+            </w:r>
+          </w:p>
+        </w:tc>
+        <w:tc>
+          <w:tcPr>
+            <w:tcW w:type="dxa" w:w="2395"/>
+            <w:vAlign w:val="center"/>
+            <w:tcMar>
+              <w:top w:w="72" w:type="dxa"/>
+              <w:left w:w="72" w:type="dxa"/>
+              <w:bottom w:w="72" w:type="dxa"/>
+              <w:right w:w="72" w:type="dxa"/>
+            </w:tcMar>
+          </w:tcPr>
+          <w:p>
+            <w:pPr>
+              <w:spacing w:line="240" w:lineRule="auto" w:before="0" w:after="0"/>
+              <w:ind w:left="0" w:firstLine="0"/>
+              <w:jc w:val="center"/>
+            </w:pPr>
+            <w:r>
+              <w:rPr>
+                <w:rFonts w:ascii="Times New Roman" w:hAnsi="Times New Roman"/>
+                <w:b w:val="0"/>
+                <w:sz w:val="24"/>
+              </w:rPr>
+              <w:t>Explicitar elecciones numéricas y bases temporales del modelo</w:t>
+            </w:r>
+          </w:p>
+        </w:tc>
+      </w:tr>
+      <w:tr>
+        <w:trPr>
+          <w:cantSplit/>
+        </w:trPr>
+        <w:tc>
+          <w:tcPr>
+            <w:tcW w:type="dxa" w:w="2395"/>
+            <w:vAlign w:val="center"/>
+            <w:tcMar>
+              <w:top w:w="72" w:type="dxa"/>
+              <w:left w:w="72" w:type="dxa"/>
+              <w:bottom w:w="72" w:type="dxa"/>
+              <w:right w:w="72" w:type="dxa"/>
+            </w:tcMar>
+          </w:tcPr>
+          <w:p>
+            <w:pPr>
+              <w:spacing w:line="240" w:lineRule="auto" w:before="0" w:after="0"/>
+              <w:ind w:left="0" w:firstLine="0"/>
+              <w:jc w:val="center"/>
+            </w:pPr>
+            <w:r>
+              <w:rPr>
+                <w:rFonts w:ascii="Times New Roman" w:hAnsi="Times New Roman"/>
+                <w:b w:val="0"/>
+                <w:sz w:val="24"/>
+              </w:rPr>
+              <w:t>Datos calculados, integrados o propagados</w:t>
+            </w:r>
+          </w:p>
+        </w:tc>
+        <w:tc>
+          <w:tcPr>
+            <w:tcW w:type="dxa" w:w="2395"/>
+            <w:vAlign w:val="center"/>
+            <w:tcMar>
+              <w:top w:w="72" w:type="dxa"/>
+              <w:left w:w="72" w:type="dxa"/>
+              <w:bottom w:w="72" w:type="dxa"/>
+              <w:right w:w="72" w:type="dxa"/>
+            </w:tcMar>
+          </w:tcPr>
+          <w:p>
+            <w:pPr>
+              <w:spacing w:line="240" w:lineRule="auto" w:before="0" w:after="0"/>
+              <w:ind w:left="0" w:firstLine="0"/>
+              <w:jc w:val="center"/>
+            </w:pPr>
+            <w:r>
+              <w:rPr>
+                <w:rFonts w:ascii="Times New Roman" w:hAnsi="Times New Roman"/>
+                <w:b w:val="0"/>
+                <w:sz w:val="24"/>
+              </w:rPr>
+              <w:t>Heredada de entradas primarias y, cuando corresponde, secundarias</w:t>
+            </w:r>
+          </w:p>
+        </w:tc>
+        <w:tc>
+          <w:tcPr>
+            <w:tcW w:type="dxa" w:w="2395"/>
+            <w:vAlign w:val="center"/>
+            <w:tcMar>
+              <w:top w:w="72" w:type="dxa"/>
+              <w:left w:w="72" w:type="dxa"/>
+              <w:bottom w:w="72" w:type="dxa"/>
+              <w:right w:w="72" w:type="dxa"/>
+            </w:tcMar>
+          </w:tcPr>
+          <w:p>
+            <w:pPr>
+              <w:spacing w:line="240" w:lineRule="auto" w:before="0" w:after="0"/>
+              <w:ind w:left="0" w:firstLine="0"/>
+              <w:jc w:val="center"/>
+            </w:pPr>
+            <w:r>
+              <w:rPr>
+                <w:rFonts w:ascii="Times New Roman" w:hAnsi="Times New Roman"/>
+                <w:b w:val="0"/>
+                <w:sz w:val="24"/>
+              </w:rPr>
+              <w:t>Calculado, integrado estadísticamente o propagado entre etapas</w:t>
+            </w:r>
+          </w:p>
+        </w:tc>
+        <w:tc>
+          <w:tcPr>
+            <w:tcW w:type="dxa" w:w="2395"/>
+            <w:vAlign w:val="center"/>
+            <w:tcMar>
+              <w:top w:w="72" w:type="dxa"/>
+              <w:left w:w="72" w:type="dxa"/>
+              <w:bottom w:w="72" w:type="dxa"/>
+              <w:right w:w="72" w:type="dxa"/>
+            </w:tcMar>
+          </w:tcPr>
+          <w:p>
+            <w:pPr>
+              <w:spacing w:line="240" w:lineRule="auto" w:before="0" w:after="0"/>
+              <w:ind w:left="0" w:firstLine="0"/>
+              <w:jc w:val="center"/>
+            </w:pPr>
+            <w:r>
+              <w:rPr>
+                <w:rFonts w:ascii="Times New Roman" w:hAnsi="Times New Roman"/>
+                <w:b w:val="0"/>
+                <w:sz w:val="24"/>
+              </w:rPr>
+              <w:t>Construir flujos de actividad y mantener la continuidad de masa y nitrógeno</w:t>
+            </w:r>
+          </w:p>
+        </w:tc>
+      </w:tr>
+    </w:tbl>
+    <w:p>
+      <w:pPr>
+        <w:pStyle w:val="Heading2"/>
+      </w:pPr>
+      <w:r>
+        <w:rPr>
+          <w:rFonts w:ascii="Times New Roman" w:hAnsi="Times New Roman"/>
+          <w:color w:val="000000"/>
+        </w:rPr>
+        <w:t>4.5 Balance secuencial de nitrógeno y estimación de emisiones</w:t>
       </w:r>
     </w:p>
     <w:p>
@@ -4024,7 +4939,7 @@
           <w:rFonts w:ascii="Times New Roman" w:hAnsi="Times New Roman"/>
           <w:color w:val="000000"/>
         </w:rPr>
-        <w:t>4.4.1 Metano de las etapas de manejo</w:t>
+        <w:t>4.5.1 Metano de las etapas de manejo</w:t>
       </w:r>
     </w:p>
     <w:p>
@@ -4433,7 +5348,7 @@
           <w:rFonts w:ascii="Times New Roman" w:hAnsi="Times New Roman"/>
           <w:color w:val="000000"/>
         </w:rPr>
-        <w:t>4.4.2 Balance secuencial de N total y TAN</w:t>
+        <w:t>4.5.2 Balance secuencial de N total y TAN</w:t>
       </w:r>
     </w:p>
     <w:p>
@@ -7016,7 +7931,7 @@
           <w:rFonts w:ascii="Times New Roman" w:hAnsi="Times New Roman"/>
           <w:color w:val="000000"/>
         </w:rPr>
-        <w:t>4.4.3 Rutas de N hacia el suelo y aplicación</w:t>
+        <w:t>4.5.3 Rutas de N hacia el suelo y aplicación</w:t>
       </w:r>
     </w:p>
     <w:p>
@@ -8891,7 +9806,7 @@
           <w:rFonts w:ascii="Times New Roman" w:hAnsi="Times New Roman"/>
           <w:color w:val="000000"/>
         </w:rPr>
-        <w:t>4.5 Evaluación de impactos y consumos operativos</w:t>
+        <w:t>4.6 Evaluación de impactos y consumos operativos</w:t>
       </w:r>
     </w:p>
     <w:p>
@@ -9472,7 +10387,7 @@
           <w:rFonts w:ascii="Times New Roman" w:hAnsi="Times New Roman"/>
           <w:sz w:val="24"/>
         </w:rPr>
-        <w:t>La Tabla 3 documenta los factores visibles principales y la Figura 2 muestra la escala operacional de los flujos.</w:t>
+        <w:t>La Tabla 4 documenta los factores visibles principales y la Figura 2 muestra la escala operacional de los flujos.</w:t>
       </w:r>
     </w:p>
     <w:p>
@@ -9486,7 +10401,7 @@
           <w:b/>
           <w:color w:val="000000"/>
         </w:rPr>
-        <w:t>Tabla 3</w:t>
+        <w:t>Tabla 4</w:t>
       </w:r>
     </w:p>
     <w:p>
@@ -11555,7 +12470,7 @@
           <w:rFonts w:ascii="Times New Roman" w:hAnsi="Times New Roman"/>
           <w:color w:val="000000"/>
         </w:rPr>
-        <w:t>4.6 Supuestos, consistencia y limitaciones</w:t>
+        <w:t>4.7 Supuestos, consistencia y limitaciones</w:t>
       </w:r>
     </w:p>
     <w:p>
@@ -11785,7 +12700,7 @@
           <w:rFonts w:ascii="Times New Roman" w:hAnsi="Times New Roman"/>
           <w:sz w:val="24"/>
         </w:rPr>
-        <w:t>La Tabla 4 resume las emisiones del manejo y la Figura 4 muestra la distribución de CH₄. Las contribuciones operativas de electricidad y diésel se incorporaron en el indicador de cambio climático, manteniendo separada su trazabilidad.</w:t>
+        <w:t>La Tabla 5 resume las emisiones del manejo y la Figura 4 muestra la distribución de CH₄. Las contribuciones operativas de electricidad y diésel se incorporaron en el indicador de cambio climático, manteniendo separada su trazabilidad.</w:t>
       </w:r>
     </w:p>
     <w:p>
@@ -11799,7 +12714,7 @@
           <w:b/>
           <w:color w:val="000000"/>
         </w:rPr>
-        <w:t>Tabla 4</w:t>
+        <w:t>Tabla 5</w:t>
       </w:r>
     </w:p>
     <w:p>
@@ -12424,7 +13339,7 @@
           <w:rFonts w:ascii="Times New Roman" w:hAnsi="Times New Roman"/>
           <w:sz w:val="24"/>
         </w:rPr>
-        <w:t>La Tabla 5 presenta los impactos por etapa. En el Escenario A, A3: Almacenamiento de aguas verdes aportó 53,93 % del cambio climático; en el Escenario B, B1: Almacenamiento de purines aportó 81,99 %. Las Figuras 5 y 6 muestran la distribución por etapa de cambio climático y eutrofización terrestre.</w:t>
+        <w:t>La Tabla 6 presenta los impactos por etapa. En el Escenario A, A3: Almacenamiento de aguas verdes aportó 53,93 % del cambio climático; en el Escenario B, B1: Almacenamiento de purines aportó 81,99 %. Las Figuras 5 y 6 muestran la distribución por etapa de cambio climático y eutrofización terrestre.</w:t>
       </w:r>
     </w:p>
     <w:p>
@@ -12438,7 +13353,7 @@
           <w:b/>
           <w:color w:val="000000"/>
         </w:rPr>
-        <w:t>Tabla 5</w:t>
+        <w:t>Tabla 6</w:t>
       </w:r>
     </w:p>
     <w:p>
@@ -13623,7 +14538,7 @@
           <w:rFonts w:ascii="Times New Roman" w:hAnsi="Times New Roman"/>
           <w:sz w:val="24"/>
         </w:rPr>
-        <w:t>La Tabla 6 presenta la magnitud anual y la Tabla 7 muestra los indicadores por unidad funcional. La Tabla 8 y la Figura 7 presentan la comparación entre escenarios bajo la misma base funcional.</w:t>
+        <w:t>La Tabla 7 presenta la magnitud anual y la Tabla 8 muestra los indicadores por unidad funcional. La Tabla 9 y la Figura 7 presentan la comparación entre escenarios bajo la misma base funcional.</w:t>
       </w:r>
     </w:p>
     <w:p>
@@ -13637,7 +14552,7 @@
           <w:b/>
           <w:color w:val="000000"/>
         </w:rPr>
-        <w:t>Tabla 6</w:t>
+        <w:t>Tabla 7</w:t>
       </w:r>
     </w:p>
     <w:p>
@@ -14018,7 +14933,7 @@
           <w:b/>
           <w:color w:val="000000"/>
         </w:rPr>
-        <w:t>Tabla 7</w:t>
+        <w:t>Tabla 8</w:t>
       </w:r>
     </w:p>
     <w:p>
@@ -14399,7 +15314,7 @@
           <w:b/>
           <w:color w:val="000000"/>
         </w:rPr>
-        <w:t>Tabla 8</w:t>
+        <w:t>Tabla 9</w:t>
       </w:r>
     </w:p>
     <w:p>
@@ -15191,7 +16106,7 @@
           <w:rFonts w:ascii="Times New Roman" w:hAnsi="Times New Roman"/>
           <w:sz w:val="24"/>
         </w:rPr>
-        <w:t>La Tabla 9 contrasta las estimaciones oficiales de A2: Lombricompostaje con Jjagwe et al. (2019) sobre una base material armonizada. El contraste apoya la interpretación, pero no sustituye el inventario oficial ni constituye una validación formal del modelo.</w:t>
+        <w:t>La Tabla 10 contrasta las estimaciones oficiales de A2: Lombricompostaje con Jjagwe et al. (2019) sobre una base material armonizada. El contraste apoya la interpretación, pero no sustituye el inventario oficial ni constituye una validación formal del modelo.</w:t>
       </w:r>
     </w:p>
     <w:p>
@@ -15205,7 +16120,7 @@
           <w:b/>
           <w:color w:val="000000"/>
         </w:rPr>
-        <w:t>Tabla 9</w:t>
+        <w:t>Tabla 10</w:t>
       </w:r>
     </w:p>
     <w:p>
@@ -16352,7 +17267,7 @@
           <w:rFonts w:ascii="Times New Roman" w:hAnsi="Times New Roman"/>
           <w:sz w:val="24"/>
         </w:rPr>
-        <w:t>La comprobación disponible para A2 varió el factor de N₂-N respecto al TAN entre 0 y 0,30. Frente al caso central de 0,30, el cambio máximo observado en el N total remanente equivalió a 11,54 % del N total de entrada. La Tabla 10 documenta esta comprobación de aseguramiento de la calidad; no constituye un análisis de sensibilidad completo de los impactos.</w:t>
+        <w:t>La comprobación disponible para A2 varió el factor de N₂-N respecto al TAN entre 0 y 0,30. Frente al caso central de 0,30, el cambio máximo observado en el N total remanente equivalió a 11,54 % del N total de entrada. La Tabla 11 documenta esta comprobación de aseguramiento de la calidad; no constituye un análisis de sensibilidad completo de los impactos.</w:t>
       </w:r>
     </w:p>
     <w:p>
@@ -16394,7 +17309,7 @@
           <w:b/>
           <w:color w:val="000000"/>
         </w:rPr>
-        <w:t>Tabla 10</w:t>
+        <w:t>Tabla 11</w:t>
       </w:r>
     </w:p>
     <w:p>
@@ -17774,7 +18689,7 @@
           <w:rFonts w:ascii="Times New Roman" w:hAnsi="Times New Roman"/>
           <w:sz w:val="24"/>
         </w:rPr>
-        <w:t>La Tabla 11 muestra cómo la metodología, los resultados y las conclusiones provisionales responden a los objetivos invariantes del estudio.</w:t>
+        <w:t>La Tabla 12 muestra cómo la metodología, los resultados y las conclusiones provisionales responden a los objetivos invariantes del estudio.</w:t>
       </w:r>
     </w:p>
     <w:p>
@@ -17788,7 +18703,7 @@
           <w:b/>
           <w:color w:val="000000"/>
         </w:rPr>
-        <w:t>Tabla 11</w:t>
+        <w:t>Tabla 12</w:t>
       </w:r>
     </w:p>
     <w:p>
@@ -18266,6 +19181,3628 @@
                 <w:sz w:val="24"/>
               </w:rPr>
               <w:t>Conclusiones provisionales 2 a 4</w:t>
+            </w:r>
+          </w:p>
+        </w:tc>
+      </w:tr>
+    </w:tbl>
+    <w:p>
+      <w:pPr>
+        <w:spacing w:line="240" w:lineRule="auto" w:before="0" w:after="0"/>
+        <w:ind w:left="100" w:firstLine="719"/>
+        <w:jc w:val="both"/>
+      </w:pPr>
+      <w:r>
+        <w:rPr>
+          <w:rFonts w:ascii="Times New Roman" w:hAnsi="Times New Roman"/>
+          <w:sz w:val="24"/>
+        </w:rPr>
+        <w:br w:type="page"/>
+      </w:r>
+    </w:p>
+    <w:p>
+      <w:pPr>
+        <w:pStyle w:val="Heading1"/>
+      </w:pPr>
+      <w:r>
+        <w:rPr>
+          <w:rFonts w:ascii="Times New Roman" w:hAnsi="Times New Roman"/>
+          <w:color w:val="000000"/>
+        </w:rPr>
+        <w:t>Apéndice B. Matriz detallada de procedencia de los datos del inventario</w:t>
+      </w:r>
+    </w:p>
+    <w:p>
+      <w:pPr>
+        <w:spacing w:line="240" w:lineRule="auto" w:before="0" w:after="0"/>
+        <w:ind w:left="100" w:firstLine="719"/>
+        <w:jc w:val="both"/>
+      </w:pPr>
+      <w:r>
+        <w:rPr>
+          <w:rFonts w:ascii="Times New Roman" w:hAnsi="Times New Roman"/>
+          <w:sz w:val="24"/>
+        </w:rPr>
+        <w:t>La Tabla 13 conserva la trazabilidad detallada por familia sin convertir los cálculos derivados en una nueva categoría de fuente.</w:t>
+      </w:r>
+    </w:p>
+    <w:p>
+      <w:pPr>
+        <w:pStyle w:val="Rótuloacadémico"/>
+        <w:keepNext/>
+      </w:pPr>
+      <w:r>
+        <w:rPr>
+          <w:rFonts w:ascii="Times New Roman" w:hAnsi="Times New Roman"/>
+          <w:b/>
+          <w:color w:val="000000"/>
+        </w:rPr>
+        <w:t>Tabla 13</w:t>
+      </w:r>
+    </w:p>
+    <w:p>
+      <w:pPr>
+        <w:pStyle w:val="Descripciónacadémica"/>
+        <w:keepNext/>
+      </w:pPr>
+      <w:r>
+        <w:rPr>
+          <w:rFonts w:ascii="Times New Roman" w:hAnsi="Times New Roman"/>
+          <w:i/>
+          <w:color w:val="000000"/>
+        </w:rPr>
+        <w:t>Matriz detallada de procedencia y tratamiento de los datos del inventario.</w:t>
+      </w:r>
+    </w:p>
+    <w:tbl>
+      <w:tblPr>
+        <w:tblW w:type="auto" w:w="0"/>
+        <w:jc w:val="center"/>
+        <w:tblLook w:firstColumn="1" w:firstRow="1" w:lastColumn="0" w:lastRow="0" w:noHBand="0" w:noVBand="1" w:val="04A0"/>
+      </w:tblPr>
+      <w:tblGrid>
+        <w:gridCol w:w="1197"/>
+        <w:gridCol w:w="1197"/>
+        <w:gridCol w:w="1197"/>
+        <w:gridCol w:w="1197"/>
+        <w:gridCol w:w="1197"/>
+        <w:gridCol w:w="1197"/>
+        <w:gridCol w:w="1197"/>
+        <w:gridCol w:w="1197"/>
+      </w:tblGrid>
+      <w:tr>
+        <w:trPr>
+          <w:cantSplit/>
+          <w:tblHeader w:val="true"/>
+        </w:trPr>
+        <w:tc>
+          <w:tcPr>
+            <w:tcW w:type="dxa" w:w="1197"/>
+            <w:vAlign w:val="center"/>
+            <w:tcMar>
+              <w:top w:w="72" w:type="dxa"/>
+              <w:left w:w="72" w:type="dxa"/>
+              <w:bottom w:w="72" w:type="dxa"/>
+              <w:right w:w="72" w:type="dxa"/>
+            </w:tcMar>
+          </w:tcPr>
+          <w:p>
+            <w:pPr>
+              <w:spacing w:line="240" w:lineRule="auto" w:before="0" w:after="0"/>
+              <w:ind w:left="0" w:firstLine="0"/>
+              <w:jc w:val="center"/>
+            </w:pPr>
+            <w:r>
+              <w:rPr>
+                <w:rFonts w:ascii="Times New Roman" w:hAnsi="Times New Roman"/>
+                <w:b/>
+                <w:sz w:val="24"/>
+              </w:rPr>
+              <w:t>Variable o familia de variables</w:t>
+            </w:r>
+          </w:p>
+        </w:tc>
+        <w:tc>
+          <w:tcPr>
+            <w:tcW w:type="dxa" w:w="1197"/>
+            <w:vAlign w:val="center"/>
+            <w:tcMar>
+              <w:top w:w="72" w:type="dxa"/>
+              <w:left w:w="72" w:type="dxa"/>
+              <w:bottom w:w="72" w:type="dxa"/>
+              <w:right w:w="72" w:type="dxa"/>
+            </w:tcMar>
+          </w:tcPr>
+          <w:p>
+            <w:pPr>
+              <w:spacing w:line="240" w:lineRule="auto" w:before="0" w:after="0"/>
+              <w:ind w:left="0" w:firstLine="0"/>
+              <w:jc w:val="center"/>
+            </w:pPr>
+            <w:r>
+              <w:rPr>
+                <w:rFonts w:ascii="Times New Roman" w:hAnsi="Times New Roman"/>
+                <w:b/>
+                <w:sz w:val="24"/>
+              </w:rPr>
+              <w:t>Etapa(s) donde se usa</w:t>
+            </w:r>
+          </w:p>
+        </w:tc>
+        <w:tc>
+          <w:tcPr>
+            <w:tcW w:type="dxa" w:w="1197"/>
+            <w:vAlign w:val="center"/>
+            <w:tcMar>
+              <w:top w:w="72" w:type="dxa"/>
+              <w:left w:w="72" w:type="dxa"/>
+              <w:bottom w:w="72" w:type="dxa"/>
+              <w:right w:w="72" w:type="dxa"/>
+            </w:tcMar>
+          </w:tcPr>
+          <w:p>
+            <w:pPr>
+              <w:spacing w:line="240" w:lineRule="auto" w:before="0" w:after="0"/>
+              <w:ind w:left="0" w:firstLine="0"/>
+              <w:jc w:val="center"/>
+            </w:pPr>
+            <w:r>
+              <w:rPr>
+                <w:rFonts w:ascii="Times New Roman" w:hAnsi="Times New Roman"/>
+                <w:b/>
+                <w:sz w:val="24"/>
+              </w:rPr>
+              <w:t>Valor o tipo de información</w:t>
+            </w:r>
+          </w:p>
+        </w:tc>
+        <w:tc>
+          <w:tcPr>
+            <w:tcW w:type="dxa" w:w="1197"/>
+            <w:vAlign w:val="center"/>
+            <w:tcMar>
+              <w:top w:w="72" w:type="dxa"/>
+              <w:left w:w="72" w:type="dxa"/>
+              <w:bottom w:w="72" w:type="dxa"/>
+              <w:right w:w="72" w:type="dxa"/>
+            </w:tcMar>
+          </w:tcPr>
+          <w:p>
+            <w:pPr>
+              <w:spacing w:line="240" w:lineRule="auto" w:before="0" w:after="0"/>
+              <w:ind w:left="0" w:firstLine="0"/>
+              <w:jc w:val="center"/>
+            </w:pPr>
+            <w:r>
+              <w:rPr>
+                <w:rFonts w:ascii="Times New Roman" w:hAnsi="Times New Roman"/>
+                <w:b/>
+                <w:sz w:val="24"/>
+              </w:rPr>
+              <w:t>Procedencia académica</w:t>
+            </w:r>
+          </w:p>
+        </w:tc>
+        <w:tc>
+          <w:tcPr>
+            <w:tcW w:type="dxa" w:w="1197"/>
+            <w:vAlign w:val="center"/>
+            <w:tcMar>
+              <w:top w:w="72" w:type="dxa"/>
+              <w:left w:w="72" w:type="dxa"/>
+              <w:bottom w:w="72" w:type="dxa"/>
+              <w:right w:w="72" w:type="dxa"/>
+            </w:tcMar>
+          </w:tcPr>
+          <w:p>
+            <w:pPr>
+              <w:spacing w:line="240" w:lineRule="auto" w:before="0" w:after="0"/>
+              <w:ind w:left="0" w:firstLine="0"/>
+              <w:jc w:val="center"/>
+            </w:pPr>
+            <w:r>
+              <w:rPr>
+                <w:rFonts w:ascii="Times New Roman" w:hAnsi="Times New Roman"/>
+                <w:b/>
+                <w:sz w:val="24"/>
+              </w:rPr>
+              <w:t>Subtipo de procedencia</w:t>
+            </w:r>
+          </w:p>
+        </w:tc>
+        <w:tc>
+          <w:tcPr>
+            <w:tcW w:type="dxa" w:w="1197"/>
+            <w:vAlign w:val="center"/>
+            <w:tcMar>
+              <w:top w:w="72" w:type="dxa"/>
+              <w:left w:w="72" w:type="dxa"/>
+              <w:bottom w:w="72" w:type="dxa"/>
+              <w:right w:w="72" w:type="dxa"/>
+            </w:tcMar>
+          </w:tcPr>
+          <w:p>
+            <w:pPr>
+              <w:spacing w:line="240" w:lineRule="auto" w:before="0" w:after="0"/>
+              <w:ind w:left="0" w:firstLine="0"/>
+              <w:jc w:val="center"/>
+            </w:pPr>
+            <w:r>
+              <w:rPr>
+                <w:rFonts w:ascii="Times New Roman" w:hAnsi="Times New Roman"/>
+                <w:b/>
+                <w:sz w:val="24"/>
+              </w:rPr>
+              <w:t>Tratamiento dentro del TFG</w:t>
+            </w:r>
+          </w:p>
+        </w:tc>
+        <w:tc>
+          <w:tcPr>
+            <w:tcW w:type="dxa" w:w="1197"/>
+            <w:vAlign w:val="center"/>
+            <w:tcMar>
+              <w:top w:w="72" w:type="dxa"/>
+              <w:left w:w="72" w:type="dxa"/>
+              <w:bottom w:w="72" w:type="dxa"/>
+              <w:right w:w="72" w:type="dxa"/>
+            </w:tcMar>
+          </w:tcPr>
+          <w:p>
+            <w:pPr>
+              <w:spacing w:line="240" w:lineRule="auto" w:before="0" w:after="0"/>
+              <w:ind w:left="0" w:firstLine="0"/>
+              <w:jc w:val="center"/>
+            </w:pPr>
+            <w:r>
+              <w:rPr>
+                <w:rFonts w:ascii="Times New Roman" w:hAnsi="Times New Roman"/>
+                <w:b/>
+                <w:sz w:val="24"/>
+              </w:rPr>
+              <w:t>Fuente concreta</w:t>
+            </w:r>
+          </w:p>
+        </w:tc>
+        <w:tc>
+          <w:tcPr>
+            <w:tcW w:type="dxa" w:w="1197"/>
+            <w:vAlign w:val="center"/>
+            <w:tcMar>
+              <w:top w:w="72" w:type="dxa"/>
+              <w:left w:w="72" w:type="dxa"/>
+              <w:bottom w:w="72" w:type="dxa"/>
+              <w:right w:w="72" w:type="dxa"/>
+            </w:tcMar>
+          </w:tcPr>
+          <w:p>
+            <w:pPr>
+              <w:spacing w:line="240" w:lineRule="auto" w:before="0" w:after="0"/>
+              <w:ind w:left="0" w:firstLine="0"/>
+              <w:jc w:val="center"/>
+            </w:pPr>
+            <w:r>
+              <w:rPr>
+                <w:rFonts w:ascii="Times New Roman" w:hAnsi="Times New Roman"/>
+                <w:b/>
+                <w:sz w:val="24"/>
+              </w:rPr>
+              <w:t>Uso metodológico</w:t>
+            </w:r>
+          </w:p>
+        </w:tc>
+      </w:tr>
+      <w:tr>
+        <w:trPr>
+          <w:cantSplit/>
+        </w:trPr>
+        <w:tc>
+          <w:tcPr>
+            <w:tcW w:type="dxa" w:w="1197"/>
+            <w:vAlign w:val="center"/>
+            <w:tcMar>
+              <w:top w:w="72" w:type="dxa"/>
+              <w:left w:w="72" w:type="dxa"/>
+              <w:bottom w:w="72" w:type="dxa"/>
+              <w:right w:w="72" w:type="dxa"/>
+            </w:tcMar>
+          </w:tcPr>
+          <w:p>
+            <w:pPr>
+              <w:spacing w:line="240" w:lineRule="auto" w:before="0" w:after="0"/>
+              <w:ind w:left="0" w:firstLine="0"/>
+              <w:jc w:val="center"/>
+            </w:pPr>
+            <w:r>
+              <w:rPr>
+                <w:rFonts w:ascii="Times New Roman" w:hAnsi="Times New Roman"/>
+                <w:b w:val="0"/>
+                <w:sz w:val="24"/>
+              </w:rPr>
+              <w:t>Caracterización fisicoquímica de los materiales del estudio</w:t>
+            </w:r>
+          </w:p>
+        </w:tc>
+        <w:tc>
+          <w:tcPr>
+            <w:tcW w:type="dxa" w:w="1197"/>
+            <w:vAlign w:val="center"/>
+            <w:tcMar>
+              <w:top w:w="72" w:type="dxa"/>
+              <w:left w:w="72" w:type="dxa"/>
+              <w:bottom w:w="72" w:type="dxa"/>
+              <w:right w:w="72" w:type="dxa"/>
+            </w:tcMar>
+          </w:tcPr>
+          <w:p>
+            <w:pPr>
+              <w:spacing w:line="240" w:lineRule="auto" w:before="0" w:after="0"/>
+              <w:ind w:left="0" w:firstLine="0"/>
+              <w:jc w:val="center"/>
+            </w:pPr>
+            <w:r>
+              <w:rPr>
+                <w:rFonts w:ascii="Times New Roman" w:hAnsi="Times New Roman"/>
+                <w:b w:val="0"/>
+                <w:sz w:val="24"/>
+              </w:rPr>
+              <w:t>A1, A2, A3, A4, B1 y B2</w:t>
+            </w:r>
+          </w:p>
+        </w:tc>
+        <w:tc>
+          <w:tcPr>
+            <w:tcW w:type="dxa" w:w="1197"/>
+            <w:vAlign w:val="center"/>
+            <w:tcMar>
+              <w:top w:w="72" w:type="dxa"/>
+              <w:left w:w="72" w:type="dxa"/>
+              <w:bottom w:w="72" w:type="dxa"/>
+              <w:right w:w="72" w:type="dxa"/>
+            </w:tcMar>
+          </w:tcPr>
+          <w:p>
+            <w:pPr>
+              <w:spacing w:line="240" w:lineRule="auto" w:before="0" w:after="0"/>
+              <w:ind w:left="0" w:firstLine="0"/>
+              <w:jc w:val="center"/>
+            </w:pPr>
+            <w:r>
+              <w:rPr>
+                <w:rFonts w:ascii="Times New Roman" w:hAnsi="Times New Roman"/>
+                <w:b w:val="0"/>
+                <w:sz w:val="24"/>
+              </w:rPr>
+              <w:t>8 variables integradas en 4 tipos de material; corrida M1–M2</w:t>
+            </w:r>
+          </w:p>
+        </w:tc>
+        <w:tc>
+          <w:tcPr>
+            <w:tcW w:type="dxa" w:w="1197"/>
+            <w:vAlign w:val="center"/>
+            <w:tcMar>
+              <w:top w:w="72" w:type="dxa"/>
+              <w:left w:w="72" w:type="dxa"/>
+              <w:bottom w:w="72" w:type="dxa"/>
+              <w:right w:w="72" w:type="dxa"/>
+            </w:tcMar>
+          </w:tcPr>
+          <w:p>
+            <w:pPr>
+              <w:spacing w:line="240" w:lineRule="auto" w:before="0" w:after="0"/>
+              <w:ind w:left="0" w:firstLine="0"/>
+              <w:jc w:val="center"/>
+            </w:pPr>
+            <w:r>
+              <w:rPr>
+                <w:rFonts w:ascii="Times New Roman" w:hAnsi="Times New Roman"/>
+                <w:b w:val="0"/>
+                <w:sz w:val="24"/>
+              </w:rPr>
+              <w:t>Primaria</w:t>
+            </w:r>
+          </w:p>
+        </w:tc>
+        <w:tc>
+          <w:tcPr>
+            <w:tcW w:type="dxa" w:w="1197"/>
+            <w:vAlign w:val="center"/>
+            <w:tcMar>
+              <w:top w:w="72" w:type="dxa"/>
+              <w:left w:w="72" w:type="dxa"/>
+              <w:bottom w:w="72" w:type="dxa"/>
+              <w:right w:w="72" w:type="dxa"/>
+            </w:tcMar>
+          </w:tcPr>
+          <w:p>
+            <w:pPr>
+              <w:spacing w:line="240" w:lineRule="auto" w:before="0" w:after="0"/>
+              <w:ind w:left="0" w:firstLine="0"/>
+              <w:jc w:val="center"/>
+            </w:pPr>
+            <w:r>
+              <w:rPr>
+                <w:rFonts w:ascii="Times New Roman" w:hAnsi="Times New Roman"/>
+                <w:b w:val="0"/>
+                <w:sz w:val="24"/>
+              </w:rPr>
+              <w:t>Medición experimental del TFG y servicio analítico externo sobre sus muestras</w:t>
+            </w:r>
+          </w:p>
+        </w:tc>
+        <w:tc>
+          <w:tcPr>
+            <w:tcW w:type="dxa" w:w="1197"/>
+            <w:vAlign w:val="center"/>
+            <w:tcMar>
+              <w:top w:w="72" w:type="dxa"/>
+              <w:left w:w="72" w:type="dxa"/>
+              <w:bottom w:w="72" w:type="dxa"/>
+              <w:right w:w="72" w:type="dxa"/>
+            </w:tcMar>
+          </w:tcPr>
+          <w:p>
+            <w:pPr>
+              <w:spacing w:line="240" w:lineRule="auto" w:before="0" w:after="0"/>
+              <w:ind w:left="0" w:firstLine="0"/>
+              <w:jc w:val="center"/>
+            </w:pPr>
+            <w:r>
+              <w:rPr>
+                <w:rFonts w:ascii="Times New Roman" w:hAnsi="Times New Roman"/>
+                <w:b w:val="0"/>
+                <w:sz w:val="24"/>
+              </w:rPr>
+              <w:t>Medido; resumido por muestra y jornada; integrado estadísticamente cuando es compatible</w:t>
+            </w:r>
+          </w:p>
+        </w:tc>
+        <w:tc>
+          <w:tcPr>
+            <w:tcW w:type="dxa" w:w="1197"/>
+            <w:vAlign w:val="center"/>
+            <w:tcMar>
+              <w:top w:w="72" w:type="dxa"/>
+              <w:left w:w="72" w:type="dxa"/>
+              <w:bottom w:w="72" w:type="dxa"/>
+              <w:right w:w="72" w:type="dxa"/>
+            </w:tcMar>
+          </w:tcPr>
+          <w:p>
+            <w:pPr>
+              <w:spacing w:line="240" w:lineRule="auto" w:before="0" w:after="0"/>
+              <w:ind w:left="0" w:firstLine="0"/>
+              <w:jc w:val="center"/>
+            </w:pPr>
+            <w:r>
+              <w:rPr>
+                <w:rFonts w:ascii="Times New Roman" w:hAnsi="Times New Roman"/>
+                <w:b w:val="0"/>
+                <w:sz w:val="24"/>
+              </w:rPr>
+              <w:t>Muestreo del investigador, Bioenergía y reportes CIA/LASA de las muestras del TFG</w:t>
+            </w:r>
+          </w:p>
+        </w:tc>
+        <w:tc>
+          <w:tcPr>
+            <w:tcW w:type="dxa" w:w="1197"/>
+            <w:vAlign w:val="center"/>
+            <w:tcMar>
+              <w:top w:w="72" w:type="dxa"/>
+              <w:left w:w="72" w:type="dxa"/>
+              <w:bottom w:w="72" w:type="dxa"/>
+              <w:right w:w="72" w:type="dxa"/>
+            </w:tcMar>
+          </w:tcPr>
+          <w:p>
+            <w:pPr>
+              <w:spacing w:line="240" w:lineRule="auto" w:before="0" w:after="0"/>
+              <w:ind w:left="0" w:firstLine="0"/>
+              <w:jc w:val="center"/>
+            </w:pPr>
+            <w:r>
+              <w:rPr>
+                <w:rFonts w:ascii="Times New Roman" w:hAnsi="Times New Roman"/>
+                <w:b w:val="0"/>
+                <w:sz w:val="24"/>
+              </w:rPr>
+              <w:t>Caracterización, parámetros experimentales y referencias de contraste del inventario</w:t>
+            </w:r>
+          </w:p>
+        </w:tc>
+      </w:tr>
+      <w:tr>
+        <w:trPr>
+          <w:cantSplit/>
+        </w:trPr>
+        <w:tc>
+          <w:tcPr>
+            <w:tcW w:type="dxa" w:w="1197"/>
+            <w:vAlign w:val="center"/>
+            <w:tcMar>
+              <w:top w:w="72" w:type="dxa"/>
+              <w:left w:w="72" w:type="dxa"/>
+              <w:bottom w:w="72" w:type="dxa"/>
+              <w:right w:w="72" w:type="dxa"/>
+            </w:tcMar>
+          </w:tcPr>
+          <w:p>
+            <w:pPr>
+              <w:spacing w:line="240" w:lineRule="auto" w:before="0" w:after="0"/>
+              <w:ind w:left="0" w:firstLine="0"/>
+              <w:jc w:val="center"/>
+            </w:pPr>
+            <w:r>
+              <w:rPr>
+                <w:rFonts w:ascii="Times New Roman" w:hAnsi="Times New Roman"/>
+                <w:b w:val="0"/>
+                <w:sz w:val="24"/>
+              </w:rPr>
+              <w:t>Tiempos, frecuencias y operación observada de la finca</w:t>
+            </w:r>
+          </w:p>
+        </w:tc>
+        <w:tc>
+          <w:tcPr>
+            <w:tcW w:type="dxa" w:w="1197"/>
+            <w:vAlign w:val="center"/>
+            <w:tcMar>
+              <w:top w:w="72" w:type="dxa"/>
+              <w:left w:w="72" w:type="dxa"/>
+              <w:bottom w:w="72" w:type="dxa"/>
+              <w:right w:w="72" w:type="dxa"/>
+            </w:tcMar>
+          </w:tcPr>
+          <w:p>
+            <w:pPr>
+              <w:spacing w:line="240" w:lineRule="auto" w:before="0" w:after="0"/>
+              <w:ind w:left="0" w:firstLine="0"/>
+              <w:jc w:val="center"/>
+            </w:pPr>
+            <w:r>
+              <w:rPr>
+                <w:rFonts w:ascii="Times New Roman" w:hAnsi="Times New Roman"/>
+                <w:b w:val="0"/>
+                <w:sz w:val="24"/>
+              </w:rPr>
+              <w:t>A3, A4, B1, B2</w:t>
+            </w:r>
+          </w:p>
+        </w:tc>
+        <w:tc>
+          <w:tcPr>
+            <w:tcW w:type="dxa" w:w="1197"/>
+            <w:vAlign w:val="center"/>
+            <w:tcMar>
+              <w:top w:w="72" w:type="dxa"/>
+              <w:left w:w="72" w:type="dxa"/>
+              <w:bottom w:w="72" w:type="dxa"/>
+              <w:right w:w="72" w:type="dxa"/>
+            </w:tcMar>
+          </w:tcPr>
+          <w:p>
+            <w:pPr>
+              <w:spacing w:line="240" w:lineRule="auto" w:before="0" w:after="0"/>
+              <w:ind w:left="0" w:firstLine="0"/>
+              <w:jc w:val="center"/>
+            </w:pPr>
+            <w:r>
+              <w:rPr>
+                <w:rFonts w:ascii="Times New Roman" w:hAnsi="Times New Roman"/>
+                <w:b w:val="0"/>
+                <w:sz w:val="24"/>
+              </w:rPr>
+              <w:t>5 parámetros operativos de campo</w:t>
+            </w:r>
+          </w:p>
+        </w:tc>
+        <w:tc>
+          <w:tcPr>
+            <w:tcW w:type="dxa" w:w="1197"/>
+            <w:vAlign w:val="center"/>
+            <w:tcMar>
+              <w:top w:w="72" w:type="dxa"/>
+              <w:left w:w="72" w:type="dxa"/>
+              <w:bottom w:w="72" w:type="dxa"/>
+              <w:right w:w="72" w:type="dxa"/>
+            </w:tcMar>
+          </w:tcPr>
+          <w:p>
+            <w:pPr>
+              <w:spacing w:line="240" w:lineRule="auto" w:before="0" w:after="0"/>
+              <w:ind w:left="0" w:firstLine="0"/>
+              <w:jc w:val="center"/>
+            </w:pPr>
+            <w:r>
+              <w:rPr>
+                <w:rFonts w:ascii="Times New Roman" w:hAnsi="Times New Roman"/>
+                <w:b w:val="0"/>
+                <w:sz w:val="24"/>
+              </w:rPr>
+              <w:t>Primaria</w:t>
+            </w:r>
+          </w:p>
+        </w:tc>
+        <w:tc>
+          <w:tcPr>
+            <w:tcW w:type="dxa" w:w="1197"/>
+            <w:vAlign w:val="center"/>
+            <w:tcMar>
+              <w:top w:w="72" w:type="dxa"/>
+              <w:left w:w="72" w:type="dxa"/>
+              <w:bottom w:w="72" w:type="dxa"/>
+              <w:right w:w="72" w:type="dxa"/>
+            </w:tcMar>
+          </w:tcPr>
+          <w:p>
+            <w:pPr>
+              <w:spacing w:line="240" w:lineRule="auto" w:before="0" w:after="0"/>
+              <w:ind w:left="0" w:firstLine="0"/>
+              <w:jc w:val="center"/>
+            </w:pPr>
+            <w:r>
+              <w:rPr>
+                <w:rFonts w:ascii="Times New Roman" w:hAnsi="Times New Roman"/>
+                <w:b w:val="0"/>
+                <w:sz w:val="24"/>
+              </w:rPr>
+              <w:t>Observación o registro de campo específico del estudio</w:t>
+            </w:r>
+          </w:p>
+        </w:tc>
+        <w:tc>
+          <w:tcPr>
+            <w:tcW w:type="dxa" w:w="1197"/>
+            <w:vAlign w:val="center"/>
+            <w:tcMar>
+              <w:top w:w="72" w:type="dxa"/>
+              <w:left w:w="72" w:type="dxa"/>
+              <w:bottom w:w="72" w:type="dxa"/>
+              <w:right w:w="72" w:type="dxa"/>
+            </w:tcMar>
+          </w:tcPr>
+          <w:p>
+            <w:pPr>
+              <w:spacing w:line="240" w:lineRule="auto" w:before="0" w:after="0"/>
+              <w:ind w:left="0" w:firstLine="0"/>
+              <w:jc w:val="center"/>
+            </w:pPr>
+            <w:r>
+              <w:rPr>
+                <w:rFonts w:ascii="Times New Roman" w:hAnsi="Times New Roman"/>
+                <w:b w:val="0"/>
+                <w:sz w:val="24"/>
+              </w:rPr>
+              <w:t>Observado o comunicado; anualizado de forma reproducible</w:t>
+            </w:r>
+          </w:p>
+        </w:tc>
+        <w:tc>
+          <w:tcPr>
+            <w:tcW w:type="dxa" w:w="1197"/>
+            <w:vAlign w:val="center"/>
+            <w:tcMar>
+              <w:top w:w="72" w:type="dxa"/>
+              <w:left w:w="72" w:type="dxa"/>
+              <w:bottom w:w="72" w:type="dxa"/>
+              <w:right w:w="72" w:type="dxa"/>
+            </w:tcMar>
+          </w:tcPr>
+          <w:p>
+            <w:pPr>
+              <w:spacing w:line="240" w:lineRule="auto" w:before="0" w:after="0"/>
+              <w:ind w:left="0" w:firstLine="0"/>
+              <w:jc w:val="center"/>
+            </w:pPr>
+            <w:r>
+              <w:rPr>
+                <w:rFonts w:ascii="Times New Roman" w:hAnsi="Times New Roman"/>
+                <w:b w:val="0"/>
+                <w:sz w:val="24"/>
+              </w:rPr>
+              <w:t>Nota de campo y comunicación con operarios del 25 de agosto de 2026</w:t>
+            </w:r>
+          </w:p>
+        </w:tc>
+        <w:tc>
+          <w:tcPr>
+            <w:tcW w:type="dxa" w:w="1197"/>
+            <w:vAlign w:val="center"/>
+            <w:tcMar>
+              <w:top w:w="72" w:type="dxa"/>
+              <w:left w:w="72" w:type="dxa"/>
+              <w:bottom w:w="72" w:type="dxa"/>
+              <w:right w:w="72" w:type="dxa"/>
+            </w:tcMar>
+          </w:tcPr>
+          <w:p>
+            <w:pPr>
+              <w:spacing w:line="240" w:lineRule="auto" w:before="0" w:after="0"/>
+              <w:ind w:left="0" w:firstLine="0"/>
+              <w:jc w:val="center"/>
+            </w:pPr>
+            <w:r>
+              <w:rPr>
+                <w:rFonts w:ascii="Times New Roman" w:hAnsi="Times New Roman"/>
+                <w:b w:val="0"/>
+                <w:sz w:val="24"/>
+              </w:rPr>
+              <w:t>Duración y frecuencia de bombeo, almacenamiento y aplicación</w:t>
+            </w:r>
+          </w:p>
+        </w:tc>
+      </w:tr>
+      <w:tr>
+        <w:trPr>
+          <w:cantSplit/>
+        </w:trPr>
+        <w:tc>
+          <w:tcPr>
+            <w:tcW w:type="dxa" w:w="1197"/>
+            <w:vAlign w:val="center"/>
+            <w:tcMar>
+              <w:top w:w="72" w:type="dxa"/>
+              <w:left w:w="72" w:type="dxa"/>
+              <w:bottom w:w="72" w:type="dxa"/>
+              <w:right w:w="72" w:type="dxa"/>
+            </w:tcMar>
+          </w:tcPr>
+          <w:p>
+            <w:pPr>
+              <w:spacing w:line="240" w:lineRule="auto" w:before="0" w:after="0"/>
+              <w:ind w:left="0" w:firstLine="0"/>
+              <w:jc w:val="center"/>
+            </w:pPr>
+            <w:r>
+              <w:rPr>
+                <w:rFonts w:ascii="Times New Roman" w:hAnsi="Times New Roman"/>
+                <w:b w:val="0"/>
+                <w:sz w:val="24"/>
+              </w:rPr>
+              <w:t>Características nominales observadas en equipos</w:t>
+            </w:r>
+          </w:p>
+        </w:tc>
+        <w:tc>
+          <w:tcPr>
+            <w:tcW w:type="dxa" w:w="1197"/>
+            <w:vAlign w:val="center"/>
+            <w:tcMar>
+              <w:top w:w="72" w:type="dxa"/>
+              <w:left w:w="72" w:type="dxa"/>
+              <w:bottom w:w="72" w:type="dxa"/>
+              <w:right w:w="72" w:type="dxa"/>
+            </w:tcMar>
+          </w:tcPr>
+          <w:p>
+            <w:pPr>
+              <w:spacing w:line="240" w:lineRule="auto" w:before="0" w:after="0"/>
+              <w:ind w:left="0" w:firstLine="0"/>
+              <w:jc w:val="center"/>
+            </w:pPr>
+            <w:r>
+              <w:rPr>
+                <w:rFonts w:ascii="Times New Roman" w:hAnsi="Times New Roman"/>
+                <w:b w:val="0"/>
+                <w:sz w:val="24"/>
+              </w:rPr>
+              <w:t>A3, B1</w:t>
+            </w:r>
+          </w:p>
+        </w:tc>
+        <w:tc>
+          <w:tcPr>
+            <w:tcW w:type="dxa" w:w="1197"/>
+            <w:vAlign w:val="center"/>
+            <w:tcMar>
+              <w:top w:w="72" w:type="dxa"/>
+              <w:left w:w="72" w:type="dxa"/>
+              <w:bottom w:w="72" w:type="dxa"/>
+              <w:right w:w="72" w:type="dxa"/>
+            </w:tcMar>
+          </w:tcPr>
+          <w:p>
+            <w:pPr>
+              <w:spacing w:line="240" w:lineRule="auto" w:before="0" w:after="0"/>
+              <w:ind w:left="0" w:firstLine="0"/>
+              <w:jc w:val="center"/>
+            </w:pPr>
+            <w:r>
+              <w:rPr>
+                <w:rFonts w:ascii="Times New Roman" w:hAnsi="Times New Roman"/>
+                <w:b w:val="0"/>
+                <w:sz w:val="24"/>
+              </w:rPr>
+              <w:t>1 característica nominal de equipo</w:t>
+            </w:r>
+          </w:p>
+        </w:tc>
+        <w:tc>
+          <w:tcPr>
+            <w:tcW w:type="dxa" w:w="1197"/>
+            <w:vAlign w:val="center"/>
+            <w:tcMar>
+              <w:top w:w="72" w:type="dxa"/>
+              <w:left w:w="72" w:type="dxa"/>
+              <w:bottom w:w="72" w:type="dxa"/>
+              <w:right w:w="72" w:type="dxa"/>
+            </w:tcMar>
+          </w:tcPr>
+          <w:p>
+            <w:pPr>
+              <w:spacing w:line="240" w:lineRule="auto" w:before="0" w:after="0"/>
+              <w:ind w:left="0" w:firstLine="0"/>
+              <w:jc w:val="center"/>
+            </w:pPr>
+            <w:r>
+              <w:rPr>
+                <w:rFonts w:ascii="Times New Roman" w:hAnsi="Times New Roman"/>
+                <w:b w:val="0"/>
+                <w:sz w:val="24"/>
+              </w:rPr>
+              <w:t>Primaria</w:t>
+            </w:r>
+          </w:p>
+        </w:tc>
+        <w:tc>
+          <w:tcPr>
+            <w:tcW w:type="dxa" w:w="1197"/>
+            <w:vAlign w:val="center"/>
+            <w:tcMar>
+              <w:top w:w="72" w:type="dxa"/>
+              <w:left w:w="72" w:type="dxa"/>
+              <w:bottom w:w="72" w:type="dxa"/>
+              <w:right w:w="72" w:type="dxa"/>
+            </w:tcMar>
+          </w:tcPr>
+          <w:p>
+            <w:pPr>
+              <w:spacing w:line="240" w:lineRule="auto" w:before="0" w:after="0"/>
+              <w:ind w:left="0" w:firstLine="0"/>
+              <w:jc w:val="center"/>
+            </w:pPr>
+            <w:r>
+              <w:rPr>
+                <w:rFonts w:ascii="Times New Roman" w:hAnsi="Times New Roman"/>
+                <w:b w:val="0"/>
+                <w:sz w:val="24"/>
+              </w:rPr>
+              <w:t>Observación directa de placa</w:t>
+            </w:r>
+          </w:p>
+        </w:tc>
+        <w:tc>
+          <w:tcPr>
+            <w:tcW w:type="dxa" w:w="1197"/>
+            <w:vAlign w:val="center"/>
+            <w:tcMar>
+              <w:top w:w="72" w:type="dxa"/>
+              <w:left w:w="72" w:type="dxa"/>
+              <w:bottom w:w="72" w:type="dxa"/>
+              <w:right w:w="72" w:type="dxa"/>
+            </w:tcMar>
+          </w:tcPr>
+          <w:p>
+            <w:pPr>
+              <w:spacing w:line="240" w:lineRule="auto" w:before="0" w:after="0"/>
+              <w:ind w:left="0" w:firstLine="0"/>
+              <w:jc w:val="center"/>
+            </w:pPr>
+            <w:r>
+              <w:rPr>
+                <w:rFonts w:ascii="Times New Roman" w:hAnsi="Times New Roman"/>
+                <w:b w:val="0"/>
+                <w:sz w:val="24"/>
+              </w:rPr>
+              <w:t>Observado</w:t>
+            </w:r>
+          </w:p>
+        </w:tc>
+        <w:tc>
+          <w:tcPr>
+            <w:tcW w:type="dxa" w:w="1197"/>
+            <w:vAlign w:val="center"/>
+            <w:tcMar>
+              <w:top w:w="72" w:type="dxa"/>
+              <w:left w:w="72" w:type="dxa"/>
+              <w:bottom w:w="72" w:type="dxa"/>
+              <w:right w:w="72" w:type="dxa"/>
+            </w:tcMar>
+          </w:tcPr>
+          <w:p>
+            <w:pPr>
+              <w:spacing w:line="240" w:lineRule="auto" w:before="0" w:after="0"/>
+              <w:ind w:left="0" w:firstLine="0"/>
+              <w:jc w:val="center"/>
+            </w:pPr>
+            <w:r>
+              <w:rPr>
+                <w:rFonts w:ascii="Times New Roman" w:hAnsi="Times New Roman"/>
+                <w:b w:val="0"/>
+                <w:sz w:val="24"/>
+              </w:rPr>
+              <w:t>Placa de la bomba Aermotor 20HBP200-01</w:t>
+            </w:r>
+          </w:p>
+        </w:tc>
+        <w:tc>
+          <w:tcPr>
+            <w:tcW w:type="dxa" w:w="1197"/>
+            <w:vAlign w:val="center"/>
+            <w:tcMar>
+              <w:top w:w="72" w:type="dxa"/>
+              <w:left w:w="72" w:type="dxa"/>
+              <w:bottom w:w="72" w:type="dxa"/>
+              <w:right w:w="72" w:type="dxa"/>
+            </w:tcMar>
+          </w:tcPr>
+          <w:p>
+            <w:pPr>
+              <w:spacing w:line="240" w:lineRule="auto" w:before="0" w:after="0"/>
+              <w:ind w:left="0" w:firstLine="0"/>
+              <w:jc w:val="center"/>
+            </w:pPr>
+            <w:r>
+              <w:rPr>
+                <w:rFonts w:ascii="Times New Roman" w:hAnsi="Times New Roman"/>
+                <w:b w:val="0"/>
+                <w:sz w:val="24"/>
+              </w:rPr>
+              <w:t>Estimación del consumo eléctrico del bombeo</w:t>
+            </w:r>
+          </w:p>
+        </w:tc>
+      </w:tr>
+      <w:tr>
+        <w:trPr>
+          <w:cantSplit/>
+        </w:trPr>
+        <w:tc>
+          <w:tcPr>
+            <w:tcW w:type="dxa" w:w="1197"/>
+            <w:vAlign w:val="center"/>
+            <w:tcMar>
+              <w:top w:w="72" w:type="dxa"/>
+              <w:left w:w="72" w:type="dxa"/>
+              <w:bottom w:w="72" w:type="dxa"/>
+              <w:right w:w="72" w:type="dxa"/>
+            </w:tcMar>
+          </w:tcPr>
+          <w:p>
+            <w:pPr>
+              <w:spacing w:line="240" w:lineRule="auto" w:before="0" w:after="0"/>
+              <w:ind w:left="0" w:firstLine="0"/>
+              <w:jc w:val="center"/>
+            </w:pPr>
+            <w:r>
+              <w:rPr>
+                <w:rFonts w:ascii="Times New Roman" w:hAnsi="Times New Roman"/>
+                <w:b w:val="0"/>
+                <w:sz w:val="24"/>
+              </w:rPr>
+              <w:t>Parámetros operativos publicados de la misma lechería</w:t>
+            </w:r>
+          </w:p>
+        </w:tc>
+        <w:tc>
+          <w:tcPr>
+            <w:tcW w:type="dxa" w:w="1197"/>
+            <w:vAlign w:val="center"/>
+            <w:tcMar>
+              <w:top w:w="72" w:type="dxa"/>
+              <w:left w:w="72" w:type="dxa"/>
+              <w:bottom w:w="72" w:type="dxa"/>
+              <w:right w:w="72" w:type="dxa"/>
+            </w:tcMar>
+          </w:tcPr>
+          <w:p>
+            <w:pPr>
+              <w:spacing w:line="240" w:lineRule="auto" w:before="0" w:after="0"/>
+              <w:ind w:left="0" w:firstLine="0"/>
+              <w:jc w:val="center"/>
+            </w:pPr>
+            <w:r>
+              <w:rPr>
+                <w:rFonts w:ascii="Times New Roman" w:hAnsi="Times New Roman"/>
+                <w:b w:val="0"/>
+                <w:sz w:val="24"/>
+              </w:rPr>
+              <w:t>A1, A2, A3, A4, B1 y B2</w:t>
+            </w:r>
+          </w:p>
+        </w:tc>
+        <w:tc>
+          <w:tcPr>
+            <w:tcW w:type="dxa" w:w="1197"/>
+            <w:vAlign w:val="center"/>
+            <w:tcMar>
+              <w:top w:w="72" w:type="dxa"/>
+              <w:left w:w="72" w:type="dxa"/>
+              <w:bottom w:w="72" w:type="dxa"/>
+              <w:right w:w="72" w:type="dxa"/>
+            </w:tcMar>
+          </w:tcPr>
+          <w:p>
+            <w:pPr>
+              <w:spacing w:line="240" w:lineRule="auto" w:before="0" w:after="0"/>
+              <w:ind w:left="0" w:firstLine="0"/>
+              <w:jc w:val="center"/>
+            </w:pPr>
+            <w:r>
+              <w:rPr>
+                <w:rFonts w:ascii="Times New Roman" w:hAnsi="Times New Roman"/>
+                <w:b w:val="0"/>
+                <w:sz w:val="24"/>
+              </w:rPr>
+              <w:t>6 parámetros publicados</w:t>
+            </w:r>
+          </w:p>
+        </w:tc>
+        <w:tc>
+          <w:tcPr>
+            <w:tcW w:type="dxa" w:w="1197"/>
+            <w:vAlign w:val="center"/>
+            <w:tcMar>
+              <w:top w:w="72" w:type="dxa"/>
+              <w:left w:w="72" w:type="dxa"/>
+              <w:bottom w:w="72" w:type="dxa"/>
+              <w:right w:w="72" w:type="dxa"/>
+            </w:tcMar>
+          </w:tcPr>
+          <w:p>
+            <w:pPr>
+              <w:spacing w:line="240" w:lineRule="auto" w:before="0" w:after="0"/>
+              <w:ind w:left="0" w:firstLine="0"/>
+              <w:jc w:val="center"/>
+            </w:pPr>
+            <w:r>
+              <w:rPr>
+                <w:rFonts w:ascii="Times New Roman" w:hAnsi="Times New Roman"/>
+                <w:b w:val="0"/>
+                <w:sz w:val="24"/>
+              </w:rPr>
+              <w:t>Secundaria</w:t>
+            </w:r>
+          </w:p>
+        </w:tc>
+        <w:tc>
+          <w:tcPr>
+            <w:tcW w:type="dxa" w:w="1197"/>
+            <w:vAlign w:val="center"/>
+            <w:tcMar>
+              <w:top w:w="72" w:type="dxa"/>
+              <w:left w:w="72" w:type="dxa"/>
+              <w:bottom w:w="72" w:type="dxa"/>
+              <w:right w:w="72" w:type="dxa"/>
+            </w:tcMar>
+          </w:tcPr>
+          <w:p>
+            <w:pPr>
+              <w:spacing w:line="240" w:lineRule="auto" w:before="0" w:after="0"/>
+              <w:ind w:left="0" w:firstLine="0"/>
+              <w:jc w:val="center"/>
+            </w:pPr>
+            <w:r>
+              <w:rPr>
+                <w:rFonts w:ascii="Times New Roman" w:hAnsi="Times New Roman"/>
+                <w:b w:val="0"/>
+                <w:sz w:val="24"/>
+              </w:rPr>
+              <w:t>Datos publicados previamente para el sitio de estudio</w:t>
+            </w:r>
+          </w:p>
+        </w:tc>
+        <w:tc>
+          <w:tcPr>
+            <w:tcW w:type="dxa" w:w="1197"/>
+            <w:vAlign w:val="center"/>
+            <w:tcMar>
+              <w:top w:w="72" w:type="dxa"/>
+              <w:left w:w="72" w:type="dxa"/>
+              <w:bottom w:w="72" w:type="dxa"/>
+              <w:right w:w="72" w:type="dxa"/>
+            </w:tcMar>
+          </w:tcPr>
+          <w:p>
+            <w:pPr>
+              <w:spacing w:line="240" w:lineRule="auto" w:before="0" w:after="0"/>
+              <w:ind w:left="0" w:firstLine="0"/>
+              <w:jc w:val="center"/>
+            </w:pPr>
+            <w:r>
+              <w:rPr>
+                <w:rFonts w:ascii="Times New Roman" w:hAnsi="Times New Roman"/>
+                <w:b w:val="0"/>
+                <w:sz w:val="24"/>
+              </w:rPr>
+              <w:t>Publicado; usado directamente o anualizado</w:t>
+            </w:r>
+          </w:p>
+        </w:tc>
+        <w:tc>
+          <w:tcPr>
+            <w:tcW w:type="dxa" w:w="1197"/>
+            <w:vAlign w:val="center"/>
+            <w:tcMar>
+              <w:top w:w="72" w:type="dxa"/>
+              <w:left w:w="72" w:type="dxa"/>
+              <w:bottom w:w="72" w:type="dxa"/>
+              <w:right w:w="72" w:type="dxa"/>
+            </w:tcMar>
+          </w:tcPr>
+          <w:p>
+            <w:pPr>
+              <w:spacing w:line="240" w:lineRule="auto" w:before="0" w:after="0"/>
+              <w:ind w:left="0" w:firstLine="0"/>
+              <w:jc w:val="center"/>
+            </w:pPr>
+            <w:r>
+              <w:rPr>
+                <w:rFonts w:ascii="Times New Roman" w:hAnsi="Times New Roman"/>
+                <w:b w:val="0"/>
+                <w:sz w:val="24"/>
+              </w:rPr>
+              <w:t>Sánchez-Romero y Brenes-Gamboa (2026)</w:t>
+            </w:r>
+          </w:p>
+        </w:tc>
+        <w:tc>
+          <w:tcPr>
+            <w:tcW w:type="dxa" w:w="1197"/>
+            <w:vAlign w:val="center"/>
+            <w:tcMar>
+              <w:top w:w="72" w:type="dxa"/>
+              <w:left w:w="72" w:type="dxa"/>
+              <w:bottom w:w="72" w:type="dxa"/>
+              <w:right w:w="72" w:type="dxa"/>
+            </w:tcMar>
+          </w:tcPr>
+          <w:p>
+            <w:pPr>
+              <w:spacing w:line="240" w:lineRule="auto" w:before="0" w:after="0"/>
+              <w:ind w:left="0" w:firstLine="0"/>
+              <w:jc w:val="center"/>
+            </w:pPr>
+            <w:r>
+              <w:rPr>
+                <w:rFonts w:ascii="Times New Roman" w:hAnsi="Times New Roman"/>
+                <w:b w:val="0"/>
+                <w:sz w:val="24"/>
+              </w:rPr>
+              <w:t>Población, permanencia, estiércol recolectado y agua de lavado</w:t>
+            </w:r>
+          </w:p>
+        </w:tc>
+      </w:tr>
+      <w:tr>
+        <w:trPr>
+          <w:cantSplit/>
+        </w:trPr>
+        <w:tc>
+          <w:tcPr>
+            <w:tcW w:type="dxa" w:w="1197"/>
+            <w:vAlign w:val="center"/>
+            <w:tcMar>
+              <w:top w:w="72" w:type="dxa"/>
+              <w:left w:w="72" w:type="dxa"/>
+              <w:bottom w:w="72" w:type="dxa"/>
+              <w:right w:w="72" w:type="dxa"/>
+            </w:tcMar>
+          </w:tcPr>
+          <w:p>
+            <w:pPr>
+              <w:spacing w:line="240" w:lineRule="auto" w:before="0" w:after="0"/>
+              <w:ind w:left="0" w:firstLine="0"/>
+              <w:jc w:val="center"/>
+            </w:pPr>
+            <w:r>
+              <w:rPr>
+                <w:rFonts w:ascii="Times New Roman" w:hAnsi="Times New Roman"/>
+                <w:b w:val="0"/>
+                <w:sz w:val="24"/>
+              </w:rPr>
+              <w:t>Fracción de generación de estiércol durante la permanencia en sala</w:t>
+            </w:r>
+          </w:p>
+        </w:tc>
+        <w:tc>
+          <w:tcPr>
+            <w:tcW w:type="dxa" w:w="1197"/>
+            <w:vAlign w:val="center"/>
+            <w:tcMar>
+              <w:top w:w="72" w:type="dxa"/>
+              <w:left w:w="72" w:type="dxa"/>
+              <w:bottom w:w="72" w:type="dxa"/>
+              <w:right w:w="72" w:type="dxa"/>
+            </w:tcMar>
+          </w:tcPr>
+          <w:p>
+            <w:pPr>
+              <w:spacing w:line="240" w:lineRule="auto" w:before="0" w:after="0"/>
+              <w:ind w:left="0" w:firstLine="0"/>
+              <w:jc w:val="center"/>
+            </w:pPr>
+            <w:r>
+              <w:rPr>
+                <w:rFonts w:ascii="Times New Roman" w:hAnsi="Times New Roman"/>
+                <w:b w:val="0"/>
+                <w:sz w:val="24"/>
+              </w:rPr>
+              <w:t>A1, A3, B1</w:t>
+            </w:r>
+          </w:p>
+        </w:tc>
+        <w:tc>
+          <w:tcPr>
+            <w:tcW w:type="dxa" w:w="1197"/>
+            <w:vAlign w:val="center"/>
+            <w:tcMar>
+              <w:top w:w="72" w:type="dxa"/>
+              <w:left w:w="72" w:type="dxa"/>
+              <w:bottom w:w="72" w:type="dxa"/>
+              <w:right w:w="72" w:type="dxa"/>
+            </w:tcMar>
+          </w:tcPr>
+          <w:p>
+            <w:pPr>
+              <w:spacing w:line="240" w:lineRule="auto" w:before="0" w:after="0"/>
+              <w:ind w:left="0" w:firstLine="0"/>
+              <w:jc w:val="center"/>
+            </w:pPr>
+            <w:r>
+              <w:rPr>
+                <w:rFonts w:ascii="Times New Roman" w:hAnsi="Times New Roman"/>
+                <w:b w:val="0"/>
+                <w:sz w:val="24"/>
+              </w:rPr>
+              <w:t>1 supuesto basado en intervalo publicado</w:t>
+            </w:r>
+          </w:p>
+        </w:tc>
+        <w:tc>
+          <w:tcPr>
+            <w:tcW w:type="dxa" w:w="1197"/>
+            <w:vAlign w:val="center"/>
+            <w:tcMar>
+              <w:top w:w="72" w:type="dxa"/>
+              <w:left w:w="72" w:type="dxa"/>
+              <w:bottom w:w="72" w:type="dxa"/>
+              <w:right w:w="72" w:type="dxa"/>
+            </w:tcMar>
+          </w:tcPr>
+          <w:p>
+            <w:pPr>
+              <w:spacing w:line="240" w:lineRule="auto" w:before="0" w:after="0"/>
+              <w:ind w:left="0" w:firstLine="0"/>
+              <w:jc w:val="center"/>
+            </w:pPr>
+            <w:r>
+              <w:rPr>
+                <w:rFonts w:ascii="Times New Roman" w:hAnsi="Times New Roman"/>
+                <w:b w:val="0"/>
+                <w:sz w:val="24"/>
+              </w:rPr>
+              <w:t>Secundaria</w:t>
+            </w:r>
+          </w:p>
+        </w:tc>
+        <w:tc>
+          <w:tcPr>
+            <w:tcW w:type="dxa" w:w="1197"/>
+            <w:vAlign w:val="center"/>
+            <w:tcMar>
+              <w:top w:w="72" w:type="dxa"/>
+              <w:left w:w="72" w:type="dxa"/>
+              <w:bottom w:w="72" w:type="dxa"/>
+              <w:right w:w="72" w:type="dxa"/>
+            </w:tcMar>
+          </w:tcPr>
+          <w:p>
+            <w:pPr>
+              <w:spacing w:line="240" w:lineRule="auto" w:before="0" w:after="0"/>
+              <w:ind w:left="0" w:firstLine="0"/>
+              <w:jc w:val="center"/>
+            </w:pPr>
+            <w:r>
+              <w:rPr>
+                <w:rFonts w:ascii="Times New Roman" w:hAnsi="Times New Roman"/>
+                <w:b w:val="0"/>
+                <w:sz w:val="24"/>
+              </w:rPr>
+              <w:t>Literatura aplicada como base de un supuesto explícito</w:t>
+            </w:r>
+          </w:p>
+        </w:tc>
+        <w:tc>
+          <w:tcPr>
+            <w:tcW w:type="dxa" w:w="1197"/>
+            <w:vAlign w:val="center"/>
+            <w:tcMar>
+              <w:top w:w="72" w:type="dxa"/>
+              <w:left w:w="72" w:type="dxa"/>
+              <w:bottom w:w="72" w:type="dxa"/>
+              <w:right w:w="72" w:type="dxa"/>
+            </w:tcMar>
+          </w:tcPr>
+          <w:p>
+            <w:pPr>
+              <w:spacing w:line="240" w:lineRule="auto" w:before="0" w:after="0"/>
+              <w:ind w:left="0" w:firstLine="0"/>
+              <w:jc w:val="center"/>
+            </w:pPr>
+            <w:r>
+              <w:rPr>
+                <w:rFonts w:ascii="Times New Roman" w:hAnsi="Times New Roman"/>
+                <w:b w:val="0"/>
+                <w:sz w:val="24"/>
+              </w:rPr>
+              <w:t>Supuesto del estudio</w:t>
+            </w:r>
+          </w:p>
+        </w:tc>
+        <w:tc>
+          <w:tcPr>
+            <w:tcW w:type="dxa" w:w="1197"/>
+            <w:vAlign w:val="center"/>
+            <w:tcMar>
+              <w:top w:w="72" w:type="dxa"/>
+              <w:left w:w="72" w:type="dxa"/>
+              <w:bottom w:w="72" w:type="dxa"/>
+              <w:right w:w="72" w:type="dxa"/>
+            </w:tcMar>
+          </w:tcPr>
+          <w:p>
+            <w:pPr>
+              <w:spacing w:line="240" w:lineRule="auto" w:before="0" w:after="0"/>
+              <w:ind w:left="0" w:firstLine="0"/>
+              <w:jc w:val="center"/>
+            </w:pPr>
+            <w:r>
+              <w:rPr>
+                <w:rFonts w:ascii="Times New Roman" w:hAnsi="Times New Roman"/>
+                <w:b w:val="0"/>
+                <w:sz w:val="24"/>
+              </w:rPr>
+              <w:t>Límite inferior del intervalo bibliográfico citado por Sánchez-Romero y Brenes-Gamboa (2026)</w:t>
+            </w:r>
+          </w:p>
+        </w:tc>
+        <w:tc>
+          <w:tcPr>
+            <w:tcW w:type="dxa" w:w="1197"/>
+            <w:vAlign w:val="center"/>
+            <w:tcMar>
+              <w:top w:w="72" w:type="dxa"/>
+              <w:left w:w="72" w:type="dxa"/>
+              <w:bottom w:w="72" w:type="dxa"/>
+              <w:right w:w="72" w:type="dxa"/>
+            </w:tcMar>
+          </w:tcPr>
+          <w:p>
+            <w:pPr>
+              <w:spacing w:line="240" w:lineRule="auto" w:before="0" w:after="0"/>
+              <w:ind w:left="0" w:firstLine="0"/>
+              <w:jc w:val="center"/>
+            </w:pPr>
+            <w:r>
+              <w:rPr>
+                <w:rFonts w:ascii="Times New Roman" w:hAnsi="Times New Roman"/>
+                <w:b w:val="0"/>
+                <w:sz w:val="24"/>
+              </w:rPr>
+              <w:t>Estimación conservadora del estiércol depositado durante la permanencia en sala</w:t>
+            </w:r>
+          </w:p>
+        </w:tc>
+      </w:tr>
+      <w:tr>
+        <w:trPr>
+          <w:cantSplit/>
+        </w:trPr>
+        <w:tc>
+          <w:tcPr>
+            <w:tcW w:type="dxa" w:w="1197"/>
+            <w:vAlign w:val="center"/>
+            <w:tcMar>
+              <w:top w:w="72" w:type="dxa"/>
+              <w:left w:w="72" w:type="dxa"/>
+              <w:bottom w:w="72" w:type="dxa"/>
+              <w:right w:w="72" w:type="dxa"/>
+            </w:tcMar>
+          </w:tcPr>
+          <w:p>
+            <w:pPr>
+              <w:spacing w:line="240" w:lineRule="auto" w:before="0" w:after="0"/>
+              <w:ind w:left="0" w:firstLine="0"/>
+              <w:jc w:val="center"/>
+            </w:pPr>
+            <w:r>
+              <w:rPr>
+                <w:rFonts w:ascii="Times New Roman" w:hAnsi="Times New Roman"/>
+                <w:b w:val="0"/>
+                <w:sz w:val="24"/>
+              </w:rPr>
+              <w:t>Eficiencia de bomba, consumo de diésel y anualización operativa</w:t>
+            </w:r>
+          </w:p>
+        </w:tc>
+        <w:tc>
+          <w:tcPr>
+            <w:tcW w:type="dxa" w:w="1197"/>
+            <w:vAlign w:val="center"/>
+            <w:tcMar>
+              <w:top w:w="72" w:type="dxa"/>
+              <w:left w:w="72" w:type="dxa"/>
+              <w:bottom w:w="72" w:type="dxa"/>
+              <w:right w:w="72" w:type="dxa"/>
+            </w:tcMar>
+          </w:tcPr>
+          <w:p>
+            <w:pPr>
+              <w:spacing w:line="240" w:lineRule="auto" w:before="0" w:after="0"/>
+              <w:ind w:left="0" w:firstLine="0"/>
+              <w:jc w:val="center"/>
+            </w:pPr>
+            <w:r>
+              <w:rPr>
+                <w:rFonts w:ascii="Times New Roman" w:hAnsi="Times New Roman"/>
+                <w:b w:val="0"/>
+                <w:sz w:val="24"/>
+              </w:rPr>
+              <w:t>A3, A4, B1, B2</w:t>
+            </w:r>
+          </w:p>
+        </w:tc>
+        <w:tc>
+          <w:tcPr>
+            <w:tcW w:type="dxa" w:w="1197"/>
+            <w:vAlign w:val="center"/>
+            <w:tcMar>
+              <w:top w:w="72" w:type="dxa"/>
+              <w:left w:w="72" w:type="dxa"/>
+              <w:bottom w:w="72" w:type="dxa"/>
+              <w:right w:w="72" w:type="dxa"/>
+            </w:tcMar>
+          </w:tcPr>
+          <w:p>
+            <w:pPr>
+              <w:spacing w:line="240" w:lineRule="auto" w:before="0" w:after="0"/>
+              <w:ind w:left="0" w:firstLine="0"/>
+              <w:jc w:val="center"/>
+            </w:pPr>
+            <w:r>
+              <w:rPr>
+                <w:rFonts w:ascii="Times New Roman" w:hAnsi="Times New Roman"/>
+                <w:b w:val="0"/>
+                <w:sz w:val="24"/>
+              </w:rPr>
+              <w:t>2 supuestos explícitos con contexto de campo</w:t>
+            </w:r>
+          </w:p>
+        </w:tc>
+        <w:tc>
+          <w:tcPr>
+            <w:tcW w:type="dxa" w:w="1197"/>
+            <w:vAlign w:val="center"/>
+            <w:tcMar>
+              <w:top w:w="72" w:type="dxa"/>
+              <w:left w:w="72" w:type="dxa"/>
+              <w:bottom w:w="72" w:type="dxa"/>
+              <w:right w:w="72" w:type="dxa"/>
+            </w:tcMar>
+          </w:tcPr>
+          <w:p>
+            <w:pPr>
+              <w:spacing w:line="240" w:lineRule="auto" w:before="0" w:after="0"/>
+              <w:ind w:left="0" w:firstLine="0"/>
+              <w:jc w:val="center"/>
+            </w:pPr>
+            <w:r>
+              <w:rPr>
+                <w:rFonts w:ascii="Times New Roman" w:hAnsi="Times New Roman"/>
+                <w:b w:val="0"/>
+                <w:sz w:val="24"/>
+              </w:rPr>
+              <w:t>No aplica: supuesto del estudio</w:t>
+            </w:r>
+          </w:p>
+        </w:tc>
+        <w:tc>
+          <w:tcPr>
+            <w:tcW w:type="dxa" w:w="1197"/>
+            <w:vAlign w:val="center"/>
+            <w:tcMar>
+              <w:top w:w="72" w:type="dxa"/>
+              <w:left w:w="72" w:type="dxa"/>
+              <w:bottom w:w="72" w:type="dxa"/>
+              <w:right w:w="72" w:type="dxa"/>
+            </w:tcMar>
+          </w:tcPr>
+          <w:p>
+            <w:pPr>
+              <w:spacing w:line="240" w:lineRule="auto" w:before="0" w:after="0"/>
+              <w:ind w:left="0" w:firstLine="0"/>
+              <w:jc w:val="center"/>
+            </w:pPr>
+            <w:r>
+              <w:rPr>
+                <w:rFonts w:ascii="Times New Roman" w:hAnsi="Times New Roman"/>
+                <w:b w:val="0"/>
+                <w:sz w:val="24"/>
+              </w:rPr>
+              <w:t>Supuesto numérico definido para el modelo</w:t>
+            </w:r>
+          </w:p>
+        </w:tc>
+        <w:tc>
+          <w:tcPr>
+            <w:tcW w:type="dxa" w:w="1197"/>
+            <w:vAlign w:val="center"/>
+            <w:tcMar>
+              <w:top w:w="72" w:type="dxa"/>
+              <w:left w:w="72" w:type="dxa"/>
+              <w:bottom w:w="72" w:type="dxa"/>
+              <w:right w:w="72" w:type="dxa"/>
+            </w:tcMar>
+          </w:tcPr>
+          <w:p>
+            <w:pPr>
+              <w:spacing w:line="240" w:lineRule="auto" w:before="0" w:after="0"/>
+              <w:ind w:left="0" w:firstLine="0"/>
+              <w:jc w:val="center"/>
+            </w:pPr>
+            <w:r>
+              <w:rPr>
+                <w:rFonts w:ascii="Times New Roman" w:hAnsi="Times New Roman"/>
+                <w:b w:val="0"/>
+                <w:sz w:val="24"/>
+              </w:rPr>
+              <w:t>Supuesto del estudio</w:t>
+            </w:r>
+          </w:p>
+        </w:tc>
+        <w:tc>
+          <w:tcPr>
+            <w:tcW w:type="dxa" w:w="1197"/>
+            <w:vAlign w:val="center"/>
+            <w:tcMar>
+              <w:top w:w="72" w:type="dxa"/>
+              <w:left w:w="72" w:type="dxa"/>
+              <w:bottom w:w="72" w:type="dxa"/>
+              <w:right w:w="72" w:type="dxa"/>
+            </w:tcMar>
+          </w:tcPr>
+          <w:p>
+            <w:pPr>
+              <w:spacing w:line="240" w:lineRule="auto" w:before="0" w:after="0"/>
+              <w:ind w:left="0" w:firstLine="0"/>
+              <w:jc w:val="center"/>
+            </w:pPr>
+            <w:r>
+              <w:rPr>
+                <w:rFonts w:ascii="Times New Roman" w:hAnsi="Times New Roman"/>
+                <w:b w:val="0"/>
+                <w:sz w:val="24"/>
+              </w:rPr>
+              <w:t>Definición explícita del estudio; la nota de campo aporta contexto operativo, no el valor numérico supuesto</w:t>
+            </w:r>
+          </w:p>
+        </w:tc>
+        <w:tc>
+          <w:tcPr>
+            <w:tcW w:type="dxa" w:w="1197"/>
+            <w:vAlign w:val="center"/>
+            <w:tcMar>
+              <w:top w:w="72" w:type="dxa"/>
+              <w:left w:w="72" w:type="dxa"/>
+              <w:bottom w:w="72" w:type="dxa"/>
+              <w:right w:w="72" w:type="dxa"/>
+            </w:tcMar>
+          </w:tcPr>
+          <w:p>
+            <w:pPr>
+              <w:spacing w:line="240" w:lineRule="auto" w:before="0" w:after="0"/>
+              <w:ind w:left="0" w:firstLine="0"/>
+              <w:jc w:val="center"/>
+            </w:pPr>
+            <w:r>
+              <w:rPr>
+                <w:rFonts w:ascii="Times New Roman" w:hAnsi="Times New Roman"/>
+                <w:b w:val="0"/>
+                <w:sz w:val="24"/>
+              </w:rPr>
+              <w:t>Cálculo de consumos de electricidad y diésel</w:t>
+            </w:r>
+          </w:p>
+        </w:tc>
+      </w:tr>
+      <w:tr>
+        <w:trPr>
+          <w:cantSplit/>
+        </w:trPr>
+        <w:tc>
+          <w:tcPr>
+            <w:tcW w:type="dxa" w:w="1197"/>
+            <w:vAlign w:val="center"/>
+            <w:tcMar>
+              <w:top w:w="72" w:type="dxa"/>
+              <w:left w:w="72" w:type="dxa"/>
+              <w:bottom w:w="72" w:type="dxa"/>
+              <w:right w:w="72" w:type="dxa"/>
+            </w:tcMar>
+          </w:tcPr>
+          <w:p>
+            <w:pPr>
+              <w:spacing w:line="240" w:lineRule="auto" w:before="0" w:after="0"/>
+              <w:ind w:left="0" w:firstLine="0"/>
+              <w:jc w:val="center"/>
+            </w:pPr>
+            <w:r>
+              <w:rPr>
+                <w:rFonts w:ascii="Times New Roman" w:hAnsi="Times New Roman"/>
+                <w:b w:val="0"/>
+                <w:sz w:val="24"/>
+              </w:rPr>
+              <w:t>Identidades temporales para prorrateo y anualización</w:t>
+            </w:r>
+          </w:p>
+        </w:tc>
+        <w:tc>
+          <w:tcPr>
+            <w:tcW w:type="dxa" w:w="1197"/>
+            <w:vAlign w:val="center"/>
+            <w:tcMar>
+              <w:top w:w="72" w:type="dxa"/>
+              <w:left w:w="72" w:type="dxa"/>
+              <w:bottom w:w="72" w:type="dxa"/>
+              <w:right w:w="72" w:type="dxa"/>
+            </w:tcMar>
+          </w:tcPr>
+          <w:p>
+            <w:pPr>
+              <w:spacing w:line="240" w:lineRule="auto" w:before="0" w:after="0"/>
+              <w:ind w:left="0" w:firstLine="0"/>
+              <w:jc w:val="center"/>
+            </w:pPr>
+            <w:r>
+              <w:rPr>
+                <w:rFonts w:ascii="Times New Roman" w:hAnsi="Times New Roman"/>
+                <w:b w:val="0"/>
+                <w:sz w:val="24"/>
+              </w:rPr>
+              <w:t>A1, A2, A3, A4, B1 y B2</w:t>
+            </w:r>
+          </w:p>
+        </w:tc>
+        <w:tc>
+          <w:tcPr>
+            <w:tcW w:type="dxa" w:w="1197"/>
+            <w:vAlign w:val="center"/>
+            <w:tcMar>
+              <w:top w:w="72" w:type="dxa"/>
+              <w:left w:w="72" w:type="dxa"/>
+              <w:bottom w:w="72" w:type="dxa"/>
+              <w:right w:w="72" w:type="dxa"/>
+            </w:tcMar>
+          </w:tcPr>
+          <w:p>
+            <w:pPr>
+              <w:spacing w:line="240" w:lineRule="auto" w:before="0" w:after="0"/>
+              <w:ind w:left="0" w:firstLine="0"/>
+              <w:jc w:val="center"/>
+            </w:pPr>
+            <w:r>
+              <w:rPr>
+                <w:rFonts w:ascii="Times New Roman" w:hAnsi="Times New Roman"/>
+                <w:b w:val="0"/>
+                <w:sz w:val="24"/>
+              </w:rPr>
+              <w:t>3 registros estructurados de convenciones temporales</w:t>
+            </w:r>
+          </w:p>
+        </w:tc>
+        <w:tc>
+          <w:tcPr>
+            <w:tcW w:type="dxa" w:w="1197"/>
+            <w:vAlign w:val="center"/>
+            <w:tcMar>
+              <w:top w:w="72" w:type="dxa"/>
+              <w:left w:w="72" w:type="dxa"/>
+              <w:bottom w:w="72" w:type="dxa"/>
+              <w:right w:w="72" w:type="dxa"/>
+            </w:tcMar>
+          </w:tcPr>
+          <w:p>
+            <w:pPr>
+              <w:spacing w:line="240" w:lineRule="auto" w:before="0" w:after="0"/>
+              <w:ind w:left="0" w:firstLine="0"/>
+              <w:jc w:val="center"/>
+            </w:pPr>
+            <w:r>
+              <w:rPr>
+                <w:rFonts w:ascii="Times New Roman" w:hAnsi="Times New Roman"/>
+                <w:b w:val="0"/>
+                <w:sz w:val="24"/>
+              </w:rPr>
+              <w:t>No aplica: convención del estudio</w:t>
+            </w:r>
+          </w:p>
+        </w:tc>
+        <w:tc>
+          <w:tcPr>
+            <w:tcW w:type="dxa" w:w="1197"/>
+            <w:vAlign w:val="center"/>
+            <w:tcMar>
+              <w:top w:w="72" w:type="dxa"/>
+              <w:left w:w="72" w:type="dxa"/>
+              <w:bottom w:w="72" w:type="dxa"/>
+              <w:right w:w="72" w:type="dxa"/>
+            </w:tcMar>
+          </w:tcPr>
+          <w:p>
+            <w:pPr>
+              <w:spacing w:line="240" w:lineRule="auto" w:before="0" w:after="0"/>
+              <w:ind w:left="0" w:firstLine="0"/>
+              <w:jc w:val="center"/>
+            </w:pPr>
+            <w:r>
+              <w:rPr>
+                <w:rFonts w:ascii="Times New Roman" w:hAnsi="Times New Roman"/>
+                <w:b w:val="0"/>
+                <w:sz w:val="24"/>
+              </w:rPr>
+              <w:t>Identidad temporal, no fuente empírica ni bibliográfica</w:t>
+            </w:r>
+          </w:p>
+        </w:tc>
+        <w:tc>
+          <w:tcPr>
+            <w:tcW w:type="dxa" w:w="1197"/>
+            <w:vAlign w:val="center"/>
+            <w:tcMar>
+              <w:top w:w="72" w:type="dxa"/>
+              <w:left w:w="72" w:type="dxa"/>
+              <w:bottom w:w="72" w:type="dxa"/>
+              <w:right w:w="72" w:type="dxa"/>
+            </w:tcMar>
+          </w:tcPr>
+          <w:p>
+            <w:pPr>
+              <w:spacing w:line="240" w:lineRule="auto" w:before="0" w:after="0"/>
+              <w:ind w:left="0" w:firstLine="0"/>
+              <w:jc w:val="center"/>
+            </w:pPr>
+            <w:r>
+              <w:rPr>
+                <w:rFonts w:ascii="Times New Roman" w:hAnsi="Times New Roman"/>
+                <w:b w:val="0"/>
+                <w:sz w:val="24"/>
+              </w:rPr>
+              <w:t>Convención de cálculo</w:t>
+            </w:r>
+          </w:p>
+        </w:tc>
+        <w:tc>
+          <w:tcPr>
+            <w:tcW w:type="dxa" w:w="1197"/>
+            <w:vAlign w:val="center"/>
+            <w:tcMar>
+              <w:top w:w="72" w:type="dxa"/>
+              <w:left w:w="72" w:type="dxa"/>
+              <w:bottom w:w="72" w:type="dxa"/>
+              <w:right w:w="72" w:type="dxa"/>
+            </w:tcMar>
+          </w:tcPr>
+          <w:p>
+            <w:pPr>
+              <w:spacing w:line="240" w:lineRule="auto" w:before="0" w:after="0"/>
+              <w:ind w:left="0" w:firstLine="0"/>
+              <w:jc w:val="center"/>
+            </w:pPr>
+            <w:r>
+              <w:rPr>
+                <w:rFonts w:ascii="Times New Roman" w:hAnsi="Times New Roman"/>
+                <w:b w:val="0"/>
+                <w:sz w:val="24"/>
+              </w:rPr>
+              <w:t>Definición temporal del modelo</w:t>
+            </w:r>
+          </w:p>
+        </w:tc>
+        <w:tc>
+          <w:tcPr>
+            <w:tcW w:type="dxa" w:w="1197"/>
+            <w:vAlign w:val="center"/>
+            <w:tcMar>
+              <w:top w:w="72" w:type="dxa"/>
+              <w:left w:w="72" w:type="dxa"/>
+              <w:bottom w:w="72" w:type="dxa"/>
+              <w:right w:w="72" w:type="dxa"/>
+            </w:tcMar>
+          </w:tcPr>
+          <w:p>
+            <w:pPr>
+              <w:spacing w:line="240" w:lineRule="auto" w:before="0" w:after="0"/>
+              <w:ind w:left="0" w:firstLine="0"/>
+              <w:jc w:val="center"/>
+            </w:pPr>
+            <w:r>
+              <w:rPr>
+                <w:rFonts w:ascii="Times New Roman" w:hAnsi="Times New Roman"/>
+                <w:b w:val="0"/>
+                <w:sz w:val="24"/>
+              </w:rPr>
+              <w:t>Prorrateo diario y expresión anual de los flujos</w:t>
+            </w:r>
+          </w:p>
+        </w:tc>
+      </w:tr>
+      <w:tr>
+        <w:trPr>
+          <w:cantSplit/>
+        </w:trPr>
+        <w:tc>
+          <w:tcPr>
+            <w:tcW w:type="dxa" w:w="1197"/>
+            <w:vAlign w:val="center"/>
+            <w:tcMar>
+              <w:top w:w="72" w:type="dxa"/>
+              <w:left w:w="72" w:type="dxa"/>
+              <w:bottom w:w="72" w:type="dxa"/>
+              <w:right w:w="72" w:type="dxa"/>
+            </w:tcMar>
+          </w:tcPr>
+          <w:p>
+            <w:pPr>
+              <w:spacing w:line="240" w:lineRule="auto" w:before="0" w:after="0"/>
+              <w:ind w:left="0" w:firstLine="0"/>
+              <w:jc w:val="center"/>
+            </w:pPr>
+            <w:r>
+              <w:rPr>
+                <w:rFonts w:ascii="Times New Roman" w:hAnsi="Times New Roman"/>
+                <w:b w:val="0"/>
+                <w:sz w:val="24"/>
+              </w:rPr>
+              <w:t>Transformación de masa de estiércol fresco a precompostado</w:t>
+            </w:r>
+          </w:p>
+        </w:tc>
+        <w:tc>
+          <w:tcPr>
+            <w:tcW w:type="dxa" w:w="1197"/>
+            <w:vAlign w:val="center"/>
+            <w:tcMar>
+              <w:top w:w="72" w:type="dxa"/>
+              <w:left w:w="72" w:type="dxa"/>
+              <w:bottom w:w="72" w:type="dxa"/>
+              <w:right w:w="72" w:type="dxa"/>
+            </w:tcMar>
+          </w:tcPr>
+          <w:p>
+            <w:pPr>
+              <w:spacing w:line="240" w:lineRule="auto" w:before="0" w:after="0"/>
+              <w:ind w:left="0" w:firstLine="0"/>
+              <w:jc w:val="center"/>
+            </w:pPr>
+            <w:r>
+              <w:rPr>
+                <w:rFonts w:ascii="Times New Roman" w:hAnsi="Times New Roman"/>
+                <w:b w:val="0"/>
+                <w:sz w:val="24"/>
+              </w:rPr>
+              <w:t>A1 y A2</w:t>
+            </w:r>
+          </w:p>
+        </w:tc>
+        <w:tc>
+          <w:tcPr>
+            <w:tcW w:type="dxa" w:w="1197"/>
+            <w:vAlign w:val="center"/>
+            <w:tcMar>
+              <w:top w:w="72" w:type="dxa"/>
+              <w:left w:w="72" w:type="dxa"/>
+              <w:bottom w:w="72" w:type="dxa"/>
+              <w:right w:w="72" w:type="dxa"/>
+            </w:tcMar>
+          </w:tcPr>
+          <w:p>
+            <w:pPr>
+              <w:spacing w:line="240" w:lineRule="auto" w:before="0" w:after="0"/>
+              <w:ind w:left="0" w:firstLine="0"/>
+              <w:jc w:val="center"/>
+            </w:pPr>
+            <w:r>
+              <w:rPr>
+                <w:rFonts w:ascii="Times New Roman" w:hAnsi="Times New Roman"/>
+                <w:b w:val="0"/>
+                <w:sz w:val="24"/>
+              </w:rPr>
+              <w:t>Factor integrado de 2 jornadas elegibles</w:t>
+            </w:r>
+          </w:p>
+        </w:tc>
+        <w:tc>
+          <w:tcPr>
+            <w:tcW w:type="dxa" w:w="1197"/>
+            <w:vAlign w:val="center"/>
+            <w:tcMar>
+              <w:top w:w="72" w:type="dxa"/>
+              <w:left w:w="72" w:type="dxa"/>
+              <w:bottom w:w="72" w:type="dxa"/>
+              <w:right w:w="72" w:type="dxa"/>
+            </w:tcMar>
+          </w:tcPr>
+          <w:p>
+            <w:pPr>
+              <w:spacing w:line="240" w:lineRule="auto" w:before="0" w:after="0"/>
+              <w:ind w:left="0" w:firstLine="0"/>
+              <w:jc w:val="center"/>
+            </w:pPr>
+            <w:r>
+              <w:rPr>
+                <w:rFonts w:ascii="Times New Roman" w:hAnsi="Times New Roman"/>
+                <w:b w:val="0"/>
+                <w:sz w:val="24"/>
+              </w:rPr>
+              <w:t>Primaria</w:t>
+            </w:r>
+          </w:p>
+        </w:tc>
+        <w:tc>
+          <w:tcPr>
+            <w:tcW w:type="dxa" w:w="1197"/>
+            <w:vAlign w:val="center"/>
+            <w:tcMar>
+              <w:top w:w="72" w:type="dxa"/>
+              <w:left w:w="72" w:type="dxa"/>
+              <w:bottom w:w="72" w:type="dxa"/>
+              <w:right w:w="72" w:type="dxa"/>
+            </w:tcMar>
+          </w:tcPr>
+          <w:p>
+            <w:pPr>
+              <w:spacing w:line="240" w:lineRule="auto" w:before="0" w:after="0"/>
+              <w:ind w:left="0" w:firstLine="0"/>
+              <w:jc w:val="center"/>
+            </w:pPr>
+            <w:r>
+              <w:rPr>
+                <w:rFonts w:ascii="Times New Roman" w:hAnsi="Times New Roman"/>
+                <w:b w:val="0"/>
+                <w:sz w:val="24"/>
+              </w:rPr>
+              <w:t>Derivación a partir de mediciones experimentales del TFG</w:t>
+            </w:r>
+          </w:p>
+        </w:tc>
+        <w:tc>
+          <w:tcPr>
+            <w:tcW w:type="dxa" w:w="1197"/>
+            <w:vAlign w:val="center"/>
+            <w:tcMar>
+              <w:top w:w="72" w:type="dxa"/>
+              <w:left w:w="72" w:type="dxa"/>
+              <w:bottom w:w="72" w:type="dxa"/>
+              <w:right w:w="72" w:type="dxa"/>
+            </w:tcMar>
+          </w:tcPr>
+          <w:p>
+            <w:pPr>
+              <w:spacing w:line="240" w:lineRule="auto" w:before="0" w:after="0"/>
+              <w:ind w:left="0" w:firstLine="0"/>
+              <w:jc w:val="center"/>
+            </w:pPr>
+            <w:r>
+              <w:rPr>
+                <w:rFonts w:ascii="Times New Roman" w:hAnsi="Times New Roman"/>
+                <w:b w:val="0"/>
+                <w:sz w:val="24"/>
+              </w:rPr>
+              <w:t>Calculado por jornada e integrado estadísticamente</w:t>
+            </w:r>
+          </w:p>
+        </w:tc>
+        <w:tc>
+          <w:tcPr>
+            <w:tcW w:type="dxa" w:w="1197"/>
+            <w:vAlign w:val="center"/>
+            <w:tcMar>
+              <w:top w:w="72" w:type="dxa"/>
+              <w:left w:w="72" w:type="dxa"/>
+              <w:bottom w:w="72" w:type="dxa"/>
+              <w:right w:w="72" w:type="dxa"/>
+            </w:tcMar>
+          </w:tcPr>
+          <w:p>
+            <w:pPr>
+              <w:spacing w:line="240" w:lineRule="auto" w:before="0" w:after="0"/>
+              <w:ind w:left="0" w:firstLine="0"/>
+              <w:jc w:val="center"/>
+            </w:pPr>
+            <w:r>
+              <w:rPr>
+                <w:rFonts w:ascii="Times New Roman" w:hAnsi="Times New Roman"/>
+                <w:b w:val="0"/>
+                <w:sz w:val="24"/>
+              </w:rPr>
+              <w:t>Materia seca y cenizas determinadas en Bioenergía durante M1 y M2</w:t>
+            </w:r>
+          </w:p>
+        </w:tc>
+        <w:tc>
+          <w:tcPr>
+            <w:tcW w:type="dxa" w:w="1197"/>
+            <w:vAlign w:val="center"/>
+            <w:tcMar>
+              <w:top w:w="72" w:type="dxa"/>
+              <w:left w:w="72" w:type="dxa"/>
+              <w:bottom w:w="72" w:type="dxa"/>
+              <w:right w:w="72" w:type="dxa"/>
+            </w:tcMar>
+          </w:tcPr>
+          <w:p>
+            <w:pPr>
+              <w:spacing w:line="240" w:lineRule="auto" w:before="0" w:after="0"/>
+              <w:ind w:left="0" w:firstLine="0"/>
+              <w:jc w:val="center"/>
+            </w:pPr>
+            <w:r>
+              <w:rPr>
+                <w:rFonts w:ascii="Times New Roman" w:hAnsi="Times New Roman"/>
+                <w:b w:val="0"/>
+                <w:sz w:val="24"/>
+              </w:rPr>
+              <w:t>Conversión de masa húmeda entre A1 y A2</w:t>
+            </w:r>
+          </w:p>
+        </w:tc>
+      </w:tr>
+      <w:tr>
+        <w:trPr>
+          <w:cantSplit/>
+        </w:trPr>
+        <w:tc>
+          <w:tcPr>
+            <w:tcW w:type="dxa" w:w="1197"/>
+            <w:vAlign w:val="center"/>
+            <w:tcMar>
+              <w:top w:w="72" w:type="dxa"/>
+              <w:left w:w="72" w:type="dxa"/>
+              <w:bottom w:w="72" w:type="dxa"/>
+              <w:right w:w="72" w:type="dxa"/>
+            </w:tcMar>
+          </w:tcPr>
+          <w:p>
+            <w:pPr>
+              <w:spacing w:line="240" w:lineRule="auto" w:before="0" w:after="0"/>
+              <w:ind w:left="0" w:firstLine="0"/>
+              <w:jc w:val="center"/>
+            </w:pPr>
+            <w:r>
+              <w:rPr>
+                <w:rFonts w:ascii="Times New Roman" w:hAnsi="Times New Roman"/>
+                <w:b w:val="0"/>
+                <w:sz w:val="24"/>
+              </w:rPr>
+              <w:t>Factores y procedimientos IPCC para manejo y suelos</w:t>
+            </w:r>
+          </w:p>
+        </w:tc>
+        <w:tc>
+          <w:tcPr>
+            <w:tcW w:type="dxa" w:w="1197"/>
+            <w:vAlign w:val="center"/>
+            <w:tcMar>
+              <w:top w:w="72" w:type="dxa"/>
+              <w:left w:w="72" w:type="dxa"/>
+              <w:bottom w:w="72" w:type="dxa"/>
+              <w:right w:w="72" w:type="dxa"/>
+            </w:tcMar>
+          </w:tcPr>
+          <w:p>
+            <w:pPr>
+              <w:spacing w:line="240" w:lineRule="auto" w:before="0" w:after="0"/>
+              <w:ind w:left="0" w:firstLine="0"/>
+              <w:jc w:val="center"/>
+            </w:pPr>
+            <w:r>
+              <w:rPr>
+                <w:rFonts w:ascii="Times New Roman" w:hAnsi="Times New Roman"/>
+                <w:b w:val="0"/>
+                <w:sz w:val="24"/>
+              </w:rPr>
+              <w:t>A1, A2, A3, A4, B1 y B2</w:t>
+            </w:r>
+          </w:p>
+        </w:tc>
+        <w:tc>
+          <w:tcPr>
+            <w:tcW w:type="dxa" w:w="1197"/>
+            <w:vAlign w:val="center"/>
+            <w:tcMar>
+              <w:top w:w="72" w:type="dxa"/>
+              <w:left w:w="72" w:type="dxa"/>
+              <w:bottom w:w="72" w:type="dxa"/>
+              <w:right w:w="72" w:type="dxa"/>
+            </w:tcMar>
+          </w:tcPr>
+          <w:p>
+            <w:pPr>
+              <w:spacing w:line="240" w:lineRule="auto" w:before="0" w:after="0"/>
+              <w:ind w:left="0" w:firstLine="0"/>
+              <w:jc w:val="center"/>
+            </w:pPr>
+            <w:r>
+              <w:rPr>
+                <w:rFonts w:ascii="Times New Roman" w:hAnsi="Times New Roman"/>
+                <w:b w:val="0"/>
+                <w:sz w:val="24"/>
+              </w:rPr>
+              <w:t>16 parámetros activos o de aseguramiento y control de la calidad con fuente IPCC</w:t>
+            </w:r>
+          </w:p>
+        </w:tc>
+        <w:tc>
+          <w:tcPr>
+            <w:tcW w:type="dxa" w:w="1197"/>
+            <w:vAlign w:val="center"/>
+            <w:tcMar>
+              <w:top w:w="72" w:type="dxa"/>
+              <w:left w:w="72" w:type="dxa"/>
+              <w:bottom w:w="72" w:type="dxa"/>
+              <w:right w:w="72" w:type="dxa"/>
+            </w:tcMar>
+          </w:tcPr>
+          <w:p>
+            <w:pPr>
+              <w:spacing w:line="240" w:lineRule="auto" w:before="0" w:after="0"/>
+              <w:ind w:left="0" w:firstLine="0"/>
+              <w:jc w:val="center"/>
+            </w:pPr>
+            <w:r>
+              <w:rPr>
+                <w:rFonts w:ascii="Times New Roman" w:hAnsi="Times New Roman"/>
+                <w:b w:val="0"/>
+                <w:sz w:val="24"/>
+              </w:rPr>
+              <w:t>Secundaria</w:t>
+            </w:r>
+          </w:p>
+        </w:tc>
+        <w:tc>
+          <w:tcPr>
+            <w:tcW w:type="dxa" w:w="1197"/>
+            <w:vAlign w:val="center"/>
+            <w:tcMar>
+              <w:top w:w="72" w:type="dxa"/>
+              <w:left w:w="72" w:type="dxa"/>
+              <w:bottom w:w="72" w:type="dxa"/>
+              <w:right w:w="72" w:type="dxa"/>
+            </w:tcMar>
+          </w:tcPr>
+          <w:p>
+            <w:pPr>
+              <w:spacing w:line="240" w:lineRule="auto" w:before="0" w:after="0"/>
+              <w:ind w:left="0" w:firstLine="0"/>
+              <w:jc w:val="center"/>
+            </w:pPr>
+            <w:r>
+              <w:rPr>
+                <w:rFonts w:ascii="Times New Roman" w:hAnsi="Times New Roman"/>
+                <w:b w:val="0"/>
+                <w:sz w:val="24"/>
+              </w:rPr>
+              <w:t>Guía metodológica oficial internacional</w:t>
+            </w:r>
+          </w:p>
+        </w:tc>
+        <w:tc>
+          <w:tcPr>
+            <w:tcW w:type="dxa" w:w="1197"/>
+            <w:vAlign w:val="center"/>
+            <w:tcMar>
+              <w:top w:w="72" w:type="dxa"/>
+              <w:left w:w="72" w:type="dxa"/>
+              <w:bottom w:w="72" w:type="dxa"/>
+              <w:right w:w="72" w:type="dxa"/>
+            </w:tcMar>
+          </w:tcPr>
+          <w:p>
+            <w:pPr>
+              <w:spacing w:line="240" w:lineRule="auto" w:before="0" w:after="0"/>
+              <w:ind w:left="0" w:firstLine="0"/>
+              <w:jc w:val="center"/>
+            </w:pPr>
+            <w:r>
+              <w:rPr>
+                <w:rFonts w:ascii="Times New Roman" w:hAnsi="Times New Roman"/>
+                <w:b w:val="0"/>
+                <w:sz w:val="24"/>
+              </w:rPr>
+              <w:t>Factor metodológico</w:t>
+            </w:r>
+          </w:p>
+        </w:tc>
+        <w:tc>
+          <w:tcPr>
+            <w:tcW w:type="dxa" w:w="1197"/>
+            <w:vAlign w:val="center"/>
+            <w:tcMar>
+              <w:top w:w="72" w:type="dxa"/>
+              <w:left w:w="72" w:type="dxa"/>
+              <w:bottom w:w="72" w:type="dxa"/>
+              <w:right w:w="72" w:type="dxa"/>
+            </w:tcMar>
+          </w:tcPr>
+          <w:p>
+            <w:pPr>
+              <w:spacing w:line="240" w:lineRule="auto" w:before="0" w:after="0"/>
+              <w:ind w:left="0" w:firstLine="0"/>
+              <w:jc w:val="center"/>
+            </w:pPr>
+            <w:r>
+              <w:rPr>
+                <w:rFonts w:ascii="Times New Roman" w:hAnsi="Times New Roman"/>
+                <w:b w:val="0"/>
+                <w:sz w:val="24"/>
+              </w:rPr>
+              <w:t>Refinamiento 2019 de las Directrices IPCC de 2006</w:t>
+            </w:r>
+          </w:p>
+        </w:tc>
+        <w:tc>
+          <w:tcPr>
+            <w:tcW w:type="dxa" w:w="1197"/>
+            <w:vAlign w:val="center"/>
+            <w:tcMar>
+              <w:top w:w="72" w:type="dxa"/>
+              <w:left w:w="72" w:type="dxa"/>
+              <w:bottom w:w="72" w:type="dxa"/>
+              <w:right w:w="72" w:type="dxa"/>
+            </w:tcMar>
+          </w:tcPr>
+          <w:p>
+            <w:pPr>
+              <w:spacing w:line="240" w:lineRule="auto" w:before="0" w:after="0"/>
+              <w:ind w:left="0" w:firstLine="0"/>
+              <w:jc w:val="center"/>
+            </w:pPr>
+            <w:r>
+              <w:rPr>
+                <w:rFonts w:ascii="Times New Roman" w:hAnsi="Times New Roman"/>
+                <w:b w:val="0"/>
+                <w:sz w:val="24"/>
+              </w:rPr>
+              <w:t>Estimación de CH₄, N₂O y rutas hídricas de nitrógeno</w:t>
+            </w:r>
+          </w:p>
+        </w:tc>
+      </w:tr>
+      <w:tr>
+        <w:trPr>
+          <w:cantSplit/>
+        </w:trPr>
+        <w:tc>
+          <w:tcPr>
+            <w:tcW w:type="dxa" w:w="1197"/>
+            <w:vAlign w:val="center"/>
+            <w:tcMar>
+              <w:top w:w="72" w:type="dxa"/>
+              <w:left w:w="72" w:type="dxa"/>
+              <w:bottom w:w="72" w:type="dxa"/>
+              <w:right w:w="72" w:type="dxa"/>
+            </w:tcMar>
+          </w:tcPr>
+          <w:p>
+            <w:pPr>
+              <w:spacing w:line="240" w:lineRule="auto" w:before="0" w:after="0"/>
+              <w:ind w:left="0" w:firstLine="0"/>
+              <w:jc w:val="center"/>
+            </w:pPr>
+            <w:r>
+              <w:rPr>
+                <w:rFonts w:ascii="Times New Roman" w:hAnsi="Times New Roman"/>
+                <w:b w:val="0"/>
+                <w:sz w:val="24"/>
+              </w:rPr>
+              <w:t>Factores EMEP/EEA de nitrógeno reactivo</w:t>
+            </w:r>
+          </w:p>
+        </w:tc>
+        <w:tc>
+          <w:tcPr>
+            <w:tcW w:type="dxa" w:w="1197"/>
+            <w:vAlign w:val="center"/>
+            <w:tcMar>
+              <w:top w:w="72" w:type="dxa"/>
+              <w:left w:w="72" w:type="dxa"/>
+              <w:bottom w:w="72" w:type="dxa"/>
+              <w:right w:w="72" w:type="dxa"/>
+            </w:tcMar>
+          </w:tcPr>
+          <w:p>
+            <w:pPr>
+              <w:spacing w:line="240" w:lineRule="auto" w:before="0" w:after="0"/>
+              <w:ind w:left="0" w:firstLine="0"/>
+              <w:jc w:val="center"/>
+            </w:pPr>
+            <w:r>
+              <w:rPr>
+                <w:rFonts w:ascii="Times New Roman" w:hAnsi="Times New Roman"/>
+                <w:b w:val="0"/>
+                <w:sz w:val="24"/>
+              </w:rPr>
+              <w:t>A1, A2, A3, A4, B1 y B2</w:t>
+            </w:r>
+          </w:p>
+        </w:tc>
+        <w:tc>
+          <w:tcPr>
+            <w:tcW w:type="dxa" w:w="1197"/>
+            <w:vAlign w:val="center"/>
+            <w:tcMar>
+              <w:top w:w="72" w:type="dxa"/>
+              <w:left w:w="72" w:type="dxa"/>
+              <w:bottom w:w="72" w:type="dxa"/>
+              <w:right w:w="72" w:type="dxa"/>
+            </w:tcMar>
+          </w:tcPr>
+          <w:p>
+            <w:pPr>
+              <w:spacing w:line="240" w:lineRule="auto" w:before="0" w:after="0"/>
+              <w:ind w:left="0" w:firstLine="0"/>
+              <w:jc w:val="center"/>
+            </w:pPr>
+            <w:r>
+              <w:rPr>
+                <w:rFonts w:ascii="Times New Roman" w:hAnsi="Times New Roman"/>
+                <w:b w:val="0"/>
+                <w:sz w:val="24"/>
+              </w:rPr>
+              <w:t>10 parámetros activos</w:t>
+            </w:r>
+          </w:p>
+        </w:tc>
+        <w:tc>
+          <w:tcPr>
+            <w:tcW w:type="dxa" w:w="1197"/>
+            <w:vAlign w:val="center"/>
+            <w:tcMar>
+              <w:top w:w="72" w:type="dxa"/>
+              <w:left w:w="72" w:type="dxa"/>
+              <w:bottom w:w="72" w:type="dxa"/>
+              <w:right w:w="72" w:type="dxa"/>
+            </w:tcMar>
+          </w:tcPr>
+          <w:p>
+            <w:pPr>
+              <w:spacing w:line="240" w:lineRule="auto" w:before="0" w:after="0"/>
+              <w:ind w:left="0" w:firstLine="0"/>
+              <w:jc w:val="center"/>
+            </w:pPr>
+            <w:r>
+              <w:rPr>
+                <w:rFonts w:ascii="Times New Roman" w:hAnsi="Times New Roman"/>
+                <w:b w:val="0"/>
+                <w:sz w:val="24"/>
+              </w:rPr>
+              <w:t>Secundaria</w:t>
+            </w:r>
+          </w:p>
+        </w:tc>
+        <w:tc>
+          <w:tcPr>
+            <w:tcW w:type="dxa" w:w="1197"/>
+            <w:vAlign w:val="center"/>
+            <w:tcMar>
+              <w:top w:w="72" w:type="dxa"/>
+              <w:left w:w="72" w:type="dxa"/>
+              <w:bottom w:w="72" w:type="dxa"/>
+              <w:right w:w="72" w:type="dxa"/>
+            </w:tcMar>
+          </w:tcPr>
+          <w:p>
+            <w:pPr>
+              <w:spacing w:line="240" w:lineRule="auto" w:before="0" w:after="0"/>
+              <w:ind w:left="0" w:firstLine="0"/>
+              <w:jc w:val="center"/>
+            </w:pPr>
+            <w:r>
+              <w:rPr>
+                <w:rFonts w:ascii="Times New Roman" w:hAnsi="Times New Roman"/>
+                <w:b w:val="0"/>
+                <w:sz w:val="24"/>
+              </w:rPr>
+              <w:t>Guía metodológica oficial de inventarios de emisiones</w:t>
+            </w:r>
+          </w:p>
+        </w:tc>
+        <w:tc>
+          <w:tcPr>
+            <w:tcW w:type="dxa" w:w="1197"/>
+            <w:vAlign w:val="center"/>
+            <w:tcMar>
+              <w:top w:w="72" w:type="dxa"/>
+              <w:left w:w="72" w:type="dxa"/>
+              <w:bottom w:w="72" w:type="dxa"/>
+              <w:right w:w="72" w:type="dxa"/>
+            </w:tcMar>
+          </w:tcPr>
+          <w:p>
+            <w:pPr>
+              <w:spacing w:line="240" w:lineRule="auto" w:before="0" w:after="0"/>
+              <w:ind w:left="0" w:firstLine="0"/>
+              <w:jc w:val="center"/>
+            </w:pPr>
+            <w:r>
+              <w:rPr>
+                <w:rFonts w:ascii="Times New Roman" w:hAnsi="Times New Roman"/>
+                <w:b w:val="0"/>
+                <w:sz w:val="24"/>
+              </w:rPr>
+              <w:t>Factor metodológico</w:t>
+            </w:r>
+          </w:p>
+        </w:tc>
+        <w:tc>
+          <w:tcPr>
+            <w:tcW w:type="dxa" w:w="1197"/>
+            <w:vAlign w:val="center"/>
+            <w:tcMar>
+              <w:top w:w="72" w:type="dxa"/>
+              <w:left w:w="72" w:type="dxa"/>
+              <w:bottom w:w="72" w:type="dxa"/>
+              <w:right w:w="72" w:type="dxa"/>
+            </w:tcMar>
+          </w:tcPr>
+          <w:p>
+            <w:pPr>
+              <w:spacing w:line="240" w:lineRule="auto" w:before="0" w:after="0"/>
+              <w:ind w:left="0" w:firstLine="0"/>
+              <w:jc w:val="center"/>
+            </w:pPr>
+            <w:r>
+              <w:rPr>
+                <w:rFonts w:ascii="Times New Roman" w:hAnsi="Times New Roman"/>
+                <w:b w:val="0"/>
+                <w:sz w:val="24"/>
+              </w:rPr>
+              <w:t>EMEP/EEA Air Pollutant Emission Inventory Guidebook 2023</w:t>
+            </w:r>
+          </w:p>
+        </w:tc>
+        <w:tc>
+          <w:tcPr>
+            <w:tcW w:type="dxa" w:w="1197"/>
+            <w:vAlign w:val="center"/>
+            <w:tcMar>
+              <w:top w:w="72" w:type="dxa"/>
+              <w:left w:w="72" w:type="dxa"/>
+              <w:bottom w:w="72" w:type="dxa"/>
+              <w:right w:w="72" w:type="dxa"/>
+            </w:tcMar>
+          </w:tcPr>
+          <w:p>
+            <w:pPr>
+              <w:spacing w:line="240" w:lineRule="auto" w:before="0" w:after="0"/>
+              <w:ind w:left="0" w:firstLine="0"/>
+              <w:jc w:val="center"/>
+            </w:pPr>
+            <w:r>
+              <w:rPr>
+                <w:rFonts w:ascii="Times New Roman" w:hAnsi="Times New Roman"/>
+                <w:b w:val="0"/>
+                <w:sz w:val="24"/>
+              </w:rPr>
+              <w:t>Inicialización y pérdidas explícitas de TAN, NH₃, NO y N₂</w:t>
+            </w:r>
+          </w:p>
+        </w:tc>
+      </w:tr>
+      <w:tr>
+        <w:trPr>
+          <w:cantSplit/>
+        </w:trPr>
+        <w:tc>
+          <w:tcPr>
+            <w:tcW w:type="dxa" w:w="1197"/>
+            <w:vAlign w:val="center"/>
+            <w:tcMar>
+              <w:top w:w="72" w:type="dxa"/>
+              <w:left w:w="72" w:type="dxa"/>
+              <w:bottom w:w="72" w:type="dxa"/>
+              <w:right w:w="72" w:type="dxa"/>
+            </w:tcMar>
+          </w:tcPr>
+          <w:p>
+            <w:pPr>
+              <w:spacing w:line="240" w:lineRule="auto" w:before="0" w:after="0"/>
+              <w:ind w:left="0" w:firstLine="0"/>
+              <w:jc w:val="center"/>
+            </w:pPr>
+            <w:r>
+              <w:rPr>
+                <w:rFonts w:ascii="Times New Roman" w:hAnsi="Times New Roman"/>
+                <w:b w:val="0"/>
+                <w:sz w:val="24"/>
+              </w:rPr>
+              <w:t>Factor experimental de NH₃ utilizado como aproximación en A2</w:t>
+            </w:r>
+          </w:p>
+        </w:tc>
+        <w:tc>
+          <w:tcPr>
+            <w:tcW w:type="dxa" w:w="1197"/>
+            <w:vAlign w:val="center"/>
+            <w:tcMar>
+              <w:top w:w="72" w:type="dxa"/>
+              <w:left w:w="72" w:type="dxa"/>
+              <w:bottom w:w="72" w:type="dxa"/>
+              <w:right w:w="72" w:type="dxa"/>
+            </w:tcMar>
+          </w:tcPr>
+          <w:p>
+            <w:pPr>
+              <w:spacing w:line="240" w:lineRule="auto" w:before="0" w:after="0"/>
+              <w:ind w:left="0" w:firstLine="0"/>
+              <w:jc w:val="center"/>
+            </w:pPr>
+            <w:r>
+              <w:rPr>
+                <w:rFonts w:ascii="Times New Roman" w:hAnsi="Times New Roman"/>
+                <w:b w:val="0"/>
+                <w:sz w:val="24"/>
+              </w:rPr>
+              <w:t>A2</w:t>
+            </w:r>
+          </w:p>
+        </w:tc>
+        <w:tc>
+          <w:tcPr>
+            <w:tcW w:type="dxa" w:w="1197"/>
+            <w:vAlign w:val="center"/>
+            <w:tcMar>
+              <w:top w:w="72" w:type="dxa"/>
+              <w:left w:w="72" w:type="dxa"/>
+              <w:bottom w:w="72" w:type="dxa"/>
+              <w:right w:w="72" w:type="dxa"/>
+            </w:tcMar>
+          </w:tcPr>
+          <w:p>
+            <w:pPr>
+              <w:spacing w:line="240" w:lineRule="auto" w:before="0" w:after="0"/>
+              <w:ind w:left="0" w:firstLine="0"/>
+              <w:jc w:val="center"/>
+            </w:pPr>
+            <w:r>
+              <w:rPr>
+                <w:rFonts w:ascii="Times New Roman" w:hAnsi="Times New Roman"/>
+                <w:b w:val="0"/>
+                <w:sz w:val="24"/>
+              </w:rPr>
+              <w:t>1 factor activo de literatura científica</w:t>
+            </w:r>
+          </w:p>
+        </w:tc>
+        <w:tc>
+          <w:tcPr>
+            <w:tcW w:type="dxa" w:w="1197"/>
+            <w:vAlign w:val="center"/>
+            <w:tcMar>
+              <w:top w:w="72" w:type="dxa"/>
+              <w:left w:w="72" w:type="dxa"/>
+              <w:bottom w:w="72" w:type="dxa"/>
+              <w:right w:w="72" w:type="dxa"/>
+            </w:tcMar>
+          </w:tcPr>
+          <w:p>
+            <w:pPr>
+              <w:spacing w:line="240" w:lineRule="auto" w:before="0" w:after="0"/>
+              <w:ind w:left="0" w:firstLine="0"/>
+              <w:jc w:val="center"/>
+            </w:pPr>
+            <w:r>
+              <w:rPr>
+                <w:rFonts w:ascii="Times New Roman" w:hAnsi="Times New Roman"/>
+                <w:b w:val="0"/>
+                <w:sz w:val="24"/>
+              </w:rPr>
+              <w:t>Secundaria</w:t>
+            </w:r>
+          </w:p>
+        </w:tc>
+        <w:tc>
+          <w:tcPr>
+            <w:tcW w:type="dxa" w:w="1197"/>
+            <w:vAlign w:val="center"/>
+            <w:tcMar>
+              <w:top w:w="72" w:type="dxa"/>
+              <w:left w:w="72" w:type="dxa"/>
+              <w:bottom w:w="72" w:type="dxa"/>
+              <w:right w:w="72" w:type="dxa"/>
+            </w:tcMar>
+          </w:tcPr>
+          <w:p>
+            <w:pPr>
+              <w:spacing w:line="240" w:lineRule="auto" w:before="0" w:after="0"/>
+              <w:ind w:left="0" w:firstLine="0"/>
+              <w:jc w:val="center"/>
+            </w:pPr>
+            <w:r>
+              <w:rPr>
+                <w:rFonts w:ascii="Times New Roman" w:hAnsi="Times New Roman"/>
+                <w:b w:val="0"/>
+                <w:sz w:val="24"/>
+              </w:rPr>
+              <w:t>Artículo científico utilizado como aproximación cuantitativa</w:t>
+            </w:r>
+          </w:p>
+        </w:tc>
+        <w:tc>
+          <w:tcPr>
+            <w:tcW w:type="dxa" w:w="1197"/>
+            <w:vAlign w:val="center"/>
+            <w:tcMar>
+              <w:top w:w="72" w:type="dxa"/>
+              <w:left w:w="72" w:type="dxa"/>
+              <w:bottom w:w="72" w:type="dxa"/>
+              <w:right w:w="72" w:type="dxa"/>
+            </w:tcMar>
+          </w:tcPr>
+          <w:p>
+            <w:pPr>
+              <w:spacing w:line="240" w:lineRule="auto" w:before="0" w:after="0"/>
+              <w:ind w:left="0" w:firstLine="0"/>
+              <w:jc w:val="center"/>
+            </w:pPr>
+            <w:r>
+              <w:rPr>
+                <w:rFonts w:ascii="Times New Roman" w:hAnsi="Times New Roman"/>
+                <w:b w:val="0"/>
+                <w:sz w:val="24"/>
+              </w:rPr>
+              <w:t>Factor metodológico de literatura</w:t>
+            </w:r>
+          </w:p>
+        </w:tc>
+        <w:tc>
+          <w:tcPr>
+            <w:tcW w:type="dxa" w:w="1197"/>
+            <w:vAlign w:val="center"/>
+            <w:tcMar>
+              <w:top w:w="72" w:type="dxa"/>
+              <w:left w:w="72" w:type="dxa"/>
+              <w:bottom w:w="72" w:type="dxa"/>
+              <w:right w:w="72" w:type="dxa"/>
+            </w:tcMar>
+          </w:tcPr>
+          <w:p>
+            <w:pPr>
+              <w:spacing w:line="240" w:lineRule="auto" w:before="0" w:after="0"/>
+              <w:ind w:left="0" w:firstLine="0"/>
+              <w:jc w:val="center"/>
+            </w:pPr>
+            <w:r>
+              <w:rPr>
+                <w:rFonts w:ascii="Times New Roman" w:hAnsi="Times New Roman"/>
+                <w:b w:val="0"/>
+                <w:sz w:val="24"/>
+              </w:rPr>
+              <w:t>Komakech et al. (2016)</w:t>
+            </w:r>
+          </w:p>
+        </w:tc>
+        <w:tc>
+          <w:tcPr>
+            <w:tcW w:type="dxa" w:w="1197"/>
+            <w:vAlign w:val="center"/>
+            <w:tcMar>
+              <w:top w:w="72" w:type="dxa"/>
+              <w:left w:w="72" w:type="dxa"/>
+              <w:bottom w:w="72" w:type="dxa"/>
+              <w:right w:w="72" w:type="dxa"/>
+            </w:tcMar>
+          </w:tcPr>
+          <w:p>
+            <w:pPr>
+              <w:spacing w:line="240" w:lineRule="auto" w:before="0" w:after="0"/>
+              <w:ind w:left="0" w:firstLine="0"/>
+              <w:jc w:val="center"/>
+            </w:pPr>
+            <w:r>
+              <w:rPr>
+                <w:rFonts w:ascii="Times New Roman" w:hAnsi="Times New Roman"/>
+                <w:b w:val="0"/>
+                <w:sz w:val="24"/>
+              </w:rPr>
+              <w:t>Estimación de NH₃ en A2</w:t>
+            </w:r>
+          </w:p>
+        </w:tc>
+      </w:tr>
+      <w:tr>
+        <w:trPr>
+          <w:cantSplit/>
+        </w:trPr>
+        <w:tc>
+          <w:tcPr>
+            <w:tcW w:type="dxa" w:w="1197"/>
+            <w:vAlign w:val="center"/>
+            <w:tcMar>
+              <w:top w:w="72" w:type="dxa"/>
+              <w:left w:w="72" w:type="dxa"/>
+              <w:bottom w:w="72" w:type="dxa"/>
+              <w:right w:w="72" w:type="dxa"/>
+            </w:tcMar>
+          </w:tcPr>
+          <w:p>
+            <w:pPr>
+              <w:spacing w:line="240" w:lineRule="auto" w:before="0" w:after="0"/>
+              <w:ind w:left="0" w:firstLine="0"/>
+              <w:jc w:val="center"/>
+            </w:pPr>
+            <w:r>
+              <w:rPr>
+                <w:rFonts w:ascii="Times New Roman" w:hAnsi="Times New Roman"/>
+                <w:b w:val="0"/>
+                <w:sz w:val="24"/>
+              </w:rPr>
+              <w:t>Factores nacionales para recursos energéticos</w:t>
+            </w:r>
+          </w:p>
+        </w:tc>
+        <w:tc>
+          <w:tcPr>
+            <w:tcW w:type="dxa" w:w="1197"/>
+            <w:vAlign w:val="center"/>
+            <w:tcMar>
+              <w:top w:w="72" w:type="dxa"/>
+              <w:left w:w="72" w:type="dxa"/>
+              <w:bottom w:w="72" w:type="dxa"/>
+              <w:right w:w="72" w:type="dxa"/>
+            </w:tcMar>
+          </w:tcPr>
+          <w:p>
+            <w:pPr>
+              <w:spacing w:line="240" w:lineRule="auto" w:before="0" w:after="0"/>
+              <w:ind w:left="0" w:firstLine="0"/>
+              <w:jc w:val="center"/>
+            </w:pPr>
+            <w:r>
+              <w:rPr>
+                <w:rFonts w:ascii="Times New Roman" w:hAnsi="Times New Roman"/>
+                <w:b w:val="0"/>
+                <w:sz w:val="24"/>
+              </w:rPr>
+              <w:t>A3, A4, B1 y B2</w:t>
+            </w:r>
+          </w:p>
+        </w:tc>
+        <w:tc>
+          <w:tcPr>
+            <w:tcW w:type="dxa" w:w="1197"/>
+            <w:vAlign w:val="center"/>
+            <w:tcMar>
+              <w:top w:w="72" w:type="dxa"/>
+              <w:left w:w="72" w:type="dxa"/>
+              <w:bottom w:w="72" w:type="dxa"/>
+              <w:right w:w="72" w:type="dxa"/>
+            </w:tcMar>
+          </w:tcPr>
+          <w:p>
+            <w:pPr>
+              <w:spacing w:line="240" w:lineRule="auto" w:before="0" w:after="0"/>
+              <w:ind w:left="0" w:firstLine="0"/>
+              <w:jc w:val="center"/>
+            </w:pPr>
+            <w:r>
+              <w:rPr>
+                <w:rFonts w:ascii="Times New Roman" w:hAnsi="Times New Roman"/>
+                <w:b w:val="0"/>
+                <w:sz w:val="24"/>
+              </w:rPr>
+              <w:t>4 factores aprobados</w:t>
+            </w:r>
+          </w:p>
+        </w:tc>
+        <w:tc>
+          <w:tcPr>
+            <w:tcW w:type="dxa" w:w="1197"/>
+            <w:vAlign w:val="center"/>
+            <w:tcMar>
+              <w:top w:w="72" w:type="dxa"/>
+              <w:left w:w="72" w:type="dxa"/>
+              <w:bottom w:w="72" w:type="dxa"/>
+              <w:right w:w="72" w:type="dxa"/>
+            </w:tcMar>
+          </w:tcPr>
+          <w:p>
+            <w:pPr>
+              <w:spacing w:line="240" w:lineRule="auto" w:before="0" w:after="0"/>
+              <w:ind w:left="0" w:firstLine="0"/>
+              <w:jc w:val="center"/>
+            </w:pPr>
+            <w:r>
+              <w:rPr>
+                <w:rFonts w:ascii="Times New Roman" w:hAnsi="Times New Roman"/>
+                <w:b w:val="0"/>
+                <w:sz w:val="24"/>
+              </w:rPr>
+              <w:t>Secundaria</w:t>
+            </w:r>
+          </w:p>
+        </w:tc>
+        <w:tc>
+          <w:tcPr>
+            <w:tcW w:type="dxa" w:w="1197"/>
+            <w:vAlign w:val="center"/>
+            <w:tcMar>
+              <w:top w:w="72" w:type="dxa"/>
+              <w:left w:w="72" w:type="dxa"/>
+              <w:bottom w:w="72" w:type="dxa"/>
+              <w:right w:w="72" w:type="dxa"/>
+            </w:tcMar>
+          </w:tcPr>
+          <w:p>
+            <w:pPr>
+              <w:spacing w:line="240" w:lineRule="auto" w:before="0" w:after="0"/>
+              <w:ind w:left="0" w:firstLine="0"/>
+              <w:jc w:val="center"/>
+            </w:pPr>
+            <w:r>
+              <w:rPr>
+                <w:rFonts w:ascii="Times New Roman" w:hAnsi="Times New Roman"/>
+                <w:b w:val="0"/>
+                <w:sz w:val="24"/>
+              </w:rPr>
+              <w:t>Documento técnico oficial nacional</w:t>
+            </w:r>
+          </w:p>
+        </w:tc>
+        <w:tc>
+          <w:tcPr>
+            <w:tcW w:type="dxa" w:w="1197"/>
+            <w:vAlign w:val="center"/>
+            <w:tcMar>
+              <w:top w:w="72" w:type="dxa"/>
+              <w:left w:w="72" w:type="dxa"/>
+              <w:bottom w:w="72" w:type="dxa"/>
+              <w:right w:w="72" w:type="dxa"/>
+            </w:tcMar>
+          </w:tcPr>
+          <w:p>
+            <w:pPr>
+              <w:spacing w:line="240" w:lineRule="auto" w:before="0" w:after="0"/>
+              <w:ind w:left="0" w:firstLine="0"/>
+              <w:jc w:val="center"/>
+            </w:pPr>
+            <w:r>
+              <w:rPr>
+                <w:rFonts w:ascii="Times New Roman" w:hAnsi="Times New Roman"/>
+                <w:b w:val="0"/>
+                <w:sz w:val="24"/>
+              </w:rPr>
+              <w:t>Factor de emisión o consumo agregado</w:t>
+            </w:r>
+          </w:p>
+        </w:tc>
+        <w:tc>
+          <w:tcPr>
+            <w:tcW w:type="dxa" w:w="1197"/>
+            <w:vAlign w:val="center"/>
+            <w:tcMar>
+              <w:top w:w="72" w:type="dxa"/>
+              <w:left w:w="72" w:type="dxa"/>
+              <w:bottom w:w="72" w:type="dxa"/>
+              <w:right w:w="72" w:type="dxa"/>
+            </w:tcMar>
+          </w:tcPr>
+          <w:p>
+            <w:pPr>
+              <w:spacing w:line="240" w:lineRule="auto" w:before="0" w:after="0"/>
+              <w:ind w:left="0" w:firstLine="0"/>
+              <w:jc w:val="center"/>
+            </w:pPr>
+            <w:r>
+              <w:rPr>
+                <w:rFonts w:ascii="Times New Roman" w:hAnsi="Times New Roman"/>
+                <w:b w:val="0"/>
+                <w:sz w:val="24"/>
+              </w:rPr>
+              <w:t>Instituto Meteorológico Nacional, Factores de emisión de gases de efecto invernadero (2026)</w:t>
+            </w:r>
+          </w:p>
+        </w:tc>
+        <w:tc>
+          <w:tcPr>
+            <w:tcW w:type="dxa" w:w="1197"/>
+            <w:vAlign w:val="center"/>
+            <w:tcMar>
+              <w:top w:w="72" w:type="dxa"/>
+              <w:left w:w="72" w:type="dxa"/>
+              <w:bottom w:w="72" w:type="dxa"/>
+              <w:right w:w="72" w:type="dxa"/>
+            </w:tcMar>
+          </w:tcPr>
+          <w:p>
+            <w:pPr>
+              <w:spacing w:line="240" w:lineRule="auto" w:before="0" w:after="0"/>
+              <w:ind w:left="0" w:firstLine="0"/>
+              <w:jc w:val="center"/>
+            </w:pPr>
+            <w:r>
+              <w:rPr>
+                <w:rFonts w:ascii="Times New Roman" w:hAnsi="Times New Roman"/>
+                <w:b w:val="0"/>
+                <w:sz w:val="24"/>
+              </w:rPr>
+              <w:t>Emisiones asociadas con electricidad y combustión de diésel</w:t>
+            </w:r>
+          </w:p>
+        </w:tc>
+      </w:tr>
+      <w:tr>
+        <w:trPr>
+          <w:cantSplit/>
+        </w:trPr>
+        <w:tc>
+          <w:tcPr>
+            <w:tcW w:type="dxa" w:w="1197"/>
+            <w:vAlign w:val="center"/>
+            <w:tcMar>
+              <w:top w:w="72" w:type="dxa"/>
+              <w:left w:w="72" w:type="dxa"/>
+              <w:bottom w:w="72" w:type="dxa"/>
+              <w:right w:w="72" w:type="dxa"/>
+            </w:tcMar>
+          </w:tcPr>
+          <w:p>
+            <w:pPr>
+              <w:spacing w:line="240" w:lineRule="auto" w:before="0" w:after="0"/>
+              <w:ind w:left="0" w:firstLine="0"/>
+              <w:jc w:val="center"/>
+            </w:pPr>
+            <w:r>
+              <w:rPr>
+                <w:rFonts w:ascii="Times New Roman" w:hAnsi="Times New Roman"/>
+                <w:b w:val="0"/>
+                <w:sz w:val="24"/>
+              </w:rPr>
+              <w:t>Factores de caracterización de impacto</w:t>
+            </w:r>
+          </w:p>
+        </w:tc>
+        <w:tc>
+          <w:tcPr>
+            <w:tcW w:type="dxa" w:w="1197"/>
+            <w:vAlign w:val="center"/>
+            <w:tcMar>
+              <w:top w:w="72" w:type="dxa"/>
+              <w:left w:w="72" w:type="dxa"/>
+              <w:bottom w:w="72" w:type="dxa"/>
+              <w:right w:w="72" w:type="dxa"/>
+            </w:tcMar>
+          </w:tcPr>
+          <w:p>
+            <w:pPr>
+              <w:spacing w:line="240" w:lineRule="auto" w:before="0" w:after="0"/>
+              <w:ind w:left="0" w:firstLine="0"/>
+              <w:jc w:val="center"/>
+            </w:pPr>
+            <w:r>
+              <w:rPr>
+                <w:rFonts w:ascii="Times New Roman" w:hAnsi="Times New Roman"/>
+                <w:b w:val="0"/>
+                <w:sz w:val="24"/>
+              </w:rPr>
+              <w:t>A1, A2, A3, A4, B1 y B2</w:t>
+            </w:r>
+          </w:p>
+        </w:tc>
+        <w:tc>
+          <w:tcPr>
+            <w:tcW w:type="dxa" w:w="1197"/>
+            <w:vAlign w:val="center"/>
+            <w:tcMar>
+              <w:top w:w="72" w:type="dxa"/>
+              <w:left w:w="72" w:type="dxa"/>
+              <w:bottom w:w="72" w:type="dxa"/>
+              <w:right w:w="72" w:type="dxa"/>
+            </w:tcMar>
+          </w:tcPr>
+          <w:p>
+            <w:pPr>
+              <w:spacing w:line="240" w:lineRule="auto" w:before="0" w:after="0"/>
+              <w:ind w:left="0" w:firstLine="0"/>
+              <w:jc w:val="center"/>
+            </w:pPr>
+            <w:r>
+              <w:rPr>
+                <w:rFonts w:ascii="Times New Roman" w:hAnsi="Times New Roman"/>
+                <w:b w:val="0"/>
+                <w:sz w:val="24"/>
+              </w:rPr>
+              <w:t>9 correspondencias flujo–categoría</w:t>
+            </w:r>
+          </w:p>
+        </w:tc>
+        <w:tc>
+          <w:tcPr>
+            <w:tcW w:type="dxa" w:w="1197"/>
+            <w:vAlign w:val="center"/>
+            <w:tcMar>
+              <w:top w:w="72" w:type="dxa"/>
+              <w:left w:w="72" w:type="dxa"/>
+              <w:bottom w:w="72" w:type="dxa"/>
+              <w:right w:w="72" w:type="dxa"/>
+            </w:tcMar>
+          </w:tcPr>
+          <w:p>
+            <w:pPr>
+              <w:spacing w:line="240" w:lineRule="auto" w:before="0" w:after="0"/>
+              <w:ind w:left="0" w:firstLine="0"/>
+              <w:jc w:val="center"/>
+            </w:pPr>
+            <w:r>
+              <w:rPr>
+                <w:rFonts w:ascii="Times New Roman" w:hAnsi="Times New Roman"/>
+                <w:b w:val="0"/>
+                <w:sz w:val="24"/>
+              </w:rPr>
+              <w:t>Secundaria</w:t>
+            </w:r>
+          </w:p>
+        </w:tc>
+        <w:tc>
+          <w:tcPr>
+            <w:tcW w:type="dxa" w:w="1197"/>
+            <w:vAlign w:val="center"/>
+            <w:tcMar>
+              <w:top w:w="72" w:type="dxa"/>
+              <w:left w:w="72" w:type="dxa"/>
+              <w:bottom w:w="72" w:type="dxa"/>
+              <w:right w:w="72" w:type="dxa"/>
+            </w:tcMar>
+          </w:tcPr>
+          <w:p>
+            <w:pPr>
+              <w:spacing w:line="240" w:lineRule="auto" w:before="0" w:after="0"/>
+              <w:ind w:left="0" w:firstLine="0"/>
+              <w:jc w:val="center"/>
+            </w:pPr>
+            <w:r>
+              <w:rPr>
+                <w:rFonts w:ascii="Times New Roman" w:hAnsi="Times New Roman"/>
+                <w:b w:val="0"/>
+                <w:sz w:val="24"/>
+              </w:rPr>
+              <w:t>Método oficial de evaluación de impacto</w:t>
+            </w:r>
+          </w:p>
+        </w:tc>
+        <w:tc>
+          <w:tcPr>
+            <w:tcW w:type="dxa" w:w="1197"/>
+            <w:vAlign w:val="center"/>
+            <w:tcMar>
+              <w:top w:w="72" w:type="dxa"/>
+              <w:left w:w="72" w:type="dxa"/>
+              <w:bottom w:w="72" w:type="dxa"/>
+              <w:right w:w="72" w:type="dxa"/>
+            </w:tcMar>
+          </w:tcPr>
+          <w:p>
+            <w:pPr>
+              <w:spacing w:line="240" w:lineRule="auto" w:before="0" w:after="0"/>
+              <w:ind w:left="0" w:firstLine="0"/>
+              <w:jc w:val="center"/>
+            </w:pPr>
+            <w:r>
+              <w:rPr>
+                <w:rFonts w:ascii="Times New Roman" w:hAnsi="Times New Roman"/>
+                <w:b w:val="0"/>
+                <w:sz w:val="24"/>
+              </w:rPr>
+              <w:t>Factor de caracterización</w:t>
+            </w:r>
+          </w:p>
+        </w:tc>
+        <w:tc>
+          <w:tcPr>
+            <w:tcW w:type="dxa" w:w="1197"/>
+            <w:vAlign w:val="center"/>
+            <w:tcMar>
+              <w:top w:w="72" w:type="dxa"/>
+              <w:left w:w="72" w:type="dxa"/>
+              <w:bottom w:w="72" w:type="dxa"/>
+              <w:right w:w="72" w:type="dxa"/>
+            </w:tcMar>
+          </w:tcPr>
+          <w:p>
+            <w:pPr>
+              <w:spacing w:line="240" w:lineRule="auto" w:before="0" w:after="0"/>
+              <w:ind w:left="0" w:firstLine="0"/>
+              <w:jc w:val="center"/>
+            </w:pPr>
+            <w:r>
+              <w:rPr>
+                <w:rFonts w:ascii="Times New Roman" w:hAnsi="Times New Roman"/>
+                <w:b w:val="0"/>
+                <w:sz w:val="24"/>
+              </w:rPr>
+              <w:t>Environmental Footprint 3.1 de la Comisión Europea y el JRC</w:t>
+            </w:r>
+          </w:p>
+        </w:tc>
+        <w:tc>
+          <w:tcPr>
+            <w:tcW w:type="dxa" w:w="1197"/>
+            <w:vAlign w:val="center"/>
+            <w:tcMar>
+              <w:top w:w="72" w:type="dxa"/>
+              <w:left w:w="72" w:type="dxa"/>
+              <w:bottom w:w="72" w:type="dxa"/>
+              <w:right w:w="72" w:type="dxa"/>
+            </w:tcMar>
+          </w:tcPr>
+          <w:p>
+            <w:pPr>
+              <w:spacing w:line="240" w:lineRule="auto" w:before="0" w:after="0"/>
+              <w:ind w:left="0" w:firstLine="0"/>
+              <w:jc w:val="center"/>
+            </w:pPr>
+            <w:r>
+              <w:rPr>
+                <w:rFonts w:ascii="Times New Roman" w:hAnsi="Times New Roman"/>
+                <w:b w:val="0"/>
+                <w:sz w:val="24"/>
+              </w:rPr>
+              <w:t>Cambio climático, eutrofización terrestre y eutrofización marina</w:t>
+            </w:r>
+          </w:p>
+        </w:tc>
+      </w:tr>
+      <w:tr>
+        <w:trPr>
+          <w:cantSplit/>
+        </w:trPr>
+        <w:tc>
+          <w:tcPr>
+            <w:tcW w:type="dxa" w:w="1197"/>
+            <w:vAlign w:val="center"/>
+            <w:tcMar>
+              <w:top w:w="72" w:type="dxa"/>
+              <w:left w:w="72" w:type="dxa"/>
+              <w:bottom w:w="72" w:type="dxa"/>
+              <w:right w:w="72" w:type="dxa"/>
+            </w:tcMar>
+          </w:tcPr>
+          <w:p>
+            <w:pPr>
+              <w:spacing w:line="240" w:lineRule="auto" w:before="0" w:after="0"/>
+              <w:ind w:left="0" w:firstLine="0"/>
+              <w:jc w:val="center"/>
+            </w:pPr>
+            <w:r>
+              <w:rPr>
+                <w:rFonts w:ascii="Times New Roman" w:hAnsi="Times New Roman"/>
+                <w:b w:val="0"/>
+                <w:sz w:val="24"/>
+              </w:rPr>
+              <w:t>Masas, volúmenes y consumos del inventario</w:t>
+            </w:r>
+          </w:p>
+        </w:tc>
+        <w:tc>
+          <w:tcPr>
+            <w:tcW w:type="dxa" w:w="1197"/>
+            <w:vAlign w:val="center"/>
+            <w:tcMar>
+              <w:top w:w="72" w:type="dxa"/>
+              <w:left w:w="72" w:type="dxa"/>
+              <w:bottom w:w="72" w:type="dxa"/>
+              <w:right w:w="72" w:type="dxa"/>
+            </w:tcMar>
+          </w:tcPr>
+          <w:p>
+            <w:pPr>
+              <w:spacing w:line="240" w:lineRule="auto" w:before="0" w:after="0"/>
+              <w:ind w:left="0" w:firstLine="0"/>
+              <w:jc w:val="center"/>
+            </w:pPr>
+            <w:r>
+              <w:rPr>
+                <w:rFonts w:ascii="Times New Roman" w:hAnsi="Times New Roman"/>
+                <w:b w:val="0"/>
+                <w:sz w:val="24"/>
+              </w:rPr>
+              <w:t>A1, A2, A3, A4, B1 y B2</w:t>
+            </w:r>
+          </w:p>
+        </w:tc>
+        <w:tc>
+          <w:tcPr>
+            <w:tcW w:type="dxa" w:w="1197"/>
+            <w:vAlign w:val="center"/>
+            <w:tcMar>
+              <w:top w:w="72" w:type="dxa"/>
+              <w:left w:w="72" w:type="dxa"/>
+              <w:bottom w:w="72" w:type="dxa"/>
+              <w:right w:w="72" w:type="dxa"/>
+            </w:tcMar>
+          </w:tcPr>
+          <w:p>
+            <w:pPr>
+              <w:spacing w:line="240" w:lineRule="auto" w:before="0" w:after="0"/>
+              <w:ind w:left="0" w:firstLine="0"/>
+              <w:jc w:val="center"/>
+            </w:pPr>
+            <w:r>
+              <w:rPr>
+                <w:rFonts w:ascii="Times New Roman" w:hAnsi="Times New Roman"/>
+                <w:b w:val="0"/>
+                <w:sz w:val="24"/>
+              </w:rPr>
+              <w:t>6 flujos por etapa construidos reproduciblemente</w:t>
+            </w:r>
+          </w:p>
+        </w:tc>
+        <w:tc>
+          <w:tcPr>
+            <w:tcW w:type="dxa" w:w="1197"/>
+            <w:vAlign w:val="center"/>
+            <w:tcMar>
+              <w:top w:w="72" w:type="dxa"/>
+              <w:left w:w="72" w:type="dxa"/>
+              <w:bottom w:w="72" w:type="dxa"/>
+              <w:right w:w="72" w:type="dxa"/>
+            </w:tcMar>
+          </w:tcPr>
+          <w:p>
+            <w:pPr>
+              <w:spacing w:line="240" w:lineRule="auto" w:before="0" w:after="0"/>
+              <w:ind w:left="0" w:firstLine="0"/>
+              <w:jc w:val="center"/>
+            </w:pPr>
+            <w:r>
+              <w:rPr>
+                <w:rFonts w:ascii="Times New Roman" w:hAnsi="Times New Roman"/>
+                <w:b w:val="0"/>
+                <w:sz w:val="24"/>
+              </w:rPr>
+              <w:t>Mixta: primaria y secundaria</w:t>
+            </w:r>
+          </w:p>
+        </w:tc>
+        <w:tc>
+          <w:tcPr>
+            <w:tcW w:type="dxa" w:w="1197"/>
+            <w:vAlign w:val="center"/>
+            <w:tcMar>
+              <w:top w:w="72" w:type="dxa"/>
+              <w:left w:w="72" w:type="dxa"/>
+              <w:bottom w:w="72" w:type="dxa"/>
+              <w:right w:w="72" w:type="dxa"/>
+            </w:tcMar>
+          </w:tcPr>
+          <w:p>
+            <w:pPr>
+              <w:spacing w:line="240" w:lineRule="auto" w:before="0" w:after="0"/>
+              <w:ind w:left="0" w:firstLine="0"/>
+              <w:jc w:val="center"/>
+            </w:pPr>
+            <w:r>
+              <w:rPr>
+                <w:rFonts w:ascii="Times New Roman" w:hAnsi="Times New Roman"/>
+                <w:b w:val="0"/>
+                <w:sz w:val="24"/>
+              </w:rPr>
+              <w:t>Procedencia heredada y separable de componentes primarios y secundarios; no constituye una tercera clase de fuente</w:t>
+            </w:r>
+          </w:p>
+        </w:tc>
+        <w:tc>
+          <w:tcPr>
+            <w:tcW w:type="dxa" w:w="1197"/>
+            <w:vAlign w:val="center"/>
+            <w:tcMar>
+              <w:top w:w="72" w:type="dxa"/>
+              <w:left w:w="72" w:type="dxa"/>
+              <w:bottom w:w="72" w:type="dxa"/>
+              <w:right w:w="72" w:type="dxa"/>
+            </w:tcMar>
+          </w:tcPr>
+          <w:p>
+            <w:pPr>
+              <w:spacing w:line="240" w:lineRule="auto" w:before="0" w:after="0"/>
+              <w:ind w:left="0" w:firstLine="0"/>
+              <w:jc w:val="center"/>
+            </w:pPr>
+            <w:r>
+              <w:rPr>
+                <w:rFonts w:ascii="Times New Roman" w:hAnsi="Times New Roman"/>
+                <w:b w:val="0"/>
+                <w:sz w:val="24"/>
+              </w:rPr>
+              <w:t>Calculado o derivado</w:t>
+            </w:r>
+          </w:p>
+        </w:tc>
+        <w:tc>
+          <w:tcPr>
+            <w:tcW w:type="dxa" w:w="1197"/>
+            <w:vAlign w:val="center"/>
+            <w:tcMar>
+              <w:top w:w="72" w:type="dxa"/>
+              <w:left w:w="72" w:type="dxa"/>
+              <w:bottom w:w="72" w:type="dxa"/>
+              <w:right w:w="72" w:type="dxa"/>
+            </w:tcMar>
+          </w:tcPr>
+          <w:p>
+            <w:pPr>
+              <w:spacing w:line="240" w:lineRule="auto" w:before="0" w:after="0"/>
+              <w:ind w:left="0" w:firstLine="0"/>
+              <w:jc w:val="center"/>
+            </w:pPr>
+            <w:r>
+              <w:rPr>
+                <w:rFonts w:ascii="Times New Roman" w:hAnsi="Times New Roman"/>
+                <w:b w:val="0"/>
+                <w:sz w:val="24"/>
+              </w:rPr>
+              <w:t>Caracterización y registros primarios, junto con publicaciones y bases bibliográficas secundarias, conservados en sus familias de origen</w:t>
+            </w:r>
+          </w:p>
+        </w:tc>
+        <w:tc>
+          <w:tcPr>
+            <w:tcW w:type="dxa" w:w="1197"/>
+            <w:vAlign w:val="center"/>
+            <w:tcMar>
+              <w:top w:w="72" w:type="dxa"/>
+              <w:left w:w="72" w:type="dxa"/>
+              <w:bottom w:w="72" w:type="dxa"/>
+              <w:right w:w="72" w:type="dxa"/>
+            </w:tcMar>
+          </w:tcPr>
+          <w:p>
+            <w:pPr>
+              <w:spacing w:line="240" w:lineRule="auto" w:before="0" w:after="0"/>
+              <w:ind w:left="0" w:firstLine="0"/>
+              <w:jc w:val="center"/>
+            </w:pPr>
+            <w:r>
+              <w:rPr>
+                <w:rFonts w:ascii="Times New Roman" w:hAnsi="Times New Roman"/>
+                <w:b w:val="0"/>
+                <w:sz w:val="24"/>
+              </w:rPr>
+              <w:t>Datos de actividad del inventario por etapa; la futura matriz metodológica A1–B2 aportará trazabilidad más fina</w:t>
+            </w:r>
+          </w:p>
+        </w:tc>
+      </w:tr>
+      <w:tr>
+        <w:trPr>
+          <w:cantSplit/>
+        </w:trPr>
+        <w:tc>
+          <w:tcPr>
+            <w:tcW w:type="dxa" w:w="1197"/>
+            <w:vAlign w:val="center"/>
+            <w:tcMar>
+              <w:top w:w="72" w:type="dxa"/>
+              <w:left w:w="72" w:type="dxa"/>
+              <w:bottom w:w="72" w:type="dxa"/>
+              <w:right w:w="72" w:type="dxa"/>
+            </w:tcMar>
+          </w:tcPr>
+          <w:p>
+            <w:pPr>
+              <w:spacing w:line="240" w:lineRule="auto" w:before="0" w:after="0"/>
+              <w:ind w:left="0" w:firstLine="0"/>
+              <w:jc w:val="center"/>
+            </w:pPr>
+            <w:r>
+              <w:rPr>
+                <w:rFonts w:ascii="Times New Roman" w:hAnsi="Times New Roman"/>
+                <w:b w:val="0"/>
+                <w:sz w:val="24"/>
+              </w:rPr>
+              <w:t>N total y TAN propagados entre etapas</w:t>
+            </w:r>
+          </w:p>
+        </w:tc>
+        <w:tc>
+          <w:tcPr>
+            <w:tcW w:type="dxa" w:w="1197"/>
+            <w:vAlign w:val="center"/>
+            <w:tcMar>
+              <w:top w:w="72" w:type="dxa"/>
+              <w:left w:w="72" w:type="dxa"/>
+              <w:bottom w:w="72" w:type="dxa"/>
+              <w:right w:w="72" w:type="dxa"/>
+            </w:tcMar>
+          </w:tcPr>
+          <w:p>
+            <w:pPr>
+              <w:spacing w:line="240" w:lineRule="auto" w:before="0" w:after="0"/>
+              <w:ind w:left="0" w:firstLine="0"/>
+              <w:jc w:val="center"/>
+            </w:pPr>
+            <w:r>
+              <w:rPr>
+                <w:rFonts w:ascii="Times New Roman" w:hAnsi="Times New Roman"/>
+                <w:b w:val="0"/>
+                <w:sz w:val="24"/>
+              </w:rPr>
+              <w:t>A1→A2, A3→A4 y B1→B2</w:t>
+            </w:r>
+          </w:p>
+        </w:tc>
+        <w:tc>
+          <w:tcPr>
+            <w:tcW w:type="dxa" w:w="1197"/>
+            <w:vAlign w:val="center"/>
+            <w:tcMar>
+              <w:top w:w="72" w:type="dxa"/>
+              <w:left w:w="72" w:type="dxa"/>
+              <w:bottom w:w="72" w:type="dxa"/>
+              <w:right w:w="72" w:type="dxa"/>
+            </w:tcMar>
+          </w:tcPr>
+          <w:p>
+            <w:pPr>
+              <w:spacing w:line="240" w:lineRule="auto" w:before="0" w:after="0"/>
+              <w:ind w:left="0" w:firstLine="0"/>
+              <w:jc w:val="center"/>
+            </w:pPr>
+            <w:r>
+              <w:rPr>
+                <w:rFonts w:ascii="Times New Roman" w:hAnsi="Times New Roman"/>
+                <w:b w:val="0"/>
+                <w:sz w:val="24"/>
+              </w:rPr>
+              <w:t>Parámetros experimentales promovidos en 6 etapas y factores metodológicos</w:t>
+            </w:r>
+          </w:p>
+        </w:tc>
+        <w:tc>
+          <w:tcPr>
+            <w:tcW w:type="dxa" w:w="1197"/>
+            <w:vAlign w:val="center"/>
+            <w:tcMar>
+              <w:top w:w="72" w:type="dxa"/>
+              <w:left w:w="72" w:type="dxa"/>
+              <w:bottom w:w="72" w:type="dxa"/>
+              <w:right w:w="72" w:type="dxa"/>
+            </w:tcMar>
+          </w:tcPr>
+          <w:p>
+            <w:pPr>
+              <w:spacing w:line="240" w:lineRule="auto" w:before="0" w:after="0"/>
+              <w:ind w:left="0" w:firstLine="0"/>
+              <w:jc w:val="center"/>
+            </w:pPr>
+            <w:r>
+              <w:rPr>
+                <w:rFonts w:ascii="Times New Roman" w:hAnsi="Times New Roman"/>
+                <w:b w:val="0"/>
+                <w:sz w:val="24"/>
+              </w:rPr>
+              <w:t>Mixta: primaria y secundaria</w:t>
+            </w:r>
+          </w:p>
+        </w:tc>
+        <w:tc>
+          <w:tcPr>
+            <w:tcW w:type="dxa" w:w="1197"/>
+            <w:vAlign w:val="center"/>
+            <w:tcMar>
+              <w:top w:w="72" w:type="dxa"/>
+              <w:left w:w="72" w:type="dxa"/>
+              <w:bottom w:w="72" w:type="dxa"/>
+              <w:right w:w="72" w:type="dxa"/>
+            </w:tcMar>
+          </w:tcPr>
+          <w:p>
+            <w:pPr>
+              <w:spacing w:line="240" w:lineRule="auto" w:before="0" w:after="0"/>
+              <w:ind w:left="0" w:firstLine="0"/>
+              <w:jc w:val="center"/>
+            </w:pPr>
+            <w:r>
+              <w:rPr>
+                <w:rFonts w:ascii="Times New Roman" w:hAnsi="Times New Roman"/>
+                <w:b w:val="0"/>
+                <w:sz w:val="24"/>
+              </w:rPr>
+              <w:t>Procedencia heredada y separable de caracterización primaria y factores metodológicos secundarios; no constituye una tercera clase de fuente</w:t>
+            </w:r>
+          </w:p>
+        </w:tc>
+        <w:tc>
+          <w:tcPr>
+            <w:tcW w:type="dxa" w:w="1197"/>
+            <w:vAlign w:val="center"/>
+            <w:tcMar>
+              <w:top w:w="72" w:type="dxa"/>
+              <w:left w:w="72" w:type="dxa"/>
+              <w:bottom w:w="72" w:type="dxa"/>
+              <w:right w:w="72" w:type="dxa"/>
+            </w:tcMar>
+          </w:tcPr>
+          <w:p>
+            <w:pPr>
+              <w:spacing w:line="240" w:lineRule="auto" w:before="0" w:after="0"/>
+              <w:ind w:left="0" w:firstLine="0"/>
+              <w:jc w:val="center"/>
+            </w:pPr>
+            <w:r>
+              <w:rPr>
+                <w:rFonts w:ascii="Times New Roman" w:hAnsi="Times New Roman"/>
+                <w:b w:val="0"/>
+                <w:sz w:val="24"/>
+              </w:rPr>
+              <w:t>Calculado y propagado entre etapas</w:t>
+            </w:r>
+          </w:p>
+        </w:tc>
+        <w:tc>
+          <w:tcPr>
+            <w:tcW w:type="dxa" w:w="1197"/>
+            <w:vAlign w:val="center"/>
+            <w:tcMar>
+              <w:top w:w="72" w:type="dxa"/>
+              <w:left w:w="72" w:type="dxa"/>
+              <w:bottom w:w="72" w:type="dxa"/>
+              <w:right w:w="72" w:type="dxa"/>
+            </w:tcMar>
+          </w:tcPr>
+          <w:p>
+            <w:pPr>
+              <w:spacing w:line="240" w:lineRule="auto" w:before="0" w:after="0"/>
+              <w:ind w:left="0" w:firstLine="0"/>
+              <w:jc w:val="center"/>
+            </w:pPr>
+            <w:r>
+              <w:rPr>
+                <w:rFonts w:ascii="Times New Roman" w:hAnsi="Times New Roman"/>
+                <w:b w:val="0"/>
+                <w:sz w:val="24"/>
+              </w:rPr>
+              <w:t>Integración experimental M1–M2 (primaria) y factores IPCC, EMEP/EEA o de literatura (secundarios), conservados por componente</w:t>
+            </w:r>
+          </w:p>
+        </w:tc>
+        <w:tc>
+          <w:tcPr>
+            <w:tcW w:type="dxa" w:w="1197"/>
+            <w:vAlign w:val="center"/>
+            <w:tcMar>
+              <w:top w:w="72" w:type="dxa"/>
+              <w:left w:w="72" w:type="dxa"/>
+              <w:bottom w:w="72" w:type="dxa"/>
+              <w:right w:w="72" w:type="dxa"/>
+            </w:tcMar>
+          </w:tcPr>
+          <w:p>
+            <w:pPr>
+              <w:spacing w:line="240" w:lineRule="auto" w:before="0" w:after="0"/>
+              <w:ind w:left="0" w:firstLine="0"/>
+              <w:jc w:val="center"/>
+            </w:pPr>
+            <w:r>
+              <w:rPr>
+                <w:rFonts w:ascii="Times New Roman" w:hAnsi="Times New Roman"/>
+                <w:b w:val="0"/>
+                <w:sz w:val="24"/>
+              </w:rPr>
+              <w:t>Cierre secuencial de nitrógeno y estimación de emisiones; la futura matriz metodológica A1–B2 aportará trazabilidad más fina</w:t>
             </w:r>
           </w:p>
         </w:tc>

</xml_diff>